<commit_message>
docs: add exported diagrams to design documents
</commit_message>
<xml_diff>
--- a/docs/U1/design/task6-db-er-entity-dao.docx
+++ b/docs/U1/design/task6-db-er-entity-dao.docx
@@ -1,2341 +1,2341 @@
 
 <file path=word/document.xml><?xml version="1.0" encoding="utf-8"?>
-<w:document xmlns:wpc="http://schemas.microsoft.com/office/word/2010/wordprocessingCanvas" xmlns:mo="http://schemas.microsoft.com/office/mac/office/2008/main" xmlns:mc="http://schemas.openxmlformats.org/markup-compatibility/2006" xmlns:mv="urn:schemas-microsoft-com:mac:vml" xmlns:o="urn:schemas-microsoft-com:office:office" xmlns:r="http://schemas.openxmlformats.org/officeDocument/2006/relationships" xmlns:m="http://schemas.openxmlformats.org/officeDocument/2006/math" xmlns:v="urn:schemas-microsoft-com:vml" xmlns:wp14="http://schemas.microsoft.com/office/word/2010/wordprocessingDrawing" xmlns:wp="http://schemas.openxmlformats.org/drawingml/2006/wordprocessingDrawing" xmlns:w10="urn:schemas-microsoft-com:office:word" xmlns:w="http://schemas.openxmlformats.org/wordprocessingml/2006/main" xmlns:w14="http://schemas.microsoft.com/office/word/2010/wordml" xmlns:wpg="http://schemas.microsoft.com/office/word/2010/wordprocessingGroup" xmlns:wpi="http://schemas.microsoft.com/office/word/2010/wordprocessingInk" xmlns:wne="http://schemas.microsoft.com/office/word/2006/wordml" xmlns:wps="http://schemas.microsoft.com/office/word/2010/wordprocessingShape" mc:Ignorable="w14 wp14">
-  <w:body>
-    <w:p>
-      <w:pPr>
-        <w:pStyle w:val="Title"/>
-      </w:pPr>
-      <w:r>
-        <w:t>U1 ออกแบบข้อมูลผู้ใช้และการป้องกันบัญชีซ้ำ</w:t>
-      </w:r>
-    </w:p>
-    <w:p>
-      <w:pPr>
-        <w:pStyle w:val="Heading1"/>
-      </w:pPr>
-      <w:r>
-        <w:t>1. เป้าหมาย</w:t>
-      </w:r>
-    </w:p>
-    <w:p>
-      <w:r>
-        <w:t>กำหนดข้อมูล User สำหรับระบุผู้ใช้หลังเข้าสู่ระบบ ป้องกันการสร้างบัญชีซ้ำ และเชื่อมผู้ใช้กับแนวข้อสอบที่เผยแพร่</w:t>
-      </w:r>
-    </w:p>
-    <w:p>
-      <w:r>
-        <w:t>ระบบใช้ username ที่ TU adapter ยืนยันแล้วเป็นตัวระบุบัญชี TU และสร้าง users.id เป็นคีย์ภายในระบบ</w:t>
-      </w:r>
-    </w:p>
-    <w:p>
-      <w:r>
-        <w:t>การเข้าสู่ระบบซ้ำด้วยบัญชี TU เดิมต้องคืน users.id เดิม</w:t>
-      </w:r>
-    </w:p>
-    <w:p>
-      <w:r>
-        <w:t>รายวิชาเป็นข้อมูลหลักสูตร 2566 ที่ทีมเตรียมไว้ผ่าน Seed โดย Course ไม่มีความสัมพันธ์กับ User ในฐานะผู้เพิ่มรายวิชา</w:t>
-      </w:r>
-    </w:p>
-    <w:p>
-      <w:pPr>
-        <w:pStyle w:val="Heading1"/>
-      </w:pPr>
-      <w:r>
-        <w:t>2. ตาราง User</w:t>
-      </w:r>
-    </w:p>
-    <w:p>
-      <w:r>
-        <w:t>ชื่อตารางคือ users</w:t>
-      </w:r>
-    </w:p>
-    <w:tbl>
-      <w:tblPr>
-        <w:tblW w:type="auto" w:w="0"/>
-        <w:tblLayout w:type="autofit"/>
-        <w:tblLook w:firstColumn="1" w:firstRow="1" w:lastColumn="0" w:lastRow="0" w:noHBand="0" w:noVBand="1" w:val="04A0"/>
-      </w:tblPr>
-      <w:tblGrid>
-        <w:gridCol w:w="2509"/>
-        <w:gridCol w:w="2509"/>
-        <w:gridCol w:w="2509"/>
-        <w:gridCol w:w="2509"/>
-      </w:tblGrid>
-      <w:tr>
-        <w:trPr>
-          <w:cantSplit/>
-          <w:tblHeader/>
-        </w:trPr>
-        <w:tc>
-          <w:tcPr>
-            <w:tcW w:type="dxa" w:w="2509"/>
-            <w:tcBorders>
-              <w:top w:val="single" w:sz="4" w:color="D9D9D9"/>
-              <w:left w:val="single" w:sz="4" w:color="D9D9D9"/>
-              <w:bottom w:val="single" w:sz="4" w:color="D9D9D9"/>
-              <w:right w:val="single" w:sz="4" w:color="D9D9D9"/>
-            </w:tcBorders>
-            <w:tcMar>
-              <w:top w:w="85" w:type="dxa"/>
-              <w:left w:w="85" w:type="dxa"/>
-              <w:bottom w:w="85" w:type="dxa"/>
-              <w:right w:w="85" w:type="dxa"/>
-            </w:tcMar>
-            <w:shd w:fill="E8EEF4"/>
-          </w:tcPr>
-          <w:p>
-            <w:pPr>
-              <w:spacing w:after="60"/>
-            </w:pPr>
-            <w:r>
-              <w:rPr>
-                <w:b/>
-                <w:sz w:val="18"/>
-              </w:rPr>
-              <w:t>ฟิลด์</w:t>
-            </w:r>
-          </w:p>
-        </w:tc>
-        <w:tc>
-          <w:tcPr>
-            <w:tcW w:type="dxa" w:w="2509"/>
-            <w:tcBorders>
-              <w:top w:val="single" w:sz="4" w:color="D9D9D9"/>
-              <w:left w:val="single" w:sz="4" w:color="D9D9D9"/>
-              <w:bottom w:val="single" w:sz="4" w:color="D9D9D9"/>
-              <w:right w:val="single" w:sz="4" w:color="D9D9D9"/>
-            </w:tcBorders>
-            <w:tcMar>
-              <w:top w:w="85" w:type="dxa"/>
-              <w:left w:w="85" w:type="dxa"/>
-              <w:bottom w:w="85" w:type="dxa"/>
-              <w:right w:w="85" w:type="dxa"/>
-            </w:tcMar>
-            <w:shd w:fill="E8EEF4"/>
-          </w:tcPr>
-          <w:p>
-            <w:pPr>
-              <w:spacing w:after="60"/>
-            </w:pPr>
-            <w:r>
-              <w:rPr>
-                <w:b/>
-                <w:sz w:val="18"/>
-              </w:rPr>
-              <w:t>ชนิดข้อมูล SQL Server</w:t>
-            </w:r>
-          </w:p>
-        </w:tc>
-        <w:tc>
-          <w:tcPr>
-            <w:tcW w:type="dxa" w:w="2509"/>
-            <w:tcBorders>
-              <w:top w:val="single" w:sz="4" w:color="D9D9D9"/>
-              <w:left w:val="single" w:sz="4" w:color="D9D9D9"/>
-              <w:bottom w:val="single" w:sz="4" w:color="D9D9D9"/>
-              <w:right w:val="single" w:sz="4" w:color="D9D9D9"/>
-            </w:tcBorders>
-            <w:tcMar>
-              <w:top w:w="85" w:type="dxa"/>
-              <w:left w:w="85" w:type="dxa"/>
-              <w:bottom w:w="85" w:type="dxa"/>
-              <w:right w:w="85" w:type="dxa"/>
-            </w:tcMar>
-            <w:shd w:fill="E8EEF4"/>
-          </w:tcPr>
-          <w:p>
-            <w:pPr>
-              <w:spacing w:after="60"/>
-            </w:pPr>
-            <w:r>
-              <w:rPr>
-                <w:b/>
-                <w:sz w:val="18"/>
-              </w:rPr>
-              <w:t>เว้นว่างได้</w:t>
-            </w:r>
-          </w:p>
-        </w:tc>
-        <w:tc>
-          <w:tcPr>
-            <w:tcW w:type="dxa" w:w="2509"/>
-            <w:tcBorders>
-              <w:top w:val="single" w:sz="4" w:color="D9D9D9"/>
-              <w:left w:val="single" w:sz="4" w:color="D9D9D9"/>
-              <w:bottom w:val="single" w:sz="4" w:color="D9D9D9"/>
-              <w:right w:val="single" w:sz="4" w:color="D9D9D9"/>
-            </w:tcBorders>
-            <w:tcMar>
-              <w:top w:w="85" w:type="dxa"/>
-              <w:left w:w="85" w:type="dxa"/>
-              <w:bottom w:w="85" w:type="dxa"/>
-              <w:right w:w="85" w:type="dxa"/>
-            </w:tcMar>
-            <w:shd w:fill="E8EEF4"/>
-          </w:tcPr>
-          <w:p>
-            <w:pPr>
-              <w:spacing w:after="60"/>
-            </w:pPr>
-            <w:r>
-              <w:rPr>
-                <w:b/>
-                <w:sz w:val="18"/>
-              </w:rPr>
-              <w:t>รายละเอียดและเงื่อนไข</w:t>
-            </w:r>
-          </w:p>
-        </w:tc>
-      </w:tr>
-      <w:tr>
-        <w:trPr>
-          <w:cantSplit/>
-        </w:trPr>
-        <w:tc>
-          <w:tcPr>
-            <w:tcW w:type="dxa" w:w="2509"/>
-            <w:tcBorders>
-              <w:top w:val="single" w:sz="4" w:color="D9D9D9"/>
-              <w:left w:val="single" w:sz="4" w:color="D9D9D9"/>
-              <w:bottom w:val="single" w:sz="4" w:color="D9D9D9"/>
-              <w:right w:val="single" w:sz="4" w:color="D9D9D9"/>
-            </w:tcBorders>
-            <w:tcMar>
-              <w:top w:w="85" w:type="dxa"/>
-              <w:left w:w="85" w:type="dxa"/>
-              <w:bottom w:w="85" w:type="dxa"/>
-              <w:right w:w="85" w:type="dxa"/>
-            </w:tcMar>
-          </w:tcPr>
-          <w:p>
-            <w:pPr>
-              <w:spacing w:after="60"/>
-            </w:pPr>
-            <w:r>
-              <w:rPr>
-                <w:b w:val="0"/>
-                <w:sz w:val="18"/>
-              </w:rPr>
-              <w:t>id</w:t>
-            </w:r>
-          </w:p>
-        </w:tc>
-        <w:tc>
-          <w:tcPr>
-            <w:tcW w:type="dxa" w:w="2509"/>
-            <w:tcBorders>
-              <w:top w:val="single" w:sz="4" w:color="D9D9D9"/>
-              <w:left w:val="single" w:sz="4" w:color="D9D9D9"/>
-              <w:bottom w:val="single" w:sz="4" w:color="D9D9D9"/>
-              <w:right w:val="single" w:sz="4" w:color="D9D9D9"/>
-            </w:tcBorders>
-            <w:tcMar>
-              <w:top w:w="85" w:type="dxa"/>
-              <w:left w:w="85" w:type="dxa"/>
-              <w:bottom w:w="85" w:type="dxa"/>
-              <w:right w:w="85" w:type="dxa"/>
-            </w:tcMar>
-          </w:tcPr>
-          <w:p>
-            <w:pPr>
-              <w:spacing w:after="60"/>
-            </w:pPr>
-            <w:r>
-              <w:rPr>
-                <w:b w:val="0"/>
-                <w:sz w:val="18"/>
-              </w:rPr>
-              <w:t>INT IDENTITY</w:t>
-            </w:r>
-          </w:p>
-        </w:tc>
-        <w:tc>
-          <w:tcPr>
-            <w:tcW w:type="dxa" w:w="2509"/>
-            <w:tcBorders>
-              <w:top w:val="single" w:sz="4" w:color="D9D9D9"/>
-              <w:left w:val="single" w:sz="4" w:color="D9D9D9"/>
-              <w:bottom w:val="single" w:sz="4" w:color="D9D9D9"/>
-              <w:right w:val="single" w:sz="4" w:color="D9D9D9"/>
-            </w:tcBorders>
-            <w:tcMar>
-              <w:top w:w="85" w:type="dxa"/>
-              <w:left w:w="85" w:type="dxa"/>
-              <w:bottom w:w="85" w:type="dxa"/>
-              <w:right w:w="85" w:type="dxa"/>
-            </w:tcMar>
-          </w:tcPr>
-          <w:p>
-            <w:pPr>
-              <w:spacing w:after="60"/>
-            </w:pPr>
-            <w:r>
-              <w:rPr>
-                <w:b w:val="0"/>
-                <w:sz w:val="18"/>
-              </w:rPr>
-              <w:t>ไม่ได้</w:t>
-            </w:r>
-          </w:p>
-        </w:tc>
-        <w:tc>
-          <w:tcPr>
-            <w:tcW w:type="dxa" w:w="2509"/>
-            <w:tcBorders>
-              <w:top w:val="single" w:sz="4" w:color="D9D9D9"/>
-              <w:left w:val="single" w:sz="4" w:color="D9D9D9"/>
-              <w:bottom w:val="single" w:sz="4" w:color="D9D9D9"/>
-              <w:right w:val="single" w:sz="4" w:color="D9D9D9"/>
-            </w:tcBorders>
-            <w:tcMar>
-              <w:top w:w="85" w:type="dxa"/>
-              <w:left w:w="85" w:type="dxa"/>
-              <w:bottom w:w="85" w:type="dxa"/>
-              <w:right w:w="85" w:type="dxa"/>
-            </w:tcMar>
-          </w:tcPr>
-          <w:p>
-            <w:pPr>
-              <w:spacing w:after="60"/>
-            </w:pPr>
-            <w:r>
-              <w:rPr>
-                <w:b w:val="0"/>
-                <w:sz w:val="18"/>
-              </w:rPr>
-              <w:t>Primary Key เพิ่มอัตโนมัติ</w:t>
-            </w:r>
-          </w:p>
-        </w:tc>
-      </w:tr>
-      <w:tr>
-        <w:trPr>
-          <w:cantSplit/>
-        </w:trPr>
-        <w:tc>
-          <w:tcPr>
-            <w:tcW w:type="dxa" w:w="2509"/>
-            <w:tcBorders>
-              <w:top w:val="single" w:sz="4" w:color="D9D9D9"/>
-              <w:left w:val="single" w:sz="4" w:color="D9D9D9"/>
-              <w:bottom w:val="single" w:sz="4" w:color="D9D9D9"/>
-              <w:right w:val="single" w:sz="4" w:color="D9D9D9"/>
-            </w:tcBorders>
-            <w:tcMar>
-              <w:top w:w="85" w:type="dxa"/>
-              <w:left w:w="85" w:type="dxa"/>
-              <w:bottom w:w="85" w:type="dxa"/>
-              <w:right w:w="85" w:type="dxa"/>
-            </w:tcMar>
-          </w:tcPr>
-          <w:p>
-            <w:pPr>
-              <w:spacing w:after="60"/>
-            </w:pPr>
-            <w:r>
-              <w:rPr>
-                <w:b w:val="0"/>
-                <w:sz w:val="18"/>
-              </w:rPr>
-              <w:t>username</w:t>
-            </w:r>
-          </w:p>
-        </w:tc>
-        <w:tc>
-          <w:tcPr>
-            <w:tcW w:type="dxa" w:w="2509"/>
-            <w:tcBorders>
-              <w:top w:val="single" w:sz="4" w:color="D9D9D9"/>
-              <w:left w:val="single" w:sz="4" w:color="D9D9D9"/>
-              <w:bottom w:val="single" w:sz="4" w:color="D9D9D9"/>
-              <w:right w:val="single" w:sz="4" w:color="D9D9D9"/>
-            </w:tcBorders>
-            <w:tcMar>
-              <w:top w:w="85" w:type="dxa"/>
-              <w:left w:w="85" w:type="dxa"/>
-              <w:bottom w:w="85" w:type="dxa"/>
-              <w:right w:w="85" w:type="dxa"/>
-            </w:tcMar>
-          </w:tcPr>
-          <w:p>
-            <w:pPr>
-              <w:spacing w:after="60"/>
-            </w:pPr>
-            <w:r>
-              <w:rPr>
-                <w:b w:val="0"/>
-                <w:sz w:val="18"/>
-              </w:rPr>
-              <w:t>VARCHAR(50)</w:t>
-            </w:r>
-          </w:p>
-        </w:tc>
-        <w:tc>
-          <w:tcPr>
-            <w:tcW w:type="dxa" w:w="2509"/>
-            <w:tcBorders>
-              <w:top w:val="single" w:sz="4" w:color="D9D9D9"/>
-              <w:left w:val="single" w:sz="4" w:color="D9D9D9"/>
-              <w:bottom w:val="single" w:sz="4" w:color="D9D9D9"/>
-              <w:right w:val="single" w:sz="4" w:color="D9D9D9"/>
-            </w:tcBorders>
-            <w:tcMar>
-              <w:top w:w="85" w:type="dxa"/>
-              <w:left w:w="85" w:type="dxa"/>
-              <w:bottom w:w="85" w:type="dxa"/>
-              <w:right w:w="85" w:type="dxa"/>
-            </w:tcMar>
-          </w:tcPr>
-          <w:p>
-            <w:pPr>
-              <w:spacing w:after="60"/>
-            </w:pPr>
-            <w:r>
-              <w:rPr>
-                <w:b w:val="0"/>
-                <w:sz w:val="18"/>
-              </w:rPr>
-              <w:t>ไม่ได้</w:t>
-            </w:r>
-          </w:p>
-        </w:tc>
-        <w:tc>
-          <w:tcPr>
-            <w:tcW w:type="dxa" w:w="2509"/>
-            <w:tcBorders>
-              <w:top w:val="single" w:sz="4" w:color="D9D9D9"/>
-              <w:left w:val="single" w:sz="4" w:color="D9D9D9"/>
-              <w:bottom w:val="single" w:sz="4" w:color="D9D9D9"/>
-              <w:right w:val="single" w:sz="4" w:color="D9D9D9"/>
-            </w:tcBorders>
-            <w:tcMar>
-              <w:top w:w="85" w:type="dxa"/>
-              <w:left w:w="85" w:type="dxa"/>
-              <w:bottom w:w="85" w:type="dxa"/>
-              <w:right w:w="85" w:type="dxa"/>
-            </w:tcMar>
-          </w:tcPr>
-          <w:p>
-            <w:pPr>
-              <w:spacing w:after="60"/>
-            </w:pPr>
-            <w:r>
-              <w:rPr>
-                <w:b w:val="0"/>
-                <w:sz w:val="18"/>
-              </w:rPr>
-              <w:t>บัญชี TU ที่ผ่านการยืนยัน ต้องไม่ว่างและไม่ซ้ำ</w:t>
-            </w:r>
-          </w:p>
-        </w:tc>
-      </w:tr>
-      <w:tr>
-        <w:trPr>
-          <w:cantSplit/>
-        </w:trPr>
-        <w:tc>
-          <w:tcPr>
-            <w:tcW w:type="dxa" w:w="2509"/>
-            <w:tcBorders>
-              <w:top w:val="single" w:sz="4" w:color="D9D9D9"/>
-              <w:left w:val="single" w:sz="4" w:color="D9D9D9"/>
-              <w:bottom w:val="single" w:sz="4" w:color="D9D9D9"/>
-              <w:right w:val="single" w:sz="4" w:color="D9D9D9"/>
-            </w:tcBorders>
-            <w:tcMar>
-              <w:top w:w="85" w:type="dxa"/>
-              <w:left w:w="85" w:type="dxa"/>
-              <w:bottom w:w="85" w:type="dxa"/>
-              <w:right w:w="85" w:type="dxa"/>
-            </w:tcMar>
-          </w:tcPr>
-          <w:p>
-            <w:pPr>
-              <w:spacing w:after="60"/>
-            </w:pPr>
-            <w:r>
-              <w:rPr>
-                <w:b w:val="0"/>
-                <w:sz w:val="18"/>
-              </w:rPr>
-              <w:t>displayname_th</w:t>
-            </w:r>
-          </w:p>
-        </w:tc>
-        <w:tc>
-          <w:tcPr>
-            <w:tcW w:type="dxa" w:w="2509"/>
-            <w:tcBorders>
-              <w:top w:val="single" w:sz="4" w:color="D9D9D9"/>
-              <w:left w:val="single" w:sz="4" w:color="D9D9D9"/>
-              <w:bottom w:val="single" w:sz="4" w:color="D9D9D9"/>
-              <w:right w:val="single" w:sz="4" w:color="D9D9D9"/>
-            </w:tcBorders>
-            <w:tcMar>
-              <w:top w:w="85" w:type="dxa"/>
-              <w:left w:w="85" w:type="dxa"/>
-              <w:bottom w:w="85" w:type="dxa"/>
-              <w:right w:w="85" w:type="dxa"/>
-            </w:tcMar>
-          </w:tcPr>
-          <w:p>
-            <w:pPr>
-              <w:spacing w:after="60"/>
-            </w:pPr>
-            <w:r>
-              <w:rPr>
-                <w:b w:val="0"/>
-                <w:sz w:val="18"/>
-              </w:rPr>
-              <w:t>NVARCHAR(255)</w:t>
-            </w:r>
-          </w:p>
-        </w:tc>
-        <w:tc>
-          <w:tcPr>
-            <w:tcW w:type="dxa" w:w="2509"/>
-            <w:tcBorders>
-              <w:top w:val="single" w:sz="4" w:color="D9D9D9"/>
-              <w:left w:val="single" w:sz="4" w:color="D9D9D9"/>
-              <w:bottom w:val="single" w:sz="4" w:color="D9D9D9"/>
-              <w:right w:val="single" w:sz="4" w:color="D9D9D9"/>
-            </w:tcBorders>
-            <w:tcMar>
-              <w:top w:w="85" w:type="dxa"/>
-              <w:left w:w="85" w:type="dxa"/>
-              <w:bottom w:w="85" w:type="dxa"/>
-              <w:right w:w="85" w:type="dxa"/>
-            </w:tcMar>
-          </w:tcPr>
-          <w:p>
-            <w:pPr>
-              <w:spacing w:after="60"/>
-            </w:pPr>
-            <w:r>
-              <w:rPr>
-                <w:b w:val="0"/>
-                <w:sz w:val="18"/>
-              </w:rPr>
-              <w:t>ได้</w:t>
-            </w:r>
-          </w:p>
-        </w:tc>
-        <w:tc>
-          <w:tcPr>
-            <w:tcW w:type="dxa" w:w="2509"/>
-            <w:tcBorders>
-              <w:top w:val="single" w:sz="4" w:color="D9D9D9"/>
-              <w:left w:val="single" w:sz="4" w:color="D9D9D9"/>
-              <w:bottom w:val="single" w:sz="4" w:color="D9D9D9"/>
-              <w:right w:val="single" w:sz="4" w:color="D9D9D9"/>
-            </w:tcBorders>
-            <w:tcMar>
-              <w:top w:w="85" w:type="dxa"/>
-              <w:left w:w="85" w:type="dxa"/>
-              <w:bottom w:w="85" w:type="dxa"/>
-              <w:right w:w="85" w:type="dxa"/>
-            </w:tcMar>
-          </w:tcPr>
-          <w:p>
-            <w:pPr>
-              <w:spacing w:after="60"/>
-            </w:pPr>
-            <w:r>
-              <w:rPr>
-                <w:b w:val="0"/>
-                <w:sz w:val="18"/>
-              </w:rPr>
-              <w:t>ชื่อภาษาไทยที่ UserDAO รับได้ (Login ปัจจุบันไม่ได้ส่งแยก)</w:t>
-            </w:r>
-          </w:p>
-        </w:tc>
-      </w:tr>
-      <w:tr>
-        <w:trPr>
-          <w:cantSplit/>
-        </w:trPr>
-        <w:tc>
-          <w:tcPr>
-            <w:tcW w:type="dxa" w:w="2509"/>
-            <w:tcBorders>
-              <w:top w:val="single" w:sz="4" w:color="D9D9D9"/>
-              <w:left w:val="single" w:sz="4" w:color="D9D9D9"/>
-              <w:bottom w:val="single" w:sz="4" w:color="D9D9D9"/>
-              <w:right w:val="single" w:sz="4" w:color="D9D9D9"/>
-            </w:tcBorders>
-            <w:tcMar>
-              <w:top w:w="85" w:type="dxa"/>
-              <w:left w:w="85" w:type="dxa"/>
-              <w:bottom w:w="85" w:type="dxa"/>
-              <w:right w:w="85" w:type="dxa"/>
-            </w:tcMar>
-          </w:tcPr>
-          <w:p>
-            <w:pPr>
-              <w:spacing w:after="60"/>
-            </w:pPr>
-            <w:r>
-              <w:rPr>
-                <w:b w:val="0"/>
-                <w:sz w:val="18"/>
-              </w:rPr>
-              <w:t>displayname_en</w:t>
-            </w:r>
-          </w:p>
-        </w:tc>
-        <w:tc>
-          <w:tcPr>
-            <w:tcW w:type="dxa" w:w="2509"/>
-            <w:tcBorders>
-              <w:top w:val="single" w:sz="4" w:color="D9D9D9"/>
-              <w:left w:val="single" w:sz="4" w:color="D9D9D9"/>
-              <w:bottom w:val="single" w:sz="4" w:color="D9D9D9"/>
-              <w:right w:val="single" w:sz="4" w:color="D9D9D9"/>
-            </w:tcBorders>
-            <w:tcMar>
-              <w:top w:w="85" w:type="dxa"/>
-              <w:left w:w="85" w:type="dxa"/>
-              <w:bottom w:w="85" w:type="dxa"/>
-              <w:right w:w="85" w:type="dxa"/>
-            </w:tcMar>
-          </w:tcPr>
-          <w:p>
-            <w:pPr>
-              <w:spacing w:after="60"/>
-            </w:pPr>
-            <w:r>
-              <w:rPr>
-                <w:b w:val="0"/>
-                <w:sz w:val="18"/>
-              </w:rPr>
-              <w:t>NVARCHAR(255)</w:t>
-            </w:r>
-          </w:p>
-        </w:tc>
-        <w:tc>
-          <w:tcPr>
-            <w:tcW w:type="dxa" w:w="2509"/>
-            <w:tcBorders>
-              <w:top w:val="single" w:sz="4" w:color="D9D9D9"/>
-              <w:left w:val="single" w:sz="4" w:color="D9D9D9"/>
-              <w:bottom w:val="single" w:sz="4" w:color="D9D9D9"/>
-              <w:right w:val="single" w:sz="4" w:color="D9D9D9"/>
-            </w:tcBorders>
-            <w:tcMar>
-              <w:top w:w="85" w:type="dxa"/>
-              <w:left w:w="85" w:type="dxa"/>
-              <w:bottom w:w="85" w:type="dxa"/>
-              <w:right w:w="85" w:type="dxa"/>
-            </w:tcMar>
-          </w:tcPr>
-          <w:p>
-            <w:pPr>
-              <w:spacing w:after="60"/>
-            </w:pPr>
-            <w:r>
-              <w:rPr>
-                <w:b w:val="0"/>
-                <w:sz w:val="18"/>
-              </w:rPr>
-              <w:t>ได้</w:t>
-            </w:r>
-          </w:p>
-        </w:tc>
-        <w:tc>
-          <w:tcPr>
-            <w:tcW w:type="dxa" w:w="2509"/>
-            <w:tcBorders>
-              <w:top w:val="single" w:sz="4" w:color="D9D9D9"/>
-              <w:left w:val="single" w:sz="4" w:color="D9D9D9"/>
-              <w:bottom w:val="single" w:sz="4" w:color="D9D9D9"/>
-              <w:right w:val="single" w:sz="4" w:color="D9D9D9"/>
-            </w:tcBorders>
-            <w:tcMar>
-              <w:top w:w="85" w:type="dxa"/>
-              <w:left w:w="85" w:type="dxa"/>
-              <w:bottom w:w="85" w:type="dxa"/>
-              <w:right w:w="85" w:type="dxa"/>
-            </w:tcMar>
-          </w:tcPr>
-          <w:p>
-            <w:pPr>
-              <w:spacing w:after="60"/>
-            </w:pPr>
-            <w:r>
-              <w:rPr>
-                <w:b w:val="0"/>
-                <w:sz w:val="18"/>
-              </w:rPr>
-              <w:t>ชื่อที่ Login ส่งจาก TUAccount.display_name หรือชื่ออังกฤษที่ DAO รับโดยตรง</w:t>
-            </w:r>
-          </w:p>
-        </w:tc>
-      </w:tr>
-    </w:tbl>
-    <w:p/>
-    <w:p>
-      <w:r>
-        <w:t>ความยาว 50 และ 255 เป็นค่าที่ใช้ใน Entity ปัจจุบัน ไม่ใช่ขีดจำกัดที่เอกสาร TU API ระบุ</w:t>
-      </w:r>
-    </w:p>
-    <w:p>
-      <w:r>
-        <w:t>ความหมายของคีย์:</w:t>
-      </w:r>
-    </w:p>
-    <w:p>
-      <w:r>
-        <w:t>- PK หรือ Primary Key ใช้ระบุแต่ละแถว โดย users.id ห้ามซ้ำและห้ามว่าง</w:t>
-      </w:r>
-    </w:p>
-    <w:p>
-      <w:r>
-        <w:t>- UK หรือ Unique Key กำหนดให้ users.username ห้ามซ้ำ เพื่อป้องกันบัญชี TU เดียวกันมี User หลายแถว</w:t>
-      </w:r>
-    </w:p>
-    <w:p>
-      <w:r>
-        <w:t>- FK หรือ Foreign Key ใช้เชื่อมข้อมูล เช่น guides.publisher_id อ้างถึง users.id</w:t>
-      </w:r>
-    </w:p>
-    <w:p>
-      <w:r>
-        <w:t>username เก็บเป็นข้อความเพื่อรักษารหัสบัญชีตามที่ API ส่งมา รวมถึงเลขศูนย์นำหน้า โดยตัดช่องว่างหัวท้ายก่อนค้นหาหรือบันทึก</w:t>
-      </w:r>
-    </w:p>
-    <w:p>
-      <w:r>
-        <w:t>ฟิลด์ชื่อที่ไม่มีค่า หรือมีเฉพาะช่องว่าง เก็บเป็น NULL</w:t>
-      </w:r>
-    </w:p>
-    <w:p>
-      <w:r>
-        <w:t>ตาราง User ไม่มีคอลัมน์รหัสผ่าน TU หรือ Application-Key</w:t>
-      </w:r>
-    </w:p>
-    <w:p>
-      <w:pPr>
-        <w:pStyle w:val="Heading1"/>
-      </w:pPr>
-      <w:r>
-        <w:t>3. การใช้ข้อมูลจาก TU API</w:t>
-      </w:r>
-    </w:p>
-    <w:p>
-      <w:r>
-        <w:t>ข้อมูล User มาจากผลตอบกลับ TU API ที่ขั้นตอน Login ตรวจสอบแล้ว</w:t>
-      </w:r>
-    </w:p>
-    <w:tbl>
-      <w:tblPr>
-        <w:tblW w:type="auto" w:w="0"/>
-        <w:tblLayout w:type="autofit"/>
-        <w:tblLook w:firstColumn="1" w:firstRow="1" w:lastColumn="0" w:lastRow="0" w:noHBand="0" w:noVBand="1" w:val="04A0"/>
-      </w:tblPr>
-      <w:tblGrid>
-        <w:gridCol w:w="5018"/>
-        <w:gridCol w:w="5018"/>
-      </w:tblGrid>
-      <w:tr>
-        <w:trPr>
-          <w:cantSplit/>
-          <w:tblHeader/>
-        </w:trPr>
-        <w:tc>
-          <w:tcPr>
-            <w:tcW w:type="dxa" w:w="5018"/>
-            <w:tcBorders>
-              <w:top w:val="single" w:sz="4" w:color="D9D9D9"/>
-              <w:left w:val="single" w:sz="4" w:color="D9D9D9"/>
-              <w:bottom w:val="single" w:sz="4" w:color="D9D9D9"/>
-              <w:right w:val="single" w:sz="4" w:color="D9D9D9"/>
-            </w:tcBorders>
-            <w:tcMar>
-              <w:top w:w="85" w:type="dxa"/>
-              <w:left w:w="85" w:type="dxa"/>
-              <w:bottom w:w="85" w:type="dxa"/>
-              <w:right w:w="85" w:type="dxa"/>
-            </w:tcMar>
-            <w:shd w:fill="E8EEF4"/>
-          </w:tcPr>
-          <w:p>
-            <w:pPr>
-              <w:spacing w:after="60"/>
-            </w:pPr>
-            <w:r>
-              <w:rPr>
-                <w:b/>
-                <w:sz w:val="18"/>
-              </w:rPr>
-              <w:t>ข้อมูลที่ adapter ใช้</w:t>
-            </w:r>
-          </w:p>
-        </w:tc>
-        <w:tc>
-          <w:tcPr>
-            <w:tcW w:type="dxa" w:w="5018"/>
-            <w:tcBorders>
-              <w:top w:val="single" w:sz="4" w:color="D9D9D9"/>
-              <w:left w:val="single" w:sz="4" w:color="D9D9D9"/>
-              <w:bottom w:val="single" w:sz="4" w:color="D9D9D9"/>
-              <w:right w:val="single" w:sz="4" w:color="D9D9D9"/>
-            </w:tcBorders>
-            <w:tcMar>
-              <w:top w:w="85" w:type="dxa"/>
-              <w:left w:w="85" w:type="dxa"/>
-              <w:bottom w:w="85" w:type="dxa"/>
-              <w:right w:w="85" w:type="dxa"/>
-            </w:tcMar>
-            <w:shd w:fill="E8EEF4"/>
-          </w:tcPr>
-          <w:p>
-            <w:pPr>
-              <w:spacing w:after="60"/>
-            </w:pPr>
-            <w:r>
-              <w:rPr>
-                <w:b/>
-                <w:sz w:val="18"/>
-              </w:rPr>
-              <w:t>การใช้ในระบบ</w:t>
-            </w:r>
-          </w:p>
-        </w:tc>
-      </w:tr>
-      <w:tr>
-        <w:trPr>
-          <w:cantSplit/>
-        </w:trPr>
-        <w:tc>
-          <w:tcPr>
-            <w:tcW w:type="dxa" w:w="5018"/>
-            <w:tcBorders>
-              <w:top w:val="single" w:sz="4" w:color="D9D9D9"/>
-              <w:left w:val="single" w:sz="4" w:color="D9D9D9"/>
-              <w:bottom w:val="single" w:sz="4" w:color="D9D9D9"/>
-              <w:right w:val="single" w:sz="4" w:color="D9D9D9"/>
-            </w:tcBorders>
-            <w:tcMar>
-              <w:top w:w="85" w:type="dxa"/>
-              <w:left w:w="85" w:type="dxa"/>
-              <w:bottom w:w="85" w:type="dxa"/>
-              <w:right w:w="85" w:type="dxa"/>
-            </w:tcMar>
-          </w:tcPr>
-          <w:p>
-            <w:pPr>
-              <w:spacing w:after="60"/>
-            </w:pPr>
-            <w:r>
-              <w:rPr>
-                <w:b w:val="0"/>
-                <w:sz w:val="18"/>
-              </w:rPr>
-              <w:t>username ที่ผู้ใช้ส่ง</w:t>
-            </w:r>
-          </w:p>
-        </w:tc>
-        <w:tc>
-          <w:tcPr>
-            <w:tcW w:type="dxa" w:w="5018"/>
-            <w:tcBorders>
-              <w:top w:val="single" w:sz="4" w:color="D9D9D9"/>
-              <w:left w:val="single" w:sz="4" w:color="D9D9D9"/>
-              <w:bottom w:val="single" w:sz="4" w:color="D9D9D9"/>
-              <w:right w:val="single" w:sz="4" w:color="D9D9D9"/>
-            </w:tcBorders>
-            <w:tcMar>
-              <w:top w:w="85" w:type="dxa"/>
-              <w:left w:w="85" w:type="dxa"/>
-              <w:bottom w:w="85" w:type="dxa"/>
-              <w:right w:w="85" w:type="dxa"/>
-            </w:tcMar>
-          </w:tcPr>
-          <w:p>
-            <w:pPr>
-              <w:spacing w:after="60"/>
-            </w:pPr>
-            <w:r>
-              <w:rPr>
-                <w:b w:val="0"/>
-                <w:sz w:val="18"/>
-              </w:rPr>
-              <w:t>ตัดช่องว่างหัวท้าย แล้วใช้เป็น TUAccount.username หลังยืนยันสำเร็จ ไม่ได้อ่าน username จาก response</w:t>
-            </w:r>
-          </w:p>
-        </w:tc>
-      </w:tr>
-      <w:tr>
-        <w:trPr>
-          <w:cantSplit/>
-        </w:trPr>
-        <w:tc>
-          <w:tcPr>
-            <w:tcW w:type="dxa" w:w="5018"/>
-            <w:tcBorders>
-              <w:top w:val="single" w:sz="4" w:color="D9D9D9"/>
-              <w:left w:val="single" w:sz="4" w:color="D9D9D9"/>
-              <w:bottom w:val="single" w:sz="4" w:color="D9D9D9"/>
-              <w:right w:val="single" w:sz="4" w:color="D9D9D9"/>
-            </w:tcBorders>
-            <w:tcMar>
-              <w:top w:w="85" w:type="dxa"/>
-              <w:left w:w="85" w:type="dxa"/>
-              <w:bottom w:w="85" w:type="dxa"/>
-              <w:right w:w="85" w:type="dxa"/>
-            </w:tcMar>
-          </w:tcPr>
-          <w:p>
-            <w:pPr>
-              <w:spacing w:after="60"/>
-            </w:pPr>
-            <w:r>
-              <w:rPr>
-                <w:b w:val="0"/>
-                <w:sz w:val="18"/>
-              </w:rPr>
-              <w:t>status, type</w:t>
-            </w:r>
-          </w:p>
-        </w:tc>
-        <w:tc>
-          <w:tcPr>
-            <w:tcW w:type="dxa" w:w="5018"/>
-            <w:tcBorders>
-              <w:top w:val="single" w:sz="4" w:color="D9D9D9"/>
-              <w:left w:val="single" w:sz="4" w:color="D9D9D9"/>
-              <w:bottom w:val="single" w:sz="4" w:color="D9D9D9"/>
-              <w:right w:val="single" w:sz="4" w:color="D9D9D9"/>
-            </w:tcBorders>
-            <w:tcMar>
-              <w:top w:w="85" w:type="dxa"/>
-              <w:left w:w="85" w:type="dxa"/>
-              <w:bottom w:w="85" w:type="dxa"/>
-              <w:right w:w="85" w:type="dxa"/>
-            </w:tcMar>
-          </w:tcPr>
-          <w:p>
-            <w:pPr>
-              <w:spacing w:after="60"/>
-            </w:pPr>
-            <w:r>
-              <w:rPr>
-                <w:b w:val="0"/>
-                <w:sz w:val="18"/>
-              </w:rPr>
-              <w:t>ยอมรับเฉพาะ status เป็น true และ type เป็น student</w:t>
-            </w:r>
-          </w:p>
-        </w:tc>
-      </w:tr>
-      <w:tr>
-        <w:trPr>
-          <w:cantSplit/>
-        </w:trPr>
-        <w:tc>
-          <w:tcPr>
-            <w:tcW w:type="dxa" w:w="5018"/>
-            <w:tcBorders>
-              <w:top w:val="single" w:sz="4" w:color="D9D9D9"/>
-              <w:left w:val="single" w:sz="4" w:color="D9D9D9"/>
-              <w:bottom w:val="single" w:sz="4" w:color="D9D9D9"/>
-              <w:right w:val="single" w:sz="4" w:color="D9D9D9"/>
-            </w:tcBorders>
-            <w:tcMar>
-              <w:top w:w="85" w:type="dxa"/>
-              <w:left w:w="85" w:type="dxa"/>
-              <w:bottom w:w="85" w:type="dxa"/>
-              <w:right w:w="85" w:type="dxa"/>
-            </w:tcMar>
-          </w:tcPr>
-          <w:p>
-            <w:pPr>
-              <w:spacing w:after="60"/>
-            </w:pPr>
-            <w:r>
-              <w:rPr>
-                <w:b w:val="0"/>
-                <w:sz w:val="18"/>
-              </w:rPr>
-              <w:t>displayname_th, displayname_en</w:t>
-            </w:r>
-          </w:p>
-        </w:tc>
-        <w:tc>
-          <w:tcPr>
-            <w:tcW w:type="dxa" w:w="5018"/>
-            <w:tcBorders>
-              <w:top w:val="single" w:sz="4" w:color="D9D9D9"/>
-              <w:left w:val="single" w:sz="4" w:color="D9D9D9"/>
-              <w:bottom w:val="single" w:sz="4" w:color="D9D9D9"/>
-              <w:right w:val="single" w:sz="4" w:color="D9D9D9"/>
-            </w:tcBorders>
-            <w:tcMar>
-              <w:top w:w="85" w:type="dxa"/>
-              <w:left w:w="85" w:type="dxa"/>
-              <w:bottom w:w="85" w:type="dxa"/>
-              <w:right w:w="85" w:type="dxa"/>
-            </w:tcMar>
-          </w:tcPr>
-          <w:p>
-            <w:pPr>
-              <w:spacing w:after="60"/>
-            </w:pPr>
-            <w:r>
-              <w:rPr>
-                <w:b w:val="0"/>
-                <w:sz w:val="18"/>
-              </w:rPr>
-              <w:t>เลือกชื่อไทยก่อน ถ้าไม่มีจึงใช้ชื่ออังกฤษ ส่งเป็น TUAccount.display_name เพียงชื่อเดียว</w:t>
-            </w:r>
-          </w:p>
-        </w:tc>
-      </w:tr>
-      <w:tr>
-        <w:trPr>
-          <w:cantSplit/>
-        </w:trPr>
-        <w:tc>
-          <w:tcPr>
-            <w:tcW w:type="dxa" w:w="5018"/>
-            <w:tcBorders>
-              <w:top w:val="single" w:sz="4" w:color="D9D9D9"/>
-              <w:left w:val="single" w:sz="4" w:color="D9D9D9"/>
-              <w:bottom w:val="single" w:sz="4" w:color="D9D9D9"/>
-              <w:right w:val="single" w:sz="4" w:color="D9D9D9"/>
-            </w:tcBorders>
-            <w:tcMar>
-              <w:top w:w="85" w:type="dxa"/>
-              <w:left w:w="85" w:type="dxa"/>
-              <w:bottom w:w="85" w:type="dxa"/>
-              <w:right w:w="85" w:type="dxa"/>
-            </w:tcMar>
-          </w:tcPr>
-          <w:p>
-            <w:pPr>
-              <w:spacing w:after="60"/>
-            </w:pPr>
-            <w:r>
-              <w:rPr>
-                <w:b w:val="0"/>
-                <w:sz w:val="18"/>
-              </w:rPr>
-              <w:t>tu_status, statusid, message, email, department, faculty</w:t>
-            </w:r>
-          </w:p>
-        </w:tc>
-        <w:tc>
-          <w:tcPr>
-            <w:tcW w:type="dxa" w:w="5018"/>
-            <w:tcBorders>
-              <w:top w:val="single" w:sz="4" w:color="D9D9D9"/>
-              <w:left w:val="single" w:sz="4" w:color="D9D9D9"/>
-              <w:bottom w:val="single" w:sz="4" w:color="D9D9D9"/>
-              <w:right w:val="single" w:sz="4" w:color="D9D9D9"/>
-            </w:tcBorders>
-            <w:tcMar>
-              <w:top w:w="85" w:type="dxa"/>
-              <w:left w:w="85" w:type="dxa"/>
-              <w:bottom w:w="85" w:type="dxa"/>
-              <w:right w:w="85" w:type="dxa"/>
-            </w:tcMar>
-          </w:tcPr>
-          <w:p>
-            <w:pPr>
-              <w:spacing w:after="60"/>
-            </w:pPr>
-            <w:r>
-              <w:rPr>
-                <w:b w:val="0"/>
-                <w:sz w:val="18"/>
-              </w:rPr>
-              <w:t>ไม่ได้ใช้กำหนด User หรือสิทธิ์ใน adapter ปัจจุบัน</w:t>
-            </w:r>
-          </w:p>
-        </w:tc>
-      </w:tr>
-    </w:tbl>
-    <w:p/>
-    <w:p>
-      <w:r>
-        <w:t>AuthService ส่งชื่อที่เลือกผ่านพารามิเตอร์ displayname_en ให้ UserDAO จึงอาจเก็บชื่อภาษาไทยในคอลัมน์นี้ด้วย การมีสองคอลัมน์ใน Entity ไม่ได้หมายความว่า Login ปัจจุบันเติมชื่อแยกสองภาษา</w:t>
-      </w:r>
-    </w:p>
-    <w:p>
-      <w:r>
-        <w:t>การมี User ในฐานข้อมูลไม่ใช้แทนการยืนยันตัวตนกับ TU API ในการ Login ครั้งถัดไป และไม่มีการเก็บ statusid เป็นคีย์ผู้ใช้</w:t>
-      </w:r>
-    </w:p>
-    <w:p>
-      <w:pPr>
-        <w:pStyle w:val="Heading2"/>
-      </w:pPr>
-      <w:r>
-        <w:t>ชื่อที่ใช้แสดง</w:t>
-      </w:r>
-    </w:p>
-    <w:p>
-      <w:r>
-        <w:t>ชื่อผู้เผยแพร่อ่านจาก User ที่แนวข้อสอบอ้างถึง โดยใช้ลำดับดังนี้:</w:t>
-      </w:r>
-    </w:p>
-    <w:p>
-      <w:r>
-        <w:t>1. ถ้ามีทั้งสองชื่อ แสดง ชื่อไทย (ชื่ออังกฤษ)</w:t>
-      </w:r>
-    </w:p>
-    <w:p>
-      <w:r>
-        <w:t>2. ถ้ามีชื่อเดียว แสดงชื่อนั้นโดยตัดช่องว่างหัวท้าย</w:t>
-      </w:r>
-    </w:p>
-    <w:p>
-      <w:r>
-        <w:t>3. ถ้าไม่มีทั้งสองชื่อ แสดง "ไม่ระบุชื่อ"</w:t>
-      </w:r>
-    </w:p>
-    <w:p>
-      <w:r>
-        <w:t>ใช้ format_publisher_name ร่วมกันใน service อ่านและเผยแพร่ ส่วนชื่อบัญชีที่ AuthService แสดงใช้ชื่อไทยก่อนชื่ออังกฤษและ username เป็น fallback จึงไม่ใช่กติกาเดียวกับชื่อผู้เผยแพร่</w:t>
-      </w:r>
-    </w:p>
-    <w:p>
-      <w:pPr>
-        <w:pStyle w:val="Heading1"/>
-      </w:pPr>
-      <w:r>
-        <w:t>4. การหาผู้ใช้เดิมและป้องกันบัญชีซ้ำ</w:t>
-      </w:r>
-    </w:p>
-    <w:p>
-      <w:r>
-        <w:t>หลัง TU API ยืนยันตัวตนสำเร็จและบัญชีผ่านกติกา Login ของ Task1 ระบบระบุ User ดังนี้:</w:t>
-      </w:r>
-    </w:p>
-    <w:p>
-      <w:r>
-        <w:t>1. อ่าน username ที่ผ่านการยืนยันจาก TUAccount และตัดช่องว่างหัวท้าย</w:t>
-      </w:r>
-    </w:p>
-    <w:p>
-      <w:r>
-        <w:t>2. ค้นหา User ด้วย username</w:t>
-      </w:r>
-    </w:p>
-    <w:p>
-      <w:r>
-        <w:t>3. ถ้าพบบัญชีเดิม ใช้ users.id เดิม</w:t>
-      </w:r>
-    </w:p>
-    <w:p>
-      <w:r>
-        <w:t>4. อัปเดตชื่อของบัญชีเดิม เฉพาะชื่อที่ API ส่งมาเป็นข้อความไม่ว่าง</w:t>
-      </w:r>
-    </w:p>
-    <w:p>
-      <w:r>
-        <w:t>5. ถ้าไม่พบบัญชีเดิม สร้าง User ใหม่พร้อมชื่อจาก API</w:t>
-      </w:r>
-    </w:p>
-    <w:p>
-      <w:r>
-        <w:t>6. DAO flush แล้วคืน User ให้ AuthService เตรียมตัวตนและ commit ก่อนสร้าง token</w:t>
-      </w:r>
-    </w:p>
-    <w:p>
-      <w:r>
-        <w:t>UserDAO ไม่ล้างชื่อเดิมเมื่อรับพารามิเตอร์ชื่อว่าง แต่ real TU adapter จะปฏิเสธการ Login หาก response ไม่มีชื่อที่ใช้ได้ทั้งสองภาษา จึงไม่ใช่กรณี Login จริงสำเร็จโดยไม่มีชื่อ</w:t>
-      </w:r>
-    </w:p>
-    <w:p>
-      <w:r>
-        <w:t>หากการยืนยันตัวตนไม่สำเร็จหรือบัญชีไม่ผ่านกติกา Login จะไม่มีการสร้างหรืออัปเดต User</w:t>
-      </w:r>
-    </w:p>
-    <w:p>
-      <w:pPr>
-        <w:pStyle w:val="Heading2"/>
-      </w:pPr>
-      <w:r>
-        <w:t>การ Login พร้อมกัน</w:t>
-      </w:r>
-    </w:p>
-    <w:p>
-      <w:r>
-        <w:t>ฐานข้อมูลกำหนดข้อบังคับ UNIQUE ที่ username เพื่อป้องกันบัญชีซ้ำ แม้มีหลายคำขอพยายามสร้างบัญชีเดียวกันพร้อมกัน</w:t>
-      </w:r>
-    </w:p>
-    <w:p>
-      <w:r>
-        <w:t>UserDAO ครอบการสร้าง User ใหม่ด้วย session.begin_nested() เมื่อ insert ไม่สำเร็จเพราะ duplicate username ที่รองรับ ให้ rollback เฉพาะ savepoint แล้วอ่าน User ที่มีอยู่เพื่อคืนคีย์เดิม ไม่ rollback transaction ชั้นนอกของผู้เรียก</w:t>
-      </w:r>
-    </w:p>
-    <w:p>
-      <w:r>
-        <w:t>ข้อผิดพลาดฐานข้อมูลประเภทอื่นส่งให้ขั้นตอน Login จัดการ โดยไม่ถือว่าเป็นกรณีพบผู้ใช้เดิม</w:t>
-      </w:r>
-    </w:p>
-    <w:p>
-      <w:pPr>
-        <w:pStyle w:val="Heading1"/>
-      </w:pPr>
-      <w:r>
-        <w:t>5. ความสัมพันธ์กับแนวข้อสอบ</w:t>
-      </w:r>
-    </w:p>
-    <w:p>
-      <w:r>
-        <w:t>guides.publisher_id เป็น INT NOT NULL และเป็น Foreign Key ไปยัง users.id</w:t>
-      </w:r>
-    </w:p>
-    <w:p>
-      <w:r>
-        <w:t>ผู้เผยแพร่กำหนดจากตัวตนผู้ใช้ที่เข้าสู่ระบบ โดยผู้เผยแพร่เป็นเจ้าของแนวข้อสอบรายการนั้น</w:t>
-      </w:r>
-    </w:p>
-    <w:p>
-      <w:r>
-        <w:t>ความสัมพันธ์มีดังนี้:</w:t>
-      </w:r>
-    </w:p>
-    <w:p>
-      <w:r>
-        <w:t>- User หนึ่งคนเผยแพร่ Guide ได้ตั้งแต่ศูนย์รายการขึ้นไป</w:t>
-      </w:r>
-    </w:p>
-    <w:p>
-      <w:r>
-        <w:t>- Guide แต่ละรายการมีผู้เผยแพร่หนึ่งคน</w:t>
-      </w:r>
-    </w:p>
-    <w:p>
-      <w:r>
-        <w:t>- Course หนึ่งวิชามี Guide ได้ตั้งแต่ศูนย์รายการขึ้นไป</w:t>
-      </w:r>
-    </w:p>
-    <w:p>
-      <w:r>
-        <w:t>- Guide แต่ละรายการอยู่ใน Course หนึ่งวิชา</w:t>
-      </w:r>
-    </w:p>
-    <w:p>
-      <w:r>
-        <w:t>ชื่อผู้เผยแพร่บนแนวข้อสอบอ่านจาก User ผ่าน publisher_id เมื่อชื่อจาก TU API อัปเดต รายการแนวข้อสอบแสดงชื่อปัจจุบัน</w:t>
-      </w:r>
-    </w:p>
-    <w:p>
-      <w:r>
-        <w:t>การลบ Guide ไม่ลบ User ส่วนการลบ User ที่ยังมี Guide อ้างถึงถูกปฏิเสธ</w:t>
-      </w:r>
-    </w:p>
-    <w:p>
-      <w:pPr>
-        <w:pStyle w:val="Heading2"/>
-      </w:pPr>
-      <w:r>
-        <w:t>ER Diagram</w:t>
-      </w:r>
-    </w:p>
-    <w:p>
-      <w:pPr>
-        <w:pStyle w:val="Heading2"/>
-      </w:pPr>
-      <w:r>
-        <w:t>แผนภาพ 1</w:t>
-      </w:r>
-    </w:p>
-    <w:p>
-      <w:r>
-        <w:drawing>
-          <wp:inline xmlns:a="http://schemas.openxmlformats.org/drawingml/2006/main" xmlns:pic="http://schemas.openxmlformats.org/drawingml/2006/picture">
-            <wp:extent cx="5223373" cy="6126480"/>
-            <wp:docPr id="1" name="Picture 1"/>
-            <wp:cNvGraphicFramePr>
-              <a:graphicFrameLocks noChangeAspect="1"/>
-            </wp:cNvGraphicFramePr>
-            <a:graphic>
-              <a:graphicData uri="http://schemas.openxmlformats.org/drawingml/2006/picture">
-                <pic:pic>
-                  <pic:nvPicPr>
-                    <pic:cNvPr id="0" name="rendered-diagrams-2.png"/>
-                    <pic:cNvPicPr/>
-                  </pic:nvPicPr>
-                  <pic:blipFill>
-                    <a:blip r:embed="rId9"/>
-                    <a:stretch>
-                      <a:fillRect/>
-                    </a:stretch>
-                  </pic:blipFill>
-                  <pic:spPr>
-                    <a:xfrm>
-                      <a:off x="0" y="0"/>
-                      <a:ext cx="5223373" cy="6126480"/>
-                    </a:xfrm>
-                    <a:prstGeom prst="rect"/>
-                  </pic:spPr>
-                </pic:pic>
-              </a:graphicData>
-            </a:graphic>
-          </wp:inline>
-        </w:drawing>
-      </w:r>
-    </w:p>
-    <w:p>
-      <w:r>
-        <w:t>แผนภาพแสดงเฉพาะฟิลด์ของ Guide และ Course ที่เกี่ยวข้องกับความสัมพันธ์นี้ รายละเอียดของสองตารางใช้ตาม Task36 และ Task22</w:t>
-      </w:r>
-    </w:p>
-    <w:p>
-      <w:pPr>
-        <w:pStyle w:val="Heading1"/>
-      </w:pPr>
-      <w:r>
-        <w:t>6. แบบ Entity และ DAO</w:t>
-      </w:r>
-    </w:p>
-    <w:p>
-      <w:pPr>
-        <w:pStyle w:val="Heading2"/>
-      </w:pPr>
-      <w:r>
-        <w:t>User Entity</w:t>
-      </w:r>
-    </w:p>
-    <w:p>
-      <w:r>
-        <w:t>User เป็น SQLAlchemy Entity ที่แทนตาราง users โดยมีฟิลด์:</w:t>
-      </w:r>
-    </w:p>
-    <w:p>
-      <w:r>
-        <w:t>- id</w:t>
-      </w:r>
-    </w:p>
-    <w:p>
-      <w:r>
-        <w:t>- username</w:t>
-      </w:r>
-    </w:p>
-    <w:p>
-      <w:r>
-        <w:t>- displayname_th</w:t>
-      </w:r>
-    </w:p>
-    <w:p>
-      <w:r>
-        <w:t>- displayname_en</w:t>
-      </w:r>
-    </w:p>
-    <w:p>
-      <w:pPr>
-        <w:pStyle w:val="Heading2"/>
-      </w:pPr>
-      <w:r>
-        <w:t>UserDAO</w:t>
-      </w:r>
-    </w:p>
-    <w:tbl>
-      <w:tblPr>
-        <w:tblW w:type="auto" w:w="0"/>
-        <w:tblLayout w:type="autofit"/>
-        <w:tblLook w:firstColumn="1" w:firstRow="1" w:lastColumn="0" w:lastRow="0" w:noHBand="0" w:noVBand="1" w:val="04A0"/>
-      </w:tblPr>
-      <w:tblGrid>
-        <w:gridCol w:w="3346"/>
-        <w:gridCol w:w="3346"/>
-        <w:gridCol w:w="3346"/>
-      </w:tblGrid>
-      <w:tr>
-        <w:trPr>
-          <w:cantSplit/>
-          <w:tblHeader/>
-        </w:trPr>
-        <w:tc>
-          <w:tcPr>
-            <w:tcW w:type="dxa" w:w="3346"/>
-            <w:tcBorders>
-              <w:top w:val="single" w:sz="4" w:color="D9D9D9"/>
-              <w:left w:val="single" w:sz="4" w:color="D9D9D9"/>
-              <w:bottom w:val="single" w:sz="4" w:color="D9D9D9"/>
-              <w:right w:val="single" w:sz="4" w:color="D9D9D9"/>
-            </w:tcBorders>
-            <w:tcMar>
-              <w:top w:w="85" w:type="dxa"/>
-              <w:left w:w="85" w:type="dxa"/>
-              <w:bottom w:w="85" w:type="dxa"/>
-              <w:right w:w="85" w:type="dxa"/>
-            </w:tcMar>
-            <w:shd w:fill="E8EEF4"/>
-          </w:tcPr>
-          <w:p>
-            <w:pPr>
-              <w:spacing w:after="60"/>
-            </w:pPr>
-            <w:r>
-              <w:rPr>
-                <w:b/>
-                <w:sz w:val="18"/>
-              </w:rPr>
-              <w:t>เมธอด</w:t>
-            </w:r>
-          </w:p>
-        </w:tc>
-        <w:tc>
-          <w:tcPr>
-            <w:tcW w:type="dxa" w:w="3346"/>
-            <w:tcBorders>
-              <w:top w:val="single" w:sz="4" w:color="D9D9D9"/>
-              <w:left w:val="single" w:sz="4" w:color="D9D9D9"/>
-              <w:bottom w:val="single" w:sz="4" w:color="D9D9D9"/>
-              <w:right w:val="single" w:sz="4" w:color="D9D9D9"/>
-            </w:tcBorders>
-            <w:tcMar>
-              <w:top w:w="85" w:type="dxa"/>
-              <w:left w:w="85" w:type="dxa"/>
-              <w:bottom w:w="85" w:type="dxa"/>
-              <w:right w:w="85" w:type="dxa"/>
-            </w:tcMar>
-            <w:shd w:fill="E8EEF4"/>
-          </w:tcPr>
-          <w:p>
-            <w:pPr>
-              <w:spacing w:after="60"/>
-            </w:pPr>
-            <w:r>
-              <w:rPr>
-                <w:b/>
-                <w:sz w:val="18"/>
-              </w:rPr>
-              <w:t>ข้อมูลรับเข้า</w:t>
-            </w:r>
-          </w:p>
-        </w:tc>
-        <w:tc>
-          <w:tcPr>
-            <w:tcW w:type="dxa" w:w="3346"/>
-            <w:tcBorders>
-              <w:top w:val="single" w:sz="4" w:color="D9D9D9"/>
-              <w:left w:val="single" w:sz="4" w:color="D9D9D9"/>
-              <w:bottom w:val="single" w:sz="4" w:color="D9D9D9"/>
-              <w:right w:val="single" w:sz="4" w:color="D9D9D9"/>
-            </w:tcBorders>
-            <w:tcMar>
-              <w:top w:w="85" w:type="dxa"/>
-              <w:left w:w="85" w:type="dxa"/>
-              <w:bottom w:w="85" w:type="dxa"/>
-              <w:right w:w="85" w:type="dxa"/>
-            </w:tcMar>
-            <w:shd w:fill="E8EEF4"/>
-          </w:tcPr>
-          <w:p>
-            <w:pPr>
-              <w:spacing w:after="60"/>
-            </w:pPr>
-            <w:r>
-              <w:rPr>
-                <w:b/>
-                <w:sz w:val="18"/>
-              </w:rPr>
-              <w:t>ผลที่คืน</w:t>
-            </w:r>
-          </w:p>
-        </w:tc>
-      </w:tr>
-      <w:tr>
-        <w:trPr>
-          <w:cantSplit/>
-        </w:trPr>
-        <w:tc>
-          <w:tcPr>
-            <w:tcW w:type="dxa" w:w="3346"/>
-            <w:tcBorders>
-              <w:top w:val="single" w:sz="4" w:color="D9D9D9"/>
-              <w:left w:val="single" w:sz="4" w:color="D9D9D9"/>
-              <w:bottom w:val="single" w:sz="4" w:color="D9D9D9"/>
-              <w:right w:val="single" w:sz="4" w:color="D9D9D9"/>
-            </w:tcBorders>
-            <w:tcMar>
-              <w:top w:w="85" w:type="dxa"/>
-              <w:left w:w="85" w:type="dxa"/>
-              <w:bottom w:w="85" w:type="dxa"/>
-              <w:right w:w="85" w:type="dxa"/>
-            </w:tcMar>
-          </w:tcPr>
-          <w:p>
-            <w:pPr>
-              <w:spacing w:after="60"/>
-            </w:pPr>
-            <w:r>
-              <w:rPr>
-                <w:b w:val="0"/>
-                <w:sz w:val="18"/>
-              </w:rPr>
-              <w:t>get_by_username</w:t>
-            </w:r>
-          </w:p>
-        </w:tc>
-        <w:tc>
-          <w:tcPr>
-            <w:tcW w:type="dxa" w:w="3346"/>
-            <w:tcBorders>
-              <w:top w:val="single" w:sz="4" w:color="D9D9D9"/>
-              <w:left w:val="single" w:sz="4" w:color="D9D9D9"/>
-              <w:bottom w:val="single" w:sz="4" w:color="D9D9D9"/>
-              <w:right w:val="single" w:sz="4" w:color="D9D9D9"/>
-            </w:tcBorders>
-            <w:tcMar>
-              <w:top w:w="85" w:type="dxa"/>
-              <w:left w:w="85" w:type="dxa"/>
-              <w:bottom w:w="85" w:type="dxa"/>
-              <w:right w:w="85" w:type="dxa"/>
-            </w:tcMar>
-          </w:tcPr>
-          <w:p>
-            <w:pPr>
-              <w:spacing w:after="60"/>
-            </w:pPr>
-            <w:r>
-              <w:rPr>
-                <w:b w:val="0"/>
-                <w:sz w:val="18"/>
-              </w:rPr>
-              <w:t>บัญชี TU ที่ตัดช่องว่างแล้ว</w:t>
-            </w:r>
-          </w:p>
-        </w:tc>
-        <w:tc>
-          <w:tcPr>
-            <w:tcW w:type="dxa" w:w="3346"/>
-            <w:tcBorders>
-              <w:top w:val="single" w:sz="4" w:color="D9D9D9"/>
-              <w:left w:val="single" w:sz="4" w:color="D9D9D9"/>
-              <w:bottom w:val="single" w:sz="4" w:color="D9D9D9"/>
-              <w:right w:val="single" w:sz="4" w:color="D9D9D9"/>
-            </w:tcBorders>
-            <w:tcMar>
-              <w:top w:w="85" w:type="dxa"/>
-              <w:left w:w="85" w:type="dxa"/>
-              <w:bottom w:w="85" w:type="dxa"/>
-              <w:right w:w="85" w:type="dxa"/>
-            </w:tcMar>
-          </w:tcPr>
-          <w:p>
-            <w:pPr>
-              <w:spacing w:after="60"/>
-            </w:pPr>
-            <w:r>
-              <w:rPr>
-                <w:b w:val="0"/>
-                <w:sz w:val="18"/>
-              </w:rPr>
-              <w:t>User หรือ None เมื่อไม่พบ</w:t>
-            </w:r>
-          </w:p>
-        </w:tc>
-      </w:tr>
-      <w:tr>
-        <w:trPr>
-          <w:cantSplit/>
-        </w:trPr>
-        <w:tc>
-          <w:tcPr>
-            <w:tcW w:type="dxa" w:w="3346"/>
-            <w:tcBorders>
-              <w:top w:val="single" w:sz="4" w:color="D9D9D9"/>
-              <w:left w:val="single" w:sz="4" w:color="D9D9D9"/>
-              <w:bottom w:val="single" w:sz="4" w:color="D9D9D9"/>
-              <w:right w:val="single" w:sz="4" w:color="D9D9D9"/>
-            </w:tcBorders>
-            <w:tcMar>
-              <w:top w:w="85" w:type="dxa"/>
-              <w:left w:w="85" w:type="dxa"/>
-              <w:bottom w:w="85" w:type="dxa"/>
-              <w:right w:w="85" w:type="dxa"/>
-            </w:tcMar>
-          </w:tcPr>
-          <w:p>
-            <w:pPr>
-              <w:spacing w:after="60"/>
-            </w:pPr>
-            <w:r>
-              <w:rPr>
-                <w:b w:val="0"/>
-                <w:sz w:val="18"/>
-              </w:rPr>
-              <w:t>get_by_id</w:t>
-            </w:r>
-          </w:p>
-        </w:tc>
-        <w:tc>
-          <w:tcPr>
-            <w:tcW w:type="dxa" w:w="3346"/>
-            <w:tcBorders>
-              <w:top w:val="single" w:sz="4" w:color="D9D9D9"/>
-              <w:left w:val="single" w:sz="4" w:color="D9D9D9"/>
-              <w:bottom w:val="single" w:sz="4" w:color="D9D9D9"/>
-              <w:right w:val="single" w:sz="4" w:color="D9D9D9"/>
-            </w:tcBorders>
-            <w:tcMar>
-              <w:top w:w="85" w:type="dxa"/>
-              <w:left w:w="85" w:type="dxa"/>
-              <w:bottom w:w="85" w:type="dxa"/>
-              <w:right w:w="85" w:type="dxa"/>
-            </w:tcMar>
-          </w:tcPr>
-          <w:p>
-            <w:pPr>
-              <w:spacing w:after="60"/>
-            </w:pPr>
-            <w:r>
-              <w:rPr>
-                <w:b w:val="0"/>
-                <w:sz w:val="18"/>
-              </w:rPr>
-              <w:t>users.id</w:t>
-            </w:r>
-          </w:p>
-        </w:tc>
-        <w:tc>
-          <w:tcPr>
-            <w:tcW w:type="dxa" w:w="3346"/>
-            <w:tcBorders>
-              <w:top w:val="single" w:sz="4" w:color="D9D9D9"/>
-              <w:left w:val="single" w:sz="4" w:color="D9D9D9"/>
-              <w:bottom w:val="single" w:sz="4" w:color="D9D9D9"/>
-              <w:right w:val="single" w:sz="4" w:color="D9D9D9"/>
-            </w:tcBorders>
-            <w:tcMar>
-              <w:top w:w="85" w:type="dxa"/>
-              <w:left w:w="85" w:type="dxa"/>
-              <w:bottom w:w="85" w:type="dxa"/>
-              <w:right w:w="85" w:type="dxa"/>
-            </w:tcMar>
-          </w:tcPr>
-          <w:p>
-            <w:pPr>
-              <w:spacing w:after="60"/>
-            </w:pPr>
-            <w:r>
-              <w:rPr>
-                <w:b w:val="0"/>
-                <w:sz w:val="18"/>
-              </w:rPr>
-              <w:t>User หรือ None เมื่อไม่พบ</w:t>
-            </w:r>
-          </w:p>
-        </w:tc>
-      </w:tr>
-      <w:tr>
-        <w:trPr>
-          <w:cantSplit/>
-        </w:trPr>
-        <w:tc>
-          <w:tcPr>
-            <w:tcW w:type="dxa" w:w="3346"/>
-            <w:tcBorders>
-              <w:top w:val="single" w:sz="4" w:color="D9D9D9"/>
-              <w:left w:val="single" w:sz="4" w:color="D9D9D9"/>
-              <w:bottom w:val="single" w:sz="4" w:color="D9D9D9"/>
-              <w:right w:val="single" w:sz="4" w:color="D9D9D9"/>
-            </w:tcBorders>
-            <w:tcMar>
-              <w:top w:w="85" w:type="dxa"/>
-              <w:left w:w="85" w:type="dxa"/>
-              <w:bottom w:w="85" w:type="dxa"/>
-              <w:right w:w="85" w:type="dxa"/>
-            </w:tcMar>
-          </w:tcPr>
-          <w:p>
-            <w:pPr>
-              <w:spacing w:after="60"/>
-            </w:pPr>
-            <w:r>
-              <w:rPr>
-                <w:b w:val="0"/>
-                <w:sz w:val="18"/>
-              </w:rPr>
-              <w:t>get_or_create_from_tu_profile</w:t>
-            </w:r>
-          </w:p>
-        </w:tc>
-        <w:tc>
-          <w:tcPr>
-            <w:tcW w:type="dxa" w:w="3346"/>
-            <w:tcBorders>
-              <w:top w:val="single" w:sz="4" w:color="D9D9D9"/>
-              <w:left w:val="single" w:sz="4" w:color="D9D9D9"/>
-              <w:bottom w:val="single" w:sz="4" w:color="D9D9D9"/>
-              <w:right w:val="single" w:sz="4" w:color="D9D9D9"/>
-            </w:tcBorders>
-            <w:tcMar>
-              <w:top w:w="85" w:type="dxa"/>
-              <w:left w:w="85" w:type="dxa"/>
-              <w:bottom w:w="85" w:type="dxa"/>
-              <w:right w:w="85" w:type="dxa"/>
-            </w:tcMar>
-          </w:tcPr>
-          <w:p>
-            <w:pPr>
-              <w:spacing w:after="60"/>
-            </w:pPr>
-            <w:r>
-              <w:rPr>
-                <w:b w:val="0"/>
-                <w:sz w:val="18"/>
-              </w:rPr>
-              <w:t>username, displayname_th, displayname_en ที่ผ่านการตรวจสอบจากขั้นตอน Login</w:t>
-            </w:r>
-          </w:p>
-        </w:tc>
-        <w:tc>
-          <w:tcPr>
-            <w:tcW w:type="dxa" w:w="3346"/>
-            <w:tcBorders>
-              <w:top w:val="single" w:sz="4" w:color="D9D9D9"/>
-              <w:left w:val="single" w:sz="4" w:color="D9D9D9"/>
-              <w:bottom w:val="single" w:sz="4" w:color="D9D9D9"/>
-              <w:right w:val="single" w:sz="4" w:color="D9D9D9"/>
-            </w:tcBorders>
-            <w:tcMar>
-              <w:top w:w="85" w:type="dxa"/>
-              <w:left w:w="85" w:type="dxa"/>
-              <w:bottom w:w="85" w:type="dxa"/>
-              <w:right w:w="85" w:type="dxa"/>
-            </w:tcMar>
-          </w:tcPr>
-          <w:p>
-            <w:pPr>
-              <w:spacing w:after="60"/>
-            </w:pPr>
-            <w:r>
-              <w:rPr>
-                <w:b w:val="0"/>
-                <w:sz w:val="18"/>
-              </w:rPr>
-              <w:t>User ใหม่หรือ User เดิม พร้อมข้อมูลชื่อที่อัปเดต</w:t>
-            </w:r>
-          </w:p>
-        </w:tc>
-      </w:tr>
-    </w:tbl>
-    <w:p/>
-    <w:p>
-      <w:r>
-        <w:t>get_or_create_from_tu_profile ใช้กติกาในข้อ 4 และคืน User หลัง flush โดยไม่ commit ผู้เรียกเป็นเจ้าของ transaction: AuthService commit หลังเตรียม AuthenticatedUser ส่วน PublishGuideService commit User และ Guide ร่วมกัน</w:t>
-      </w:r>
-    </w:p>
-    <w:p>
-      <w:r>
-        <w:t>DAO ทำหน้าที่เข้าถึงฐานข้อมูล ส่วนการเรียก TU API ตรวจสิทธิ์บัญชี และสร้างสถานะเข้าสู่ระบบอยู่ในขั้นตอน Login</w:t>
-      </w:r>
-    </w:p>
-    <w:p>
-      <w:pPr>
-        <w:pStyle w:val="Heading2"/>
-      </w:pPr>
-      <w:r>
-        <w:t>แผนภาพ Entity/DAO</w:t>
-      </w:r>
-    </w:p>
-    <w:p>
-      <w:pPr>
-        <w:pStyle w:val="Heading2"/>
-      </w:pPr>
-      <w:r>
-        <w:t>แผนภาพ 2</w:t>
-      </w:r>
-    </w:p>
-    <w:p>
-      <w:r>
-        <w:drawing>
-          <wp:inline xmlns:a="http://schemas.openxmlformats.org/drawingml/2006/main" xmlns:pic="http://schemas.openxmlformats.org/drawingml/2006/picture">
-            <wp:extent cx="6309360" cy="4961730"/>
-            <wp:docPr id="2" name="Picture 2"/>
-            <wp:cNvGraphicFramePr>
-              <a:graphicFrameLocks noChangeAspect="1"/>
-            </wp:cNvGraphicFramePr>
-            <a:graphic>
-              <a:graphicData uri="http://schemas.openxmlformats.org/drawingml/2006/picture">
-                <pic:pic>
-                  <pic:nvPicPr>
-                    <pic:cNvPr id="0" name="rendered-diagrams-3.png"/>
-                    <pic:cNvPicPr/>
-                  </pic:nvPicPr>
-                  <pic:blipFill>
-                    <a:blip r:embed="rId10"/>
-                    <a:stretch>
-                      <a:fillRect/>
-                    </a:stretch>
-                  </pic:blipFill>
-                  <pic:spPr>
-                    <a:xfrm>
-                      <a:off x="0" y="0"/>
-                      <a:ext cx="6309360" cy="4961730"/>
-                    </a:xfrm>
-                    <a:prstGeom prst="rect"/>
-                  </pic:spPr>
-                </pic:pic>
-              </a:graphicData>
-            </a:graphic>
-          </wp:inline>
-        </w:drawing>
-      </w:r>
-    </w:p>
-    <w:p>
-      <w:pPr>
-        <w:pStyle w:val="Heading1"/>
-      </w:pPr>
-      <w:r>
-        <w:t>7. ผลที่ต้องได้จากแบบนี้</w:t>
-      </w:r>
-    </w:p>
-    <w:tbl>
-      <w:tblPr>
-        <w:tblW w:type="auto" w:w="0"/>
-        <w:tblLayout w:type="autofit"/>
-        <w:tblLook w:firstColumn="1" w:firstRow="1" w:lastColumn="0" w:lastRow="0" w:noHBand="0" w:noVBand="1" w:val="04A0"/>
-      </w:tblPr>
-      <w:tblGrid>
-        <w:gridCol w:w="5018"/>
-        <w:gridCol w:w="5018"/>
-      </w:tblGrid>
-      <w:tr>
-        <w:trPr>
-          <w:cantSplit/>
-          <w:tblHeader/>
-        </w:trPr>
-        <w:tc>
-          <w:tcPr>
-            <w:tcW w:type="dxa" w:w="5018"/>
-            <w:tcBorders>
-              <w:top w:val="single" w:sz="4" w:color="D9D9D9"/>
-              <w:left w:val="single" w:sz="4" w:color="D9D9D9"/>
-              <w:bottom w:val="single" w:sz="4" w:color="D9D9D9"/>
-              <w:right w:val="single" w:sz="4" w:color="D9D9D9"/>
-            </w:tcBorders>
-            <w:tcMar>
-              <w:top w:w="85" w:type="dxa"/>
-              <w:left w:w="85" w:type="dxa"/>
-              <w:bottom w:w="85" w:type="dxa"/>
-              <w:right w:w="85" w:type="dxa"/>
-            </w:tcMar>
-            <w:shd w:fill="E8EEF4"/>
-          </w:tcPr>
-          <w:p>
-            <w:pPr>
-              <w:spacing w:after="60"/>
-            </w:pPr>
-            <w:r>
-              <w:rPr>
-                <w:b/>
-                <w:sz w:val="18"/>
-              </w:rPr>
-              <w:t>กรณี</w:t>
-            </w:r>
-          </w:p>
-        </w:tc>
-        <w:tc>
-          <w:tcPr>
-            <w:tcW w:type="dxa" w:w="5018"/>
-            <w:tcBorders>
-              <w:top w:val="single" w:sz="4" w:color="D9D9D9"/>
-              <w:left w:val="single" w:sz="4" w:color="D9D9D9"/>
-              <w:bottom w:val="single" w:sz="4" w:color="D9D9D9"/>
-              <w:right w:val="single" w:sz="4" w:color="D9D9D9"/>
-            </w:tcBorders>
-            <w:tcMar>
-              <w:top w:w="85" w:type="dxa"/>
-              <w:left w:w="85" w:type="dxa"/>
-              <w:bottom w:w="85" w:type="dxa"/>
-              <w:right w:w="85" w:type="dxa"/>
-            </w:tcMar>
-            <w:shd w:fill="E8EEF4"/>
-          </w:tcPr>
-          <w:p>
-            <w:pPr>
-              <w:spacing w:after="60"/>
-            </w:pPr>
-            <w:r>
-              <w:rPr>
-                <w:b/>
-                <w:sz w:val="18"/>
-              </w:rPr>
-              <w:t>ผลที่ต้องได้</w:t>
-            </w:r>
-          </w:p>
-        </w:tc>
-      </w:tr>
-      <w:tr>
-        <w:trPr>
-          <w:cantSplit/>
-        </w:trPr>
-        <w:tc>
-          <w:tcPr>
-            <w:tcW w:type="dxa" w:w="5018"/>
-            <w:tcBorders>
-              <w:top w:val="single" w:sz="4" w:color="D9D9D9"/>
-              <w:left w:val="single" w:sz="4" w:color="D9D9D9"/>
-              <w:bottom w:val="single" w:sz="4" w:color="D9D9D9"/>
-              <w:right w:val="single" w:sz="4" w:color="D9D9D9"/>
-            </w:tcBorders>
-            <w:tcMar>
-              <w:top w:w="85" w:type="dxa"/>
-              <w:left w:w="85" w:type="dxa"/>
-              <w:bottom w:w="85" w:type="dxa"/>
-              <w:right w:w="85" w:type="dxa"/>
-            </w:tcMar>
-          </w:tcPr>
-          <w:p>
-            <w:pPr>
-              <w:spacing w:after="60"/>
-            </w:pPr>
-            <w:r>
-              <w:rPr>
-                <w:b w:val="0"/>
-                <w:sz w:val="18"/>
-              </w:rPr>
-              <w:t>Login บัญชีใหม่สำเร็จ</w:t>
-            </w:r>
-          </w:p>
-        </w:tc>
-        <w:tc>
-          <w:tcPr>
-            <w:tcW w:type="dxa" w:w="5018"/>
-            <w:tcBorders>
-              <w:top w:val="single" w:sz="4" w:color="D9D9D9"/>
-              <w:left w:val="single" w:sz="4" w:color="D9D9D9"/>
-              <w:bottom w:val="single" w:sz="4" w:color="D9D9D9"/>
-              <w:right w:val="single" w:sz="4" w:color="D9D9D9"/>
-            </w:tcBorders>
-            <w:tcMar>
-              <w:top w:w="85" w:type="dxa"/>
-              <w:left w:w="85" w:type="dxa"/>
-              <w:bottom w:w="85" w:type="dxa"/>
-              <w:right w:w="85" w:type="dxa"/>
-            </w:tcMar>
-          </w:tcPr>
-          <w:p>
-            <w:pPr>
-              <w:spacing w:after="60"/>
-            </w:pPr>
-            <w:r>
-              <w:rPr>
-                <w:b w:val="0"/>
-                <w:sz w:val="18"/>
-              </w:rPr>
-              <w:t>สร้าง User หนึ่งรายการและคืนคีย์ใหม่</w:t>
-            </w:r>
-          </w:p>
-        </w:tc>
-      </w:tr>
-      <w:tr>
-        <w:trPr>
-          <w:cantSplit/>
-        </w:trPr>
-        <w:tc>
-          <w:tcPr>
-            <w:tcW w:type="dxa" w:w="5018"/>
-            <w:tcBorders>
-              <w:top w:val="single" w:sz="4" w:color="D9D9D9"/>
-              <w:left w:val="single" w:sz="4" w:color="D9D9D9"/>
-              <w:bottom w:val="single" w:sz="4" w:color="D9D9D9"/>
-              <w:right w:val="single" w:sz="4" w:color="D9D9D9"/>
-            </w:tcBorders>
-            <w:tcMar>
-              <w:top w:w="85" w:type="dxa"/>
-              <w:left w:w="85" w:type="dxa"/>
-              <w:bottom w:w="85" w:type="dxa"/>
-              <w:right w:w="85" w:type="dxa"/>
-            </w:tcMar>
-          </w:tcPr>
-          <w:p>
-            <w:pPr>
-              <w:spacing w:after="60"/>
-            </w:pPr>
-            <w:r>
-              <w:rPr>
-                <w:b w:val="0"/>
-                <w:sz w:val="18"/>
-              </w:rPr>
-              <w:t>Login บัญชีเดิมสำเร็จ</w:t>
-            </w:r>
-          </w:p>
-        </w:tc>
-        <w:tc>
-          <w:tcPr>
-            <w:tcW w:type="dxa" w:w="5018"/>
-            <w:tcBorders>
-              <w:top w:val="single" w:sz="4" w:color="D9D9D9"/>
-              <w:left w:val="single" w:sz="4" w:color="D9D9D9"/>
-              <w:bottom w:val="single" w:sz="4" w:color="D9D9D9"/>
-              <w:right w:val="single" w:sz="4" w:color="D9D9D9"/>
-            </w:tcBorders>
-            <w:tcMar>
-              <w:top w:w="85" w:type="dxa"/>
-              <w:left w:w="85" w:type="dxa"/>
-              <w:bottom w:w="85" w:type="dxa"/>
-              <w:right w:w="85" w:type="dxa"/>
-            </w:tcMar>
-          </w:tcPr>
-          <w:p>
-            <w:pPr>
-              <w:spacing w:after="60"/>
-            </w:pPr>
-            <w:r>
-              <w:rPr>
-                <w:b w:val="0"/>
-                <w:sz w:val="18"/>
-              </w:rPr>
-              <w:t>คืน users.id เดิม</w:t>
-            </w:r>
-          </w:p>
-        </w:tc>
-      </w:tr>
-      <w:tr>
-        <w:trPr>
-          <w:cantSplit/>
-        </w:trPr>
-        <w:tc>
-          <w:tcPr>
-            <w:tcW w:type="dxa" w:w="5018"/>
-            <w:tcBorders>
-              <w:top w:val="single" w:sz="4" w:color="D9D9D9"/>
-              <w:left w:val="single" w:sz="4" w:color="D9D9D9"/>
-              <w:bottom w:val="single" w:sz="4" w:color="D9D9D9"/>
-              <w:right w:val="single" w:sz="4" w:color="D9D9D9"/>
-            </w:tcBorders>
-            <w:tcMar>
-              <w:top w:w="85" w:type="dxa"/>
-              <w:left w:w="85" w:type="dxa"/>
-              <w:bottom w:w="85" w:type="dxa"/>
-              <w:right w:w="85" w:type="dxa"/>
-            </w:tcMar>
-          </w:tcPr>
-          <w:p>
-            <w:pPr>
-              <w:spacing w:after="60"/>
-            </w:pPr>
-            <w:r>
-              <w:rPr>
-                <w:b w:val="0"/>
-                <w:sz w:val="18"/>
-              </w:rPr>
-              <w:t>Login บัญชีเดียวกันพร้อมกันหลายคำขอ</w:t>
-            </w:r>
-          </w:p>
-        </w:tc>
-        <w:tc>
-          <w:tcPr>
-            <w:tcW w:type="dxa" w:w="5018"/>
-            <w:tcBorders>
-              <w:top w:val="single" w:sz="4" w:color="D9D9D9"/>
-              <w:left w:val="single" w:sz="4" w:color="D9D9D9"/>
-              <w:bottom w:val="single" w:sz="4" w:color="D9D9D9"/>
-              <w:right w:val="single" w:sz="4" w:color="D9D9D9"/>
-            </w:tcBorders>
-            <w:tcMar>
-              <w:top w:w="85" w:type="dxa"/>
-              <w:left w:w="85" w:type="dxa"/>
-              <w:bottom w:w="85" w:type="dxa"/>
-              <w:right w:w="85" w:type="dxa"/>
-            </w:tcMar>
-          </w:tcPr>
-          <w:p>
-            <w:pPr>
-              <w:spacing w:after="60"/>
-            </w:pPr>
-            <w:r>
-              <w:rPr>
-                <w:b w:val="0"/>
-                <w:sz w:val="18"/>
-              </w:rPr>
-              <w:t>มี User ของบัญชีนั้นเพียงหนึ่งรายการ</w:t>
-            </w:r>
-          </w:p>
-        </w:tc>
-      </w:tr>
-      <w:tr>
-        <w:trPr>
-          <w:cantSplit/>
-        </w:trPr>
-        <w:tc>
-          <w:tcPr>
-            <w:tcW w:type="dxa" w:w="5018"/>
-            <w:tcBorders>
-              <w:top w:val="single" w:sz="4" w:color="D9D9D9"/>
-              <w:left w:val="single" w:sz="4" w:color="D9D9D9"/>
-              <w:bottom w:val="single" w:sz="4" w:color="D9D9D9"/>
-              <w:right w:val="single" w:sz="4" w:color="D9D9D9"/>
-            </w:tcBorders>
-            <w:tcMar>
-              <w:top w:w="85" w:type="dxa"/>
-              <w:left w:w="85" w:type="dxa"/>
-              <w:bottom w:w="85" w:type="dxa"/>
-              <w:right w:w="85" w:type="dxa"/>
-            </w:tcMar>
-          </w:tcPr>
-          <w:p>
-            <w:pPr>
-              <w:spacing w:after="60"/>
-            </w:pPr>
-            <w:r>
-              <w:rPr>
-                <w:b w:val="0"/>
-                <w:sz w:val="18"/>
-              </w:rPr>
-              <w:t>ชื่อจาก TU API เปลี่ยน</w:t>
-            </w:r>
-          </w:p>
-        </w:tc>
-        <w:tc>
-          <w:tcPr>
-            <w:tcW w:type="dxa" w:w="5018"/>
-            <w:tcBorders>
-              <w:top w:val="single" w:sz="4" w:color="D9D9D9"/>
-              <w:left w:val="single" w:sz="4" w:color="D9D9D9"/>
-              <w:bottom w:val="single" w:sz="4" w:color="D9D9D9"/>
-              <w:right w:val="single" w:sz="4" w:color="D9D9D9"/>
-            </w:tcBorders>
-            <w:tcMar>
-              <w:top w:w="85" w:type="dxa"/>
-              <w:left w:w="85" w:type="dxa"/>
-              <w:bottom w:w="85" w:type="dxa"/>
-              <w:right w:w="85" w:type="dxa"/>
-            </w:tcMar>
-          </w:tcPr>
-          <w:p>
-            <w:pPr>
-              <w:spacing w:after="60"/>
-            </w:pPr>
-            <w:r>
-              <w:rPr>
-                <w:b w:val="0"/>
-                <w:sz w:val="18"/>
-              </w:rPr>
-              <w:t>อัปเดตชื่อโดยไม่เปลี่ยน users.id</w:t>
-            </w:r>
-          </w:p>
-        </w:tc>
-      </w:tr>
-      <w:tr>
-        <w:trPr>
-          <w:cantSplit/>
-        </w:trPr>
-        <w:tc>
-          <w:tcPr>
-            <w:tcW w:type="dxa" w:w="5018"/>
-            <w:tcBorders>
-              <w:top w:val="single" w:sz="4" w:color="D9D9D9"/>
-              <w:left w:val="single" w:sz="4" w:color="D9D9D9"/>
-              <w:bottom w:val="single" w:sz="4" w:color="D9D9D9"/>
-              <w:right w:val="single" w:sz="4" w:color="D9D9D9"/>
-            </w:tcBorders>
-            <w:tcMar>
-              <w:top w:w="85" w:type="dxa"/>
-              <w:left w:w="85" w:type="dxa"/>
-              <w:bottom w:w="85" w:type="dxa"/>
-              <w:right w:w="85" w:type="dxa"/>
-            </w:tcMar>
-          </w:tcPr>
-          <w:p>
-            <w:pPr>
-              <w:spacing w:after="60"/>
-            </w:pPr>
-            <w:r>
-              <w:rPr>
-                <w:b w:val="0"/>
-                <w:sz w:val="18"/>
-              </w:rPr>
-              <w:t>UserDAO รับชื่อว่าง</w:t>
-            </w:r>
-          </w:p>
-        </w:tc>
-        <w:tc>
-          <w:tcPr>
-            <w:tcW w:type="dxa" w:w="5018"/>
-            <w:tcBorders>
-              <w:top w:val="single" w:sz="4" w:color="D9D9D9"/>
-              <w:left w:val="single" w:sz="4" w:color="D9D9D9"/>
-              <w:bottom w:val="single" w:sz="4" w:color="D9D9D9"/>
-              <w:right w:val="single" w:sz="4" w:color="D9D9D9"/>
-            </w:tcBorders>
-            <w:tcMar>
-              <w:top w:w="85" w:type="dxa"/>
-              <w:left w:w="85" w:type="dxa"/>
-              <w:bottom w:w="85" w:type="dxa"/>
-              <w:right w:w="85" w:type="dxa"/>
-            </w:tcMar>
-          </w:tcPr>
-          <w:p>
-            <w:pPr>
-              <w:spacing w:after="60"/>
-            </w:pPr>
-            <w:r>
-              <w:rPr>
-                <w:b w:val="0"/>
-                <w:sz w:val="18"/>
-              </w:rPr>
-              <w:t>เก็บชื่อเดิมไว้ ส่วน real Login ที่ไม่มีชื่อทั้งสองภาษาถูกปฏิเสธก่อนถึง DAO</w:t>
-            </w:r>
-          </w:p>
-        </w:tc>
-      </w:tr>
-      <w:tr>
-        <w:trPr>
-          <w:cantSplit/>
-        </w:trPr>
-        <w:tc>
-          <w:tcPr>
-            <w:tcW w:type="dxa" w:w="5018"/>
-            <w:tcBorders>
-              <w:top w:val="single" w:sz="4" w:color="D9D9D9"/>
-              <w:left w:val="single" w:sz="4" w:color="D9D9D9"/>
-              <w:bottom w:val="single" w:sz="4" w:color="D9D9D9"/>
-              <w:right w:val="single" w:sz="4" w:color="D9D9D9"/>
-            </w:tcBorders>
-            <w:tcMar>
-              <w:top w:w="85" w:type="dxa"/>
-              <w:left w:w="85" w:type="dxa"/>
-              <w:bottom w:w="85" w:type="dxa"/>
-              <w:right w:w="85" w:type="dxa"/>
-            </w:tcMar>
-          </w:tcPr>
-          <w:p>
-            <w:pPr>
-              <w:spacing w:after="60"/>
-            </w:pPr>
-            <w:r>
-              <w:rPr>
-                <w:b w:val="0"/>
-                <w:sz w:val="18"/>
-              </w:rPr>
-              <w:t>Login ไม่สำเร็จหรือไม่ผ่านกติกา</w:t>
-            </w:r>
-          </w:p>
-        </w:tc>
-        <w:tc>
-          <w:tcPr>
-            <w:tcW w:type="dxa" w:w="5018"/>
-            <w:tcBorders>
-              <w:top w:val="single" w:sz="4" w:color="D9D9D9"/>
-              <w:left w:val="single" w:sz="4" w:color="D9D9D9"/>
-              <w:bottom w:val="single" w:sz="4" w:color="D9D9D9"/>
-              <w:right w:val="single" w:sz="4" w:color="D9D9D9"/>
-            </w:tcBorders>
-            <w:tcMar>
-              <w:top w:w="85" w:type="dxa"/>
-              <w:left w:w="85" w:type="dxa"/>
-              <w:bottom w:w="85" w:type="dxa"/>
-              <w:right w:w="85" w:type="dxa"/>
-            </w:tcMar>
-          </w:tcPr>
-          <w:p>
-            <w:pPr>
-              <w:spacing w:after="60"/>
-            </w:pPr>
-            <w:r>
-              <w:rPr>
-                <w:b w:val="0"/>
-                <w:sz w:val="18"/>
-              </w:rPr>
-              <w:t>ไม่สร้างหรืออัปเดต User</w:t>
-            </w:r>
-          </w:p>
-        </w:tc>
-      </w:tr>
-      <w:tr>
-        <w:trPr>
-          <w:cantSplit/>
-        </w:trPr>
-        <w:tc>
-          <w:tcPr>
-            <w:tcW w:type="dxa" w:w="5018"/>
-            <w:tcBorders>
-              <w:top w:val="single" w:sz="4" w:color="D9D9D9"/>
-              <w:left w:val="single" w:sz="4" w:color="D9D9D9"/>
-              <w:bottom w:val="single" w:sz="4" w:color="D9D9D9"/>
-              <w:right w:val="single" w:sz="4" w:color="D9D9D9"/>
-            </w:tcBorders>
-            <w:tcMar>
-              <w:top w:w="85" w:type="dxa"/>
-              <w:left w:w="85" w:type="dxa"/>
-              <w:bottom w:w="85" w:type="dxa"/>
-              <w:right w:w="85" w:type="dxa"/>
-            </w:tcMar>
-          </w:tcPr>
-          <w:p>
-            <w:pPr>
-              <w:spacing w:after="60"/>
-            </w:pPr>
-            <w:r>
-              <w:rPr>
-                <w:b w:val="0"/>
-                <w:sz w:val="18"/>
-              </w:rPr>
-              <w:t>เผยแพร่แนวข้อสอบ</w:t>
-            </w:r>
-          </w:p>
-        </w:tc>
-        <w:tc>
-          <w:tcPr>
-            <w:tcW w:type="dxa" w:w="5018"/>
-            <w:tcBorders>
-              <w:top w:val="single" w:sz="4" w:color="D9D9D9"/>
-              <w:left w:val="single" w:sz="4" w:color="D9D9D9"/>
-              <w:bottom w:val="single" w:sz="4" w:color="D9D9D9"/>
-              <w:right w:val="single" w:sz="4" w:color="D9D9D9"/>
-            </w:tcBorders>
-            <w:tcMar>
-              <w:top w:w="85" w:type="dxa"/>
-              <w:left w:w="85" w:type="dxa"/>
-              <w:bottom w:w="85" w:type="dxa"/>
-              <w:right w:w="85" w:type="dxa"/>
-            </w:tcMar>
-          </w:tcPr>
-          <w:p>
-            <w:pPr>
-              <w:spacing w:after="60"/>
-            </w:pPr>
-            <w:r>
-              <w:rPr>
-                <w:b w:val="0"/>
-                <w:sz w:val="18"/>
-              </w:rPr>
-              <w:t>ใช้ users.id ของผู้เข้าสู่ระบบเป็น publisher_id</w:t>
-            </w:r>
-          </w:p>
-        </w:tc>
-      </w:tr>
-    </w:tbl>
-    <w:p/>
-    <w:p>
-      <w:pPr>
-        <w:pStyle w:val="Heading1"/>
-      </w:pPr>
-      <w:r>
-        <w:t>8. ความสัมพันธ์ที่เพิ่มและเส้นทาง Login</w:t>
-      </w:r>
-    </w:p>
-    <w:p>
-      <w:r>
-        <w:t>ER ข้างต้นแสดงเฉพาะความสัมพันธ์ของผู้เผยแพร่ หากอธิบายฐานข้อมูลทั้งระบบปัจจุบันต้องรวม saved_guides ซึ่งมี user_id อ้าง User และ guide_id อ้าง Guide ด้วย ดู ER ภาพรวม และ Sequence Login</w:t>
-      </w:r>
-    </w:p>
-    <w:p>
-      <w:r>
-        <w:t>แหล่งโค้ด: User Entity, UserDAO, AuthService และ ชื่อผู้เผยแพร่</w:t>
-      </w:r>
-    </w:p>
-    <w:sectPr>
-      <w:pgSz w:w="11909" w:h="16834"/>
-      <w:pgMar w:top="936" w:right="936" w:bottom="936" w:left="936" w:header="720" w:footer="720" w:gutter="0"/>
-      <w:cols w:space="720"/>
-      <w:docGrid w:linePitch="360"/>
-    </w:sectPr>
-  </w:body>
-</w:document>
+<ns0:document xmlns:ns0="http://schemas.openxmlformats.org/wordprocessingml/2006/main" xmlns:ns1="http://schemas.openxmlformats.org/markup-compatibility/2006" xmlns:ns2="http://schemas.openxmlformats.org/drawingml/2006/wordprocessingDrawing" xmlns:ns3="http://schemas.openxmlformats.org/drawingml/2006/main" xmlns:ns4="http://schemas.openxmlformats.org/drawingml/2006/picture" xmlns:ns5="http://schemas.openxmlformats.org/officeDocument/2006/relationships" ns1:Ignorable="w14 wp14">
+  <ns0:body>
+    <ns0:p>
+      <ns0:pPr>
+        <ns0:pStyle ns0:val="Title"/>
+      </ns0:pPr>
+      <ns0:r>
+        <ns0:t>U1 ออกแบบข้อมูลผู้ใช้และการป้องกันบัญชีซ้ำ</ns0:t>
+      </ns0:r>
+    </ns0:p>
+    <ns0:p>
+      <ns0:pPr>
+        <ns0:pStyle ns0:val="Heading1"/>
+      </ns0:pPr>
+      <ns0:r>
+        <ns0:t>1. เป้าหมาย</ns0:t>
+      </ns0:r>
+    </ns0:p>
+    <ns0:p>
+      <ns0:r>
+        <ns0:t>กำหนดข้อมูล User สำหรับระบุผู้ใช้หลังเข้าสู่ระบบ ป้องกันการสร้างบัญชีซ้ำ และเชื่อมผู้ใช้กับแนวข้อสอบที่เผยแพร่</ns0:t>
+      </ns0:r>
+    </ns0:p>
+    <ns0:p>
+      <ns0:r>
+        <ns0:t>ระบบใช้ username ที่ TU adapter ยืนยันแล้วเป็นตัวระบุบัญชี TU และสร้าง users.id เป็นคีย์ภายในระบบ</ns0:t>
+      </ns0:r>
+    </ns0:p>
+    <ns0:p>
+      <ns0:r>
+        <ns0:t>การเข้าสู่ระบบซ้ำด้วยบัญชี TU เดิมต้องคืน users.id เดิม</ns0:t>
+      </ns0:r>
+    </ns0:p>
+    <ns0:p>
+      <ns0:r>
+        <ns0:t>รายวิชาเป็นข้อมูลหลักสูตร 2566 ที่ทีมเตรียมไว้ผ่าน Seed โดย Course ไม่มีความสัมพันธ์กับ User ในฐานะผู้เพิ่มรายวิชา</ns0:t>
+      </ns0:r>
+    </ns0:p>
+    <ns0:p>
+      <ns0:pPr>
+        <ns0:pStyle ns0:val="Heading1"/>
+      </ns0:pPr>
+      <ns0:r>
+        <ns0:t>2. ตาราง User</ns0:t>
+      </ns0:r>
+    </ns0:p>
+    <ns0:p>
+      <ns0:r>
+        <ns0:t>ชื่อตารางคือ users</ns0:t>
+      </ns0:r>
+    </ns0:p>
+    <ns0:tbl>
+      <ns0:tblPr>
+        <ns0:tblW ns0:type="auto" ns0:w="0"/>
+        <ns0:tblLayout ns0:type="autofit"/>
+        <ns0:tblLook ns0:firstColumn="1" ns0:firstRow="1" ns0:lastColumn="0" ns0:lastRow="0" ns0:noHBand="0" ns0:noVBand="1" ns0:val="04A0"/>
+      </ns0:tblPr>
+      <ns0:tblGrid>
+        <ns0:gridCol ns0:w="2509"/>
+        <ns0:gridCol ns0:w="2509"/>
+        <ns0:gridCol ns0:w="2509"/>
+        <ns0:gridCol ns0:w="2509"/>
+      </ns0:tblGrid>
+      <ns0:tr>
+        <ns0:trPr>
+          <ns0:cantSplit/>
+          <ns0:tblHeader/>
+        </ns0:trPr>
+        <ns0:tc>
+          <ns0:tcPr>
+            <ns0:tcW ns0:type="dxa" ns0:w="2509"/>
+            <ns0:tcBorders>
+              <ns0:top ns0:val="single" ns0:sz="4" ns0:color="D9D9D9"/>
+              <ns0:left ns0:val="single" ns0:sz="4" ns0:color="D9D9D9"/>
+              <ns0:bottom ns0:val="single" ns0:sz="4" ns0:color="D9D9D9"/>
+              <ns0:right ns0:val="single" ns0:sz="4" ns0:color="D9D9D9"/>
+            </ns0:tcBorders>
+            <ns0:tcMar>
+              <ns0:top ns0:w="85" ns0:type="dxa"/>
+              <ns0:left ns0:w="85" ns0:type="dxa"/>
+              <ns0:bottom ns0:w="85" ns0:type="dxa"/>
+              <ns0:right ns0:w="85" ns0:type="dxa"/>
+            </ns0:tcMar>
+            <ns0:shd ns0:fill="E8EEF4"/>
+          </ns0:tcPr>
+          <ns0:p>
+            <ns0:pPr>
+              <ns0:spacing ns0:after="60"/>
+            </ns0:pPr>
+            <ns0:r>
+              <ns0:rPr>
+                <ns0:b/>
+                <ns0:sz ns0:val="18"/>
+              </ns0:rPr>
+              <ns0:t>ฟิลด์</ns0:t>
+            </ns0:r>
+          </ns0:p>
+        </ns0:tc>
+        <ns0:tc>
+          <ns0:tcPr>
+            <ns0:tcW ns0:type="dxa" ns0:w="2509"/>
+            <ns0:tcBorders>
+              <ns0:top ns0:val="single" ns0:sz="4" ns0:color="D9D9D9"/>
+              <ns0:left ns0:val="single" ns0:sz="4" ns0:color="D9D9D9"/>
+              <ns0:bottom ns0:val="single" ns0:sz="4" ns0:color="D9D9D9"/>
+              <ns0:right ns0:val="single" ns0:sz="4" ns0:color="D9D9D9"/>
+            </ns0:tcBorders>
+            <ns0:tcMar>
+              <ns0:top ns0:w="85" ns0:type="dxa"/>
+              <ns0:left ns0:w="85" ns0:type="dxa"/>
+              <ns0:bottom ns0:w="85" ns0:type="dxa"/>
+              <ns0:right ns0:w="85" ns0:type="dxa"/>
+            </ns0:tcMar>
+            <ns0:shd ns0:fill="E8EEF4"/>
+          </ns0:tcPr>
+          <ns0:p>
+            <ns0:pPr>
+              <ns0:spacing ns0:after="60"/>
+            </ns0:pPr>
+            <ns0:r>
+              <ns0:rPr>
+                <ns0:b/>
+                <ns0:sz ns0:val="18"/>
+              </ns0:rPr>
+              <ns0:t>ชนิดข้อมูล SQL Server</ns0:t>
+            </ns0:r>
+          </ns0:p>
+        </ns0:tc>
+        <ns0:tc>
+          <ns0:tcPr>
+            <ns0:tcW ns0:type="dxa" ns0:w="2509"/>
+            <ns0:tcBorders>
+              <ns0:top ns0:val="single" ns0:sz="4" ns0:color="D9D9D9"/>
+              <ns0:left ns0:val="single" ns0:sz="4" ns0:color="D9D9D9"/>
+              <ns0:bottom ns0:val="single" ns0:sz="4" ns0:color="D9D9D9"/>
+              <ns0:right ns0:val="single" ns0:sz="4" ns0:color="D9D9D9"/>
+            </ns0:tcBorders>
+            <ns0:tcMar>
+              <ns0:top ns0:w="85" ns0:type="dxa"/>
+              <ns0:left ns0:w="85" ns0:type="dxa"/>
+              <ns0:bottom ns0:w="85" ns0:type="dxa"/>
+              <ns0:right ns0:w="85" ns0:type="dxa"/>
+            </ns0:tcMar>
+            <ns0:shd ns0:fill="E8EEF4"/>
+          </ns0:tcPr>
+          <ns0:p>
+            <ns0:pPr>
+              <ns0:spacing ns0:after="60"/>
+            </ns0:pPr>
+            <ns0:r>
+              <ns0:rPr>
+                <ns0:b/>
+                <ns0:sz ns0:val="18"/>
+              </ns0:rPr>
+              <ns0:t>เว้นว่างได้</ns0:t>
+            </ns0:r>
+          </ns0:p>
+        </ns0:tc>
+        <ns0:tc>
+          <ns0:tcPr>
+            <ns0:tcW ns0:type="dxa" ns0:w="2509"/>
+            <ns0:tcBorders>
+              <ns0:top ns0:val="single" ns0:sz="4" ns0:color="D9D9D9"/>
+              <ns0:left ns0:val="single" ns0:sz="4" ns0:color="D9D9D9"/>
+              <ns0:bottom ns0:val="single" ns0:sz="4" ns0:color="D9D9D9"/>
+              <ns0:right ns0:val="single" ns0:sz="4" ns0:color="D9D9D9"/>
+            </ns0:tcBorders>
+            <ns0:tcMar>
+              <ns0:top ns0:w="85" ns0:type="dxa"/>
+              <ns0:left ns0:w="85" ns0:type="dxa"/>
+              <ns0:bottom ns0:w="85" ns0:type="dxa"/>
+              <ns0:right ns0:w="85" ns0:type="dxa"/>
+            </ns0:tcMar>
+            <ns0:shd ns0:fill="E8EEF4"/>
+          </ns0:tcPr>
+          <ns0:p>
+            <ns0:pPr>
+              <ns0:spacing ns0:after="60"/>
+            </ns0:pPr>
+            <ns0:r>
+              <ns0:rPr>
+                <ns0:b/>
+                <ns0:sz ns0:val="18"/>
+              </ns0:rPr>
+              <ns0:t>รายละเอียดและเงื่อนไข</ns0:t>
+            </ns0:r>
+          </ns0:p>
+        </ns0:tc>
+      </ns0:tr>
+      <ns0:tr>
+        <ns0:trPr>
+          <ns0:cantSplit/>
+        </ns0:trPr>
+        <ns0:tc>
+          <ns0:tcPr>
+            <ns0:tcW ns0:type="dxa" ns0:w="2509"/>
+            <ns0:tcBorders>
+              <ns0:top ns0:val="single" ns0:sz="4" ns0:color="D9D9D9"/>
+              <ns0:left ns0:val="single" ns0:sz="4" ns0:color="D9D9D9"/>
+              <ns0:bottom ns0:val="single" ns0:sz="4" ns0:color="D9D9D9"/>
+              <ns0:right ns0:val="single" ns0:sz="4" ns0:color="D9D9D9"/>
+            </ns0:tcBorders>
+            <ns0:tcMar>
+              <ns0:top ns0:w="85" ns0:type="dxa"/>
+              <ns0:left ns0:w="85" ns0:type="dxa"/>
+              <ns0:bottom ns0:w="85" ns0:type="dxa"/>
+              <ns0:right ns0:w="85" ns0:type="dxa"/>
+            </ns0:tcMar>
+          </ns0:tcPr>
+          <ns0:p>
+            <ns0:pPr>
+              <ns0:spacing ns0:after="60"/>
+            </ns0:pPr>
+            <ns0:r>
+              <ns0:rPr>
+                <ns0:b ns0:val="0"/>
+                <ns0:sz ns0:val="18"/>
+              </ns0:rPr>
+              <ns0:t>id</ns0:t>
+            </ns0:r>
+          </ns0:p>
+        </ns0:tc>
+        <ns0:tc>
+          <ns0:tcPr>
+            <ns0:tcW ns0:type="dxa" ns0:w="2509"/>
+            <ns0:tcBorders>
+              <ns0:top ns0:val="single" ns0:sz="4" ns0:color="D9D9D9"/>
+              <ns0:left ns0:val="single" ns0:sz="4" ns0:color="D9D9D9"/>
+              <ns0:bottom ns0:val="single" ns0:sz="4" ns0:color="D9D9D9"/>
+              <ns0:right ns0:val="single" ns0:sz="4" ns0:color="D9D9D9"/>
+            </ns0:tcBorders>
+            <ns0:tcMar>
+              <ns0:top ns0:w="85" ns0:type="dxa"/>
+              <ns0:left ns0:w="85" ns0:type="dxa"/>
+              <ns0:bottom ns0:w="85" ns0:type="dxa"/>
+              <ns0:right ns0:w="85" ns0:type="dxa"/>
+            </ns0:tcMar>
+          </ns0:tcPr>
+          <ns0:p>
+            <ns0:pPr>
+              <ns0:spacing ns0:after="60"/>
+            </ns0:pPr>
+            <ns0:r>
+              <ns0:rPr>
+                <ns0:b ns0:val="0"/>
+                <ns0:sz ns0:val="18"/>
+              </ns0:rPr>
+              <ns0:t>INT IDENTITY</ns0:t>
+            </ns0:r>
+          </ns0:p>
+        </ns0:tc>
+        <ns0:tc>
+          <ns0:tcPr>
+            <ns0:tcW ns0:type="dxa" ns0:w="2509"/>
+            <ns0:tcBorders>
+              <ns0:top ns0:val="single" ns0:sz="4" ns0:color="D9D9D9"/>
+              <ns0:left ns0:val="single" ns0:sz="4" ns0:color="D9D9D9"/>
+              <ns0:bottom ns0:val="single" ns0:sz="4" ns0:color="D9D9D9"/>
+              <ns0:right ns0:val="single" ns0:sz="4" ns0:color="D9D9D9"/>
+            </ns0:tcBorders>
+            <ns0:tcMar>
+              <ns0:top ns0:w="85" ns0:type="dxa"/>
+              <ns0:left ns0:w="85" ns0:type="dxa"/>
+              <ns0:bottom ns0:w="85" ns0:type="dxa"/>
+              <ns0:right ns0:w="85" ns0:type="dxa"/>
+            </ns0:tcMar>
+          </ns0:tcPr>
+          <ns0:p>
+            <ns0:pPr>
+              <ns0:spacing ns0:after="60"/>
+            </ns0:pPr>
+            <ns0:r>
+              <ns0:rPr>
+                <ns0:b ns0:val="0"/>
+                <ns0:sz ns0:val="18"/>
+              </ns0:rPr>
+              <ns0:t>ไม่ได้</ns0:t>
+            </ns0:r>
+          </ns0:p>
+        </ns0:tc>
+        <ns0:tc>
+          <ns0:tcPr>
+            <ns0:tcW ns0:type="dxa" ns0:w="2509"/>
+            <ns0:tcBorders>
+              <ns0:top ns0:val="single" ns0:sz="4" ns0:color="D9D9D9"/>
+              <ns0:left ns0:val="single" ns0:sz="4" ns0:color="D9D9D9"/>
+              <ns0:bottom ns0:val="single" ns0:sz="4" ns0:color="D9D9D9"/>
+              <ns0:right ns0:val="single" ns0:sz="4" ns0:color="D9D9D9"/>
+            </ns0:tcBorders>
+            <ns0:tcMar>
+              <ns0:top ns0:w="85" ns0:type="dxa"/>
+              <ns0:left ns0:w="85" ns0:type="dxa"/>
+              <ns0:bottom ns0:w="85" ns0:type="dxa"/>
+              <ns0:right ns0:w="85" ns0:type="dxa"/>
+            </ns0:tcMar>
+          </ns0:tcPr>
+          <ns0:p>
+            <ns0:pPr>
+              <ns0:spacing ns0:after="60"/>
+            </ns0:pPr>
+            <ns0:r>
+              <ns0:rPr>
+                <ns0:b ns0:val="0"/>
+                <ns0:sz ns0:val="18"/>
+              </ns0:rPr>
+              <ns0:t>Primary Key เพิ่มอัตโนมัติ</ns0:t>
+            </ns0:r>
+          </ns0:p>
+        </ns0:tc>
+      </ns0:tr>
+      <ns0:tr>
+        <ns0:trPr>
+          <ns0:cantSplit/>
+        </ns0:trPr>
+        <ns0:tc>
+          <ns0:tcPr>
+            <ns0:tcW ns0:type="dxa" ns0:w="2509"/>
+            <ns0:tcBorders>
+              <ns0:top ns0:val="single" ns0:sz="4" ns0:color="D9D9D9"/>
+              <ns0:left ns0:val="single" ns0:sz="4" ns0:color="D9D9D9"/>
+              <ns0:bottom ns0:val="single" ns0:sz="4" ns0:color="D9D9D9"/>
+              <ns0:right ns0:val="single" ns0:sz="4" ns0:color="D9D9D9"/>
+            </ns0:tcBorders>
+            <ns0:tcMar>
+              <ns0:top ns0:w="85" ns0:type="dxa"/>
+              <ns0:left ns0:w="85" ns0:type="dxa"/>
+              <ns0:bottom ns0:w="85" ns0:type="dxa"/>
+              <ns0:right ns0:w="85" ns0:type="dxa"/>
+            </ns0:tcMar>
+          </ns0:tcPr>
+          <ns0:p>
+            <ns0:pPr>
+              <ns0:spacing ns0:after="60"/>
+            </ns0:pPr>
+            <ns0:r>
+              <ns0:rPr>
+                <ns0:b ns0:val="0"/>
+                <ns0:sz ns0:val="18"/>
+              </ns0:rPr>
+              <ns0:t>username</ns0:t>
+            </ns0:r>
+          </ns0:p>
+        </ns0:tc>
+        <ns0:tc>
+          <ns0:tcPr>
+            <ns0:tcW ns0:type="dxa" ns0:w="2509"/>
+            <ns0:tcBorders>
+              <ns0:top ns0:val="single" ns0:sz="4" ns0:color="D9D9D9"/>
+              <ns0:left ns0:val="single" ns0:sz="4" ns0:color="D9D9D9"/>
+              <ns0:bottom ns0:val="single" ns0:sz="4" ns0:color="D9D9D9"/>
+              <ns0:right ns0:val="single" ns0:sz="4" ns0:color="D9D9D9"/>
+            </ns0:tcBorders>
+            <ns0:tcMar>
+              <ns0:top ns0:w="85" ns0:type="dxa"/>
+              <ns0:left ns0:w="85" ns0:type="dxa"/>
+              <ns0:bottom ns0:w="85" ns0:type="dxa"/>
+              <ns0:right ns0:w="85" ns0:type="dxa"/>
+            </ns0:tcMar>
+          </ns0:tcPr>
+          <ns0:p>
+            <ns0:pPr>
+              <ns0:spacing ns0:after="60"/>
+            </ns0:pPr>
+            <ns0:r>
+              <ns0:rPr>
+                <ns0:b ns0:val="0"/>
+                <ns0:sz ns0:val="18"/>
+              </ns0:rPr>
+              <ns0:t>VARCHAR(50)</ns0:t>
+            </ns0:r>
+          </ns0:p>
+        </ns0:tc>
+        <ns0:tc>
+          <ns0:tcPr>
+            <ns0:tcW ns0:type="dxa" ns0:w="2509"/>
+            <ns0:tcBorders>
+              <ns0:top ns0:val="single" ns0:sz="4" ns0:color="D9D9D9"/>
+              <ns0:left ns0:val="single" ns0:sz="4" ns0:color="D9D9D9"/>
+              <ns0:bottom ns0:val="single" ns0:sz="4" ns0:color="D9D9D9"/>
+              <ns0:right ns0:val="single" ns0:sz="4" ns0:color="D9D9D9"/>
+            </ns0:tcBorders>
+            <ns0:tcMar>
+              <ns0:top ns0:w="85" ns0:type="dxa"/>
+              <ns0:left ns0:w="85" ns0:type="dxa"/>
+              <ns0:bottom ns0:w="85" ns0:type="dxa"/>
+              <ns0:right ns0:w="85" ns0:type="dxa"/>
+            </ns0:tcMar>
+          </ns0:tcPr>
+          <ns0:p>
+            <ns0:pPr>
+              <ns0:spacing ns0:after="60"/>
+            </ns0:pPr>
+            <ns0:r>
+              <ns0:rPr>
+                <ns0:b ns0:val="0"/>
+                <ns0:sz ns0:val="18"/>
+              </ns0:rPr>
+              <ns0:t>ไม่ได้</ns0:t>
+            </ns0:r>
+          </ns0:p>
+        </ns0:tc>
+        <ns0:tc>
+          <ns0:tcPr>
+            <ns0:tcW ns0:type="dxa" ns0:w="2509"/>
+            <ns0:tcBorders>
+              <ns0:top ns0:val="single" ns0:sz="4" ns0:color="D9D9D9"/>
+              <ns0:left ns0:val="single" ns0:sz="4" ns0:color="D9D9D9"/>
+              <ns0:bottom ns0:val="single" ns0:sz="4" ns0:color="D9D9D9"/>
+              <ns0:right ns0:val="single" ns0:sz="4" ns0:color="D9D9D9"/>
+            </ns0:tcBorders>
+            <ns0:tcMar>
+              <ns0:top ns0:w="85" ns0:type="dxa"/>
+              <ns0:left ns0:w="85" ns0:type="dxa"/>
+              <ns0:bottom ns0:w="85" ns0:type="dxa"/>
+              <ns0:right ns0:w="85" ns0:type="dxa"/>
+            </ns0:tcMar>
+          </ns0:tcPr>
+          <ns0:p>
+            <ns0:pPr>
+              <ns0:spacing ns0:after="60"/>
+            </ns0:pPr>
+            <ns0:r>
+              <ns0:rPr>
+                <ns0:b ns0:val="0"/>
+                <ns0:sz ns0:val="18"/>
+              </ns0:rPr>
+              <ns0:t>บัญชี TU ที่ผ่านการยืนยัน ต้องไม่ว่างและไม่ซ้ำ</ns0:t>
+            </ns0:r>
+          </ns0:p>
+        </ns0:tc>
+      </ns0:tr>
+      <ns0:tr>
+        <ns0:trPr>
+          <ns0:cantSplit/>
+        </ns0:trPr>
+        <ns0:tc>
+          <ns0:tcPr>
+            <ns0:tcW ns0:type="dxa" ns0:w="2509"/>
+            <ns0:tcBorders>
+              <ns0:top ns0:val="single" ns0:sz="4" ns0:color="D9D9D9"/>
+              <ns0:left ns0:val="single" ns0:sz="4" ns0:color="D9D9D9"/>
+              <ns0:bottom ns0:val="single" ns0:sz="4" ns0:color="D9D9D9"/>
+              <ns0:right ns0:val="single" ns0:sz="4" ns0:color="D9D9D9"/>
+            </ns0:tcBorders>
+            <ns0:tcMar>
+              <ns0:top ns0:w="85" ns0:type="dxa"/>
+              <ns0:left ns0:w="85" ns0:type="dxa"/>
+              <ns0:bottom ns0:w="85" ns0:type="dxa"/>
+              <ns0:right ns0:w="85" ns0:type="dxa"/>
+            </ns0:tcMar>
+          </ns0:tcPr>
+          <ns0:p>
+            <ns0:pPr>
+              <ns0:spacing ns0:after="60"/>
+            </ns0:pPr>
+            <ns0:r>
+              <ns0:rPr>
+                <ns0:b ns0:val="0"/>
+                <ns0:sz ns0:val="18"/>
+              </ns0:rPr>
+              <ns0:t>displayname_th</ns0:t>
+            </ns0:r>
+          </ns0:p>
+        </ns0:tc>
+        <ns0:tc>
+          <ns0:tcPr>
+            <ns0:tcW ns0:type="dxa" ns0:w="2509"/>
+            <ns0:tcBorders>
+              <ns0:top ns0:val="single" ns0:sz="4" ns0:color="D9D9D9"/>
+              <ns0:left ns0:val="single" ns0:sz="4" ns0:color="D9D9D9"/>
+              <ns0:bottom ns0:val="single" ns0:sz="4" ns0:color="D9D9D9"/>
+              <ns0:right ns0:val="single" ns0:sz="4" ns0:color="D9D9D9"/>
+            </ns0:tcBorders>
+            <ns0:tcMar>
+              <ns0:top ns0:w="85" ns0:type="dxa"/>
+              <ns0:left ns0:w="85" ns0:type="dxa"/>
+              <ns0:bottom ns0:w="85" ns0:type="dxa"/>
+              <ns0:right ns0:w="85" ns0:type="dxa"/>
+            </ns0:tcMar>
+          </ns0:tcPr>
+          <ns0:p>
+            <ns0:pPr>
+              <ns0:spacing ns0:after="60"/>
+            </ns0:pPr>
+            <ns0:r>
+              <ns0:rPr>
+                <ns0:b ns0:val="0"/>
+                <ns0:sz ns0:val="18"/>
+              </ns0:rPr>
+              <ns0:t>NVARCHAR(255)</ns0:t>
+            </ns0:r>
+          </ns0:p>
+        </ns0:tc>
+        <ns0:tc>
+          <ns0:tcPr>
+            <ns0:tcW ns0:type="dxa" ns0:w="2509"/>
+            <ns0:tcBorders>
+              <ns0:top ns0:val="single" ns0:sz="4" ns0:color="D9D9D9"/>
+              <ns0:left ns0:val="single" ns0:sz="4" ns0:color="D9D9D9"/>
+              <ns0:bottom ns0:val="single" ns0:sz="4" ns0:color="D9D9D9"/>
+              <ns0:right ns0:val="single" ns0:sz="4" ns0:color="D9D9D9"/>
+            </ns0:tcBorders>
+            <ns0:tcMar>
+              <ns0:top ns0:w="85" ns0:type="dxa"/>
+              <ns0:left ns0:w="85" ns0:type="dxa"/>
+              <ns0:bottom ns0:w="85" ns0:type="dxa"/>
+              <ns0:right ns0:w="85" ns0:type="dxa"/>
+            </ns0:tcMar>
+          </ns0:tcPr>
+          <ns0:p>
+            <ns0:pPr>
+              <ns0:spacing ns0:after="60"/>
+            </ns0:pPr>
+            <ns0:r>
+              <ns0:rPr>
+                <ns0:b ns0:val="0"/>
+                <ns0:sz ns0:val="18"/>
+              </ns0:rPr>
+              <ns0:t>ได้</ns0:t>
+            </ns0:r>
+          </ns0:p>
+        </ns0:tc>
+        <ns0:tc>
+          <ns0:tcPr>
+            <ns0:tcW ns0:type="dxa" ns0:w="2509"/>
+            <ns0:tcBorders>
+              <ns0:top ns0:val="single" ns0:sz="4" ns0:color="D9D9D9"/>
+              <ns0:left ns0:val="single" ns0:sz="4" ns0:color="D9D9D9"/>
+              <ns0:bottom ns0:val="single" ns0:sz="4" ns0:color="D9D9D9"/>
+              <ns0:right ns0:val="single" ns0:sz="4" ns0:color="D9D9D9"/>
+            </ns0:tcBorders>
+            <ns0:tcMar>
+              <ns0:top ns0:w="85" ns0:type="dxa"/>
+              <ns0:left ns0:w="85" ns0:type="dxa"/>
+              <ns0:bottom ns0:w="85" ns0:type="dxa"/>
+              <ns0:right ns0:w="85" ns0:type="dxa"/>
+            </ns0:tcMar>
+          </ns0:tcPr>
+          <ns0:p>
+            <ns0:pPr>
+              <ns0:spacing ns0:after="60"/>
+            </ns0:pPr>
+            <ns0:r>
+              <ns0:rPr>
+                <ns0:b ns0:val="0"/>
+                <ns0:sz ns0:val="18"/>
+              </ns0:rPr>
+              <ns0:t>ชื่อภาษาไทยที่ UserDAO รับได้ (Login ปัจจุบันไม่ได้ส่งแยก)</ns0:t>
+            </ns0:r>
+          </ns0:p>
+        </ns0:tc>
+      </ns0:tr>
+      <ns0:tr>
+        <ns0:trPr>
+          <ns0:cantSplit/>
+        </ns0:trPr>
+        <ns0:tc>
+          <ns0:tcPr>
+            <ns0:tcW ns0:type="dxa" ns0:w="2509"/>
+            <ns0:tcBorders>
+              <ns0:top ns0:val="single" ns0:sz="4" ns0:color="D9D9D9"/>
+              <ns0:left ns0:val="single" ns0:sz="4" ns0:color="D9D9D9"/>
+              <ns0:bottom ns0:val="single" ns0:sz="4" ns0:color="D9D9D9"/>
+              <ns0:right ns0:val="single" ns0:sz="4" ns0:color="D9D9D9"/>
+            </ns0:tcBorders>
+            <ns0:tcMar>
+              <ns0:top ns0:w="85" ns0:type="dxa"/>
+              <ns0:left ns0:w="85" ns0:type="dxa"/>
+              <ns0:bottom ns0:w="85" ns0:type="dxa"/>
+              <ns0:right ns0:w="85" ns0:type="dxa"/>
+            </ns0:tcMar>
+          </ns0:tcPr>
+          <ns0:p>
+            <ns0:pPr>
+              <ns0:spacing ns0:after="60"/>
+            </ns0:pPr>
+            <ns0:r>
+              <ns0:rPr>
+                <ns0:b ns0:val="0"/>
+                <ns0:sz ns0:val="18"/>
+              </ns0:rPr>
+              <ns0:t>displayname_en</ns0:t>
+            </ns0:r>
+          </ns0:p>
+        </ns0:tc>
+        <ns0:tc>
+          <ns0:tcPr>
+            <ns0:tcW ns0:type="dxa" ns0:w="2509"/>
+            <ns0:tcBorders>
+              <ns0:top ns0:val="single" ns0:sz="4" ns0:color="D9D9D9"/>
+              <ns0:left ns0:val="single" ns0:sz="4" ns0:color="D9D9D9"/>
+              <ns0:bottom ns0:val="single" ns0:sz="4" ns0:color="D9D9D9"/>
+              <ns0:right ns0:val="single" ns0:sz="4" ns0:color="D9D9D9"/>
+            </ns0:tcBorders>
+            <ns0:tcMar>
+              <ns0:top ns0:w="85" ns0:type="dxa"/>
+              <ns0:left ns0:w="85" ns0:type="dxa"/>
+              <ns0:bottom ns0:w="85" ns0:type="dxa"/>
+              <ns0:right ns0:w="85" ns0:type="dxa"/>
+            </ns0:tcMar>
+          </ns0:tcPr>
+          <ns0:p>
+            <ns0:pPr>
+              <ns0:spacing ns0:after="60"/>
+            </ns0:pPr>
+            <ns0:r>
+              <ns0:rPr>
+                <ns0:b ns0:val="0"/>
+                <ns0:sz ns0:val="18"/>
+              </ns0:rPr>
+              <ns0:t>NVARCHAR(255)</ns0:t>
+            </ns0:r>
+          </ns0:p>
+        </ns0:tc>
+        <ns0:tc>
+          <ns0:tcPr>
+            <ns0:tcW ns0:type="dxa" ns0:w="2509"/>
+            <ns0:tcBorders>
+              <ns0:top ns0:val="single" ns0:sz="4" ns0:color="D9D9D9"/>
+              <ns0:left ns0:val="single" ns0:sz="4" ns0:color="D9D9D9"/>
+              <ns0:bottom ns0:val="single" ns0:sz="4" ns0:color="D9D9D9"/>
+              <ns0:right ns0:val="single" ns0:sz="4" ns0:color="D9D9D9"/>
+            </ns0:tcBorders>
+            <ns0:tcMar>
+              <ns0:top ns0:w="85" ns0:type="dxa"/>
+              <ns0:left ns0:w="85" ns0:type="dxa"/>
+              <ns0:bottom ns0:w="85" ns0:type="dxa"/>
+              <ns0:right ns0:w="85" ns0:type="dxa"/>
+            </ns0:tcMar>
+          </ns0:tcPr>
+          <ns0:p>
+            <ns0:pPr>
+              <ns0:spacing ns0:after="60"/>
+            </ns0:pPr>
+            <ns0:r>
+              <ns0:rPr>
+                <ns0:b ns0:val="0"/>
+                <ns0:sz ns0:val="18"/>
+              </ns0:rPr>
+              <ns0:t>ได้</ns0:t>
+            </ns0:r>
+          </ns0:p>
+        </ns0:tc>
+        <ns0:tc>
+          <ns0:tcPr>
+            <ns0:tcW ns0:type="dxa" ns0:w="2509"/>
+            <ns0:tcBorders>
+              <ns0:top ns0:val="single" ns0:sz="4" ns0:color="D9D9D9"/>
+              <ns0:left ns0:val="single" ns0:sz="4" ns0:color="D9D9D9"/>
+              <ns0:bottom ns0:val="single" ns0:sz="4" ns0:color="D9D9D9"/>
+              <ns0:right ns0:val="single" ns0:sz="4" ns0:color="D9D9D9"/>
+            </ns0:tcBorders>
+            <ns0:tcMar>
+              <ns0:top ns0:w="85" ns0:type="dxa"/>
+              <ns0:left ns0:w="85" ns0:type="dxa"/>
+              <ns0:bottom ns0:w="85" ns0:type="dxa"/>
+              <ns0:right ns0:w="85" ns0:type="dxa"/>
+            </ns0:tcMar>
+          </ns0:tcPr>
+          <ns0:p>
+            <ns0:pPr>
+              <ns0:spacing ns0:after="60"/>
+            </ns0:pPr>
+            <ns0:r>
+              <ns0:rPr>
+                <ns0:b ns0:val="0"/>
+                <ns0:sz ns0:val="18"/>
+              </ns0:rPr>
+              <ns0:t>ชื่อที่ Login ส่งจาก TUAccount.display_name หรือชื่ออังกฤษที่ DAO รับโดยตรง</ns0:t>
+            </ns0:r>
+          </ns0:p>
+        </ns0:tc>
+      </ns0:tr>
+    </ns0:tbl>
+    <ns0:p/>
+    <ns0:p>
+      <ns0:r>
+        <ns0:t>ความยาว 50 และ 255 เป็นค่าที่ใช้ใน Entity ปัจจุบัน ไม่ใช่ขีดจำกัดที่เอกสาร TU API ระบุ</ns0:t>
+      </ns0:r>
+    </ns0:p>
+    <ns0:p>
+      <ns0:r>
+        <ns0:t>ความหมายของคีย์:</ns0:t>
+      </ns0:r>
+    </ns0:p>
+    <ns0:p>
+      <ns0:r>
+        <ns0:t>- PK หรือ Primary Key ใช้ระบุแต่ละแถว โดย users.id ห้ามซ้ำและห้ามว่าง</ns0:t>
+      </ns0:r>
+    </ns0:p>
+    <ns0:p>
+      <ns0:r>
+        <ns0:t>- UK หรือ Unique Key กำหนดให้ users.username ห้ามซ้ำ เพื่อป้องกันบัญชี TU เดียวกันมี User หลายแถว</ns0:t>
+      </ns0:r>
+    </ns0:p>
+    <ns0:p>
+      <ns0:r>
+        <ns0:t>- FK หรือ Foreign Key ใช้เชื่อมข้อมูล เช่น guides.publisher_id อ้างถึง users.id</ns0:t>
+      </ns0:r>
+    </ns0:p>
+    <ns0:p>
+      <ns0:r>
+        <ns0:t>username เก็บเป็นข้อความเพื่อรักษารหัสบัญชีตามที่ API ส่งมา รวมถึงเลขศูนย์นำหน้า โดยตัดช่องว่างหัวท้ายก่อนค้นหาหรือบันทึก</ns0:t>
+      </ns0:r>
+    </ns0:p>
+    <ns0:p>
+      <ns0:r>
+        <ns0:t>ฟิลด์ชื่อที่ไม่มีค่า หรือมีเฉพาะช่องว่าง เก็บเป็น NULL</ns0:t>
+      </ns0:r>
+    </ns0:p>
+    <ns0:p>
+      <ns0:r>
+        <ns0:t>ตาราง User ไม่มีคอลัมน์รหัสผ่าน TU หรือ Application-Key</ns0:t>
+      </ns0:r>
+    </ns0:p>
+    <ns0:p>
+      <ns0:pPr>
+        <ns0:pStyle ns0:val="Heading1"/>
+      </ns0:pPr>
+      <ns0:r>
+        <ns0:t>3. การใช้ข้อมูลจาก TU API</ns0:t>
+      </ns0:r>
+    </ns0:p>
+    <ns0:p>
+      <ns0:r>
+        <ns0:t>ข้อมูล User มาจากผลตอบกลับ TU API ที่ขั้นตอน Login ตรวจสอบแล้ว</ns0:t>
+      </ns0:r>
+    </ns0:p>
+    <ns0:tbl>
+      <ns0:tblPr>
+        <ns0:tblW ns0:type="auto" ns0:w="0"/>
+        <ns0:tblLayout ns0:type="autofit"/>
+        <ns0:tblLook ns0:firstColumn="1" ns0:firstRow="1" ns0:lastColumn="0" ns0:lastRow="0" ns0:noHBand="0" ns0:noVBand="1" ns0:val="04A0"/>
+      </ns0:tblPr>
+      <ns0:tblGrid>
+        <ns0:gridCol ns0:w="5018"/>
+        <ns0:gridCol ns0:w="5018"/>
+      </ns0:tblGrid>
+      <ns0:tr>
+        <ns0:trPr>
+          <ns0:cantSplit/>
+          <ns0:tblHeader/>
+        </ns0:trPr>
+        <ns0:tc>
+          <ns0:tcPr>
+            <ns0:tcW ns0:type="dxa" ns0:w="5018"/>
+            <ns0:tcBorders>
+              <ns0:top ns0:val="single" ns0:sz="4" ns0:color="D9D9D9"/>
+              <ns0:left ns0:val="single" ns0:sz="4" ns0:color="D9D9D9"/>
+              <ns0:bottom ns0:val="single" ns0:sz="4" ns0:color="D9D9D9"/>
+              <ns0:right ns0:val="single" ns0:sz="4" ns0:color="D9D9D9"/>
+            </ns0:tcBorders>
+            <ns0:tcMar>
+              <ns0:top ns0:w="85" ns0:type="dxa"/>
+              <ns0:left ns0:w="85" ns0:type="dxa"/>
+              <ns0:bottom ns0:w="85" ns0:type="dxa"/>
+              <ns0:right ns0:w="85" ns0:type="dxa"/>
+            </ns0:tcMar>
+            <ns0:shd ns0:fill="E8EEF4"/>
+          </ns0:tcPr>
+          <ns0:p>
+            <ns0:pPr>
+              <ns0:spacing ns0:after="60"/>
+            </ns0:pPr>
+            <ns0:r>
+              <ns0:rPr>
+                <ns0:b/>
+                <ns0:sz ns0:val="18"/>
+              </ns0:rPr>
+              <ns0:t>ข้อมูลที่ adapter ใช้</ns0:t>
+            </ns0:r>
+          </ns0:p>
+        </ns0:tc>
+        <ns0:tc>
+          <ns0:tcPr>
+            <ns0:tcW ns0:type="dxa" ns0:w="5018"/>
+            <ns0:tcBorders>
+              <ns0:top ns0:val="single" ns0:sz="4" ns0:color="D9D9D9"/>
+              <ns0:left ns0:val="single" ns0:sz="4" ns0:color="D9D9D9"/>
+              <ns0:bottom ns0:val="single" ns0:sz="4" ns0:color="D9D9D9"/>
+              <ns0:right ns0:val="single" ns0:sz="4" ns0:color="D9D9D9"/>
+            </ns0:tcBorders>
+            <ns0:tcMar>
+              <ns0:top ns0:w="85" ns0:type="dxa"/>
+              <ns0:left ns0:w="85" ns0:type="dxa"/>
+              <ns0:bottom ns0:w="85" ns0:type="dxa"/>
+              <ns0:right ns0:w="85" ns0:type="dxa"/>
+            </ns0:tcMar>
+            <ns0:shd ns0:fill="E8EEF4"/>
+          </ns0:tcPr>
+          <ns0:p>
+            <ns0:pPr>
+              <ns0:spacing ns0:after="60"/>
+            </ns0:pPr>
+            <ns0:r>
+              <ns0:rPr>
+                <ns0:b/>
+                <ns0:sz ns0:val="18"/>
+              </ns0:rPr>
+              <ns0:t>การใช้ในระบบ</ns0:t>
+            </ns0:r>
+          </ns0:p>
+        </ns0:tc>
+      </ns0:tr>
+      <ns0:tr>
+        <ns0:trPr>
+          <ns0:cantSplit/>
+        </ns0:trPr>
+        <ns0:tc>
+          <ns0:tcPr>
+            <ns0:tcW ns0:type="dxa" ns0:w="5018"/>
+            <ns0:tcBorders>
+              <ns0:top ns0:val="single" ns0:sz="4" ns0:color="D9D9D9"/>
+              <ns0:left ns0:val="single" ns0:sz="4" ns0:color="D9D9D9"/>
+              <ns0:bottom ns0:val="single" ns0:sz="4" ns0:color="D9D9D9"/>
+              <ns0:right ns0:val="single" ns0:sz="4" ns0:color="D9D9D9"/>
+            </ns0:tcBorders>
+            <ns0:tcMar>
+              <ns0:top ns0:w="85" ns0:type="dxa"/>
+              <ns0:left ns0:w="85" ns0:type="dxa"/>
+              <ns0:bottom ns0:w="85" ns0:type="dxa"/>
+              <ns0:right ns0:w="85" ns0:type="dxa"/>
+            </ns0:tcMar>
+          </ns0:tcPr>
+          <ns0:p>
+            <ns0:pPr>
+              <ns0:spacing ns0:after="60"/>
+            </ns0:pPr>
+            <ns0:r>
+              <ns0:rPr>
+                <ns0:b ns0:val="0"/>
+                <ns0:sz ns0:val="18"/>
+              </ns0:rPr>
+              <ns0:t>username ที่ผู้ใช้ส่ง</ns0:t>
+            </ns0:r>
+          </ns0:p>
+        </ns0:tc>
+        <ns0:tc>
+          <ns0:tcPr>
+            <ns0:tcW ns0:type="dxa" ns0:w="5018"/>
+            <ns0:tcBorders>
+              <ns0:top ns0:val="single" ns0:sz="4" ns0:color="D9D9D9"/>
+              <ns0:left ns0:val="single" ns0:sz="4" ns0:color="D9D9D9"/>
+              <ns0:bottom ns0:val="single" ns0:sz="4" ns0:color="D9D9D9"/>
+              <ns0:right ns0:val="single" ns0:sz="4" ns0:color="D9D9D9"/>
+            </ns0:tcBorders>
+            <ns0:tcMar>
+              <ns0:top ns0:w="85" ns0:type="dxa"/>
+              <ns0:left ns0:w="85" ns0:type="dxa"/>
+              <ns0:bottom ns0:w="85" ns0:type="dxa"/>
+              <ns0:right ns0:w="85" ns0:type="dxa"/>
+            </ns0:tcMar>
+          </ns0:tcPr>
+          <ns0:p>
+            <ns0:pPr>
+              <ns0:spacing ns0:after="60"/>
+            </ns0:pPr>
+            <ns0:r>
+              <ns0:rPr>
+                <ns0:b ns0:val="0"/>
+                <ns0:sz ns0:val="18"/>
+              </ns0:rPr>
+              <ns0:t>ตัดช่องว่างหัวท้าย แล้วใช้เป็น TUAccount.username หลังยืนยันสำเร็จ ไม่ได้อ่าน username จาก response</ns0:t>
+            </ns0:r>
+          </ns0:p>
+        </ns0:tc>
+      </ns0:tr>
+      <ns0:tr>
+        <ns0:trPr>
+          <ns0:cantSplit/>
+        </ns0:trPr>
+        <ns0:tc>
+          <ns0:tcPr>
+            <ns0:tcW ns0:type="dxa" ns0:w="5018"/>
+            <ns0:tcBorders>
+              <ns0:top ns0:val="single" ns0:sz="4" ns0:color="D9D9D9"/>
+              <ns0:left ns0:val="single" ns0:sz="4" ns0:color="D9D9D9"/>
+              <ns0:bottom ns0:val="single" ns0:sz="4" ns0:color="D9D9D9"/>
+              <ns0:right ns0:val="single" ns0:sz="4" ns0:color="D9D9D9"/>
+            </ns0:tcBorders>
+            <ns0:tcMar>
+              <ns0:top ns0:w="85" ns0:type="dxa"/>
+              <ns0:left ns0:w="85" ns0:type="dxa"/>
+              <ns0:bottom ns0:w="85" ns0:type="dxa"/>
+              <ns0:right ns0:w="85" ns0:type="dxa"/>
+            </ns0:tcMar>
+          </ns0:tcPr>
+          <ns0:p>
+            <ns0:pPr>
+              <ns0:spacing ns0:after="60"/>
+            </ns0:pPr>
+            <ns0:r>
+              <ns0:rPr>
+                <ns0:b ns0:val="0"/>
+                <ns0:sz ns0:val="18"/>
+              </ns0:rPr>
+              <ns0:t>status, type</ns0:t>
+            </ns0:r>
+          </ns0:p>
+        </ns0:tc>
+        <ns0:tc>
+          <ns0:tcPr>
+            <ns0:tcW ns0:type="dxa" ns0:w="5018"/>
+            <ns0:tcBorders>
+              <ns0:top ns0:val="single" ns0:sz="4" ns0:color="D9D9D9"/>
+              <ns0:left ns0:val="single" ns0:sz="4" ns0:color="D9D9D9"/>
+              <ns0:bottom ns0:val="single" ns0:sz="4" ns0:color="D9D9D9"/>
+              <ns0:right ns0:val="single" ns0:sz="4" ns0:color="D9D9D9"/>
+            </ns0:tcBorders>
+            <ns0:tcMar>
+              <ns0:top ns0:w="85" ns0:type="dxa"/>
+              <ns0:left ns0:w="85" ns0:type="dxa"/>
+              <ns0:bottom ns0:w="85" ns0:type="dxa"/>
+              <ns0:right ns0:w="85" ns0:type="dxa"/>
+            </ns0:tcMar>
+          </ns0:tcPr>
+          <ns0:p>
+            <ns0:pPr>
+              <ns0:spacing ns0:after="60"/>
+            </ns0:pPr>
+            <ns0:r>
+              <ns0:rPr>
+                <ns0:b ns0:val="0"/>
+                <ns0:sz ns0:val="18"/>
+              </ns0:rPr>
+              <ns0:t>ยอมรับเฉพาะ status เป็น true และ type เป็น student</ns0:t>
+            </ns0:r>
+          </ns0:p>
+        </ns0:tc>
+      </ns0:tr>
+      <ns0:tr>
+        <ns0:trPr>
+          <ns0:cantSplit/>
+        </ns0:trPr>
+        <ns0:tc>
+          <ns0:tcPr>
+            <ns0:tcW ns0:type="dxa" ns0:w="5018"/>
+            <ns0:tcBorders>
+              <ns0:top ns0:val="single" ns0:sz="4" ns0:color="D9D9D9"/>
+              <ns0:left ns0:val="single" ns0:sz="4" ns0:color="D9D9D9"/>
+              <ns0:bottom ns0:val="single" ns0:sz="4" ns0:color="D9D9D9"/>
+              <ns0:right ns0:val="single" ns0:sz="4" ns0:color="D9D9D9"/>
+            </ns0:tcBorders>
+            <ns0:tcMar>
+              <ns0:top ns0:w="85" ns0:type="dxa"/>
+              <ns0:left ns0:w="85" ns0:type="dxa"/>
+              <ns0:bottom ns0:w="85" ns0:type="dxa"/>
+              <ns0:right ns0:w="85" ns0:type="dxa"/>
+            </ns0:tcMar>
+          </ns0:tcPr>
+          <ns0:p>
+            <ns0:pPr>
+              <ns0:spacing ns0:after="60"/>
+            </ns0:pPr>
+            <ns0:r>
+              <ns0:rPr>
+                <ns0:b ns0:val="0"/>
+                <ns0:sz ns0:val="18"/>
+              </ns0:rPr>
+              <ns0:t>displayname_th, displayname_en</ns0:t>
+            </ns0:r>
+          </ns0:p>
+        </ns0:tc>
+        <ns0:tc>
+          <ns0:tcPr>
+            <ns0:tcW ns0:type="dxa" ns0:w="5018"/>
+            <ns0:tcBorders>
+              <ns0:top ns0:val="single" ns0:sz="4" ns0:color="D9D9D9"/>
+              <ns0:left ns0:val="single" ns0:sz="4" ns0:color="D9D9D9"/>
+              <ns0:bottom ns0:val="single" ns0:sz="4" ns0:color="D9D9D9"/>
+              <ns0:right ns0:val="single" ns0:sz="4" ns0:color="D9D9D9"/>
+            </ns0:tcBorders>
+            <ns0:tcMar>
+              <ns0:top ns0:w="85" ns0:type="dxa"/>
+              <ns0:left ns0:w="85" ns0:type="dxa"/>
+              <ns0:bottom ns0:w="85" ns0:type="dxa"/>
+              <ns0:right ns0:w="85" ns0:type="dxa"/>
+            </ns0:tcMar>
+          </ns0:tcPr>
+          <ns0:p>
+            <ns0:pPr>
+              <ns0:spacing ns0:after="60"/>
+            </ns0:pPr>
+            <ns0:r>
+              <ns0:rPr>
+                <ns0:b ns0:val="0"/>
+                <ns0:sz ns0:val="18"/>
+              </ns0:rPr>
+              <ns0:t>เลือกชื่อไทยก่อน ถ้าไม่มีจึงใช้ชื่ออังกฤษ ส่งเป็น TUAccount.display_name เพียงชื่อเดียว</ns0:t>
+            </ns0:r>
+          </ns0:p>
+        </ns0:tc>
+      </ns0:tr>
+      <ns0:tr>
+        <ns0:trPr>
+          <ns0:cantSplit/>
+        </ns0:trPr>
+        <ns0:tc>
+          <ns0:tcPr>
+            <ns0:tcW ns0:type="dxa" ns0:w="5018"/>
+            <ns0:tcBorders>
+              <ns0:top ns0:val="single" ns0:sz="4" ns0:color="D9D9D9"/>
+              <ns0:left ns0:val="single" ns0:sz="4" ns0:color="D9D9D9"/>
+              <ns0:bottom ns0:val="single" ns0:sz="4" ns0:color="D9D9D9"/>
+              <ns0:right ns0:val="single" ns0:sz="4" ns0:color="D9D9D9"/>
+            </ns0:tcBorders>
+            <ns0:tcMar>
+              <ns0:top ns0:w="85" ns0:type="dxa"/>
+              <ns0:left ns0:w="85" ns0:type="dxa"/>
+              <ns0:bottom ns0:w="85" ns0:type="dxa"/>
+              <ns0:right ns0:w="85" ns0:type="dxa"/>
+            </ns0:tcMar>
+          </ns0:tcPr>
+          <ns0:p>
+            <ns0:pPr>
+              <ns0:spacing ns0:after="60"/>
+            </ns0:pPr>
+            <ns0:r>
+              <ns0:rPr>
+                <ns0:b ns0:val="0"/>
+                <ns0:sz ns0:val="18"/>
+              </ns0:rPr>
+              <ns0:t>tu_status, statusid, message, email, department, faculty</ns0:t>
+            </ns0:r>
+          </ns0:p>
+        </ns0:tc>
+        <ns0:tc>
+          <ns0:tcPr>
+            <ns0:tcW ns0:type="dxa" ns0:w="5018"/>
+            <ns0:tcBorders>
+              <ns0:top ns0:val="single" ns0:sz="4" ns0:color="D9D9D9"/>
+              <ns0:left ns0:val="single" ns0:sz="4" ns0:color="D9D9D9"/>
+              <ns0:bottom ns0:val="single" ns0:sz="4" ns0:color="D9D9D9"/>
+              <ns0:right ns0:val="single" ns0:sz="4" ns0:color="D9D9D9"/>
+            </ns0:tcBorders>
+            <ns0:tcMar>
+              <ns0:top ns0:w="85" ns0:type="dxa"/>
+              <ns0:left ns0:w="85" ns0:type="dxa"/>
+              <ns0:bottom ns0:w="85" ns0:type="dxa"/>
+              <ns0:right ns0:w="85" ns0:type="dxa"/>
+            </ns0:tcMar>
+          </ns0:tcPr>
+          <ns0:p>
+            <ns0:pPr>
+              <ns0:spacing ns0:after="60"/>
+            </ns0:pPr>
+            <ns0:r>
+              <ns0:rPr>
+                <ns0:b ns0:val="0"/>
+                <ns0:sz ns0:val="18"/>
+              </ns0:rPr>
+              <ns0:t>ไม่ได้ใช้กำหนด User หรือสิทธิ์ใน adapter ปัจจุบัน</ns0:t>
+            </ns0:r>
+          </ns0:p>
+        </ns0:tc>
+      </ns0:tr>
+    </ns0:tbl>
+    <ns0:p/>
+    <ns0:p>
+      <ns0:r>
+        <ns0:t>AuthService ส่งชื่อที่เลือกผ่านพารามิเตอร์ displayname_en ให้ UserDAO จึงอาจเก็บชื่อภาษาไทยในคอลัมน์นี้ด้วย การมีสองคอลัมน์ใน Entity ไม่ได้หมายความว่า Login ปัจจุบันเติมชื่อแยกสองภาษา</ns0:t>
+      </ns0:r>
+    </ns0:p>
+    <ns0:p>
+      <ns0:r>
+        <ns0:t>การมี User ในฐานข้อมูลไม่ใช้แทนการยืนยันตัวตนกับ TU API ในการ Login ครั้งถัดไป และไม่มีการเก็บ statusid เป็นคีย์ผู้ใช้</ns0:t>
+      </ns0:r>
+    </ns0:p>
+    <ns0:p>
+      <ns0:pPr>
+        <ns0:pStyle ns0:val="Heading2"/>
+      </ns0:pPr>
+      <ns0:r>
+        <ns0:t>ชื่อที่ใช้แสดง</ns0:t>
+      </ns0:r>
+    </ns0:p>
+    <ns0:p>
+      <ns0:r>
+        <ns0:t>ชื่อผู้เผยแพร่อ่านจาก User ที่แนวข้อสอบอ้างถึง โดยใช้ลำดับดังนี้:</ns0:t>
+      </ns0:r>
+    </ns0:p>
+    <ns0:p>
+      <ns0:r>
+        <ns0:t>1. ถ้ามีทั้งสองชื่อ แสดง ชื่อไทย (ชื่ออังกฤษ)</ns0:t>
+      </ns0:r>
+    </ns0:p>
+    <ns0:p>
+      <ns0:r>
+        <ns0:t>2. ถ้ามีชื่อเดียว แสดงชื่อนั้นโดยตัดช่องว่างหัวท้าย</ns0:t>
+      </ns0:r>
+    </ns0:p>
+    <ns0:p>
+      <ns0:r>
+        <ns0:t>3. ถ้าไม่มีทั้งสองชื่อ แสดง "ไม่ระบุชื่อ"</ns0:t>
+      </ns0:r>
+    </ns0:p>
+    <ns0:p>
+      <ns0:r>
+        <ns0:t>ใช้ format_publisher_name ร่วมกันใน service อ่านและเผยแพร่ ส่วนชื่อบัญชีที่ AuthService แสดงใช้ชื่อไทยก่อนชื่ออังกฤษและ username เป็น fallback จึงไม่ใช่กติกาเดียวกับชื่อผู้เผยแพร่</ns0:t>
+      </ns0:r>
+    </ns0:p>
+    <ns0:p>
+      <ns0:pPr>
+        <ns0:pStyle ns0:val="Heading1"/>
+      </ns0:pPr>
+      <ns0:r>
+        <ns0:t>4. การหาผู้ใช้เดิมและป้องกันบัญชีซ้ำ</ns0:t>
+      </ns0:r>
+    </ns0:p>
+    <ns0:p>
+      <ns0:r>
+        <ns0:t>หลัง TU API ยืนยันตัวตนสำเร็จและบัญชีผ่านกติกา Login ของ Task1 ระบบระบุ User ดังนี้:</ns0:t>
+      </ns0:r>
+    </ns0:p>
+    <ns0:p>
+      <ns0:r>
+        <ns0:t>1. อ่าน username ที่ผ่านการยืนยันจาก TUAccount และตัดช่องว่างหัวท้าย</ns0:t>
+      </ns0:r>
+    </ns0:p>
+    <ns0:p>
+      <ns0:r>
+        <ns0:t>2. ค้นหา User ด้วย username</ns0:t>
+      </ns0:r>
+    </ns0:p>
+    <ns0:p>
+      <ns0:r>
+        <ns0:t>3. ถ้าพบบัญชีเดิม ใช้ users.id เดิม</ns0:t>
+      </ns0:r>
+    </ns0:p>
+    <ns0:p>
+      <ns0:r>
+        <ns0:t>4. อัปเดตชื่อของบัญชีเดิม เฉพาะชื่อที่ API ส่งมาเป็นข้อความไม่ว่าง</ns0:t>
+      </ns0:r>
+    </ns0:p>
+    <ns0:p>
+      <ns0:r>
+        <ns0:t>5. ถ้าไม่พบบัญชีเดิม สร้าง User ใหม่พร้อมชื่อจาก API</ns0:t>
+      </ns0:r>
+    </ns0:p>
+    <ns0:p>
+      <ns0:r>
+        <ns0:t>6. DAO flush แล้วคืน User ให้ AuthService เตรียมตัวตนและ commit ก่อนสร้าง token</ns0:t>
+      </ns0:r>
+    </ns0:p>
+    <ns0:p>
+      <ns0:r>
+        <ns0:t>UserDAO ไม่ล้างชื่อเดิมเมื่อรับพารามิเตอร์ชื่อว่าง แต่ real TU adapter จะปฏิเสธการ Login หาก response ไม่มีชื่อที่ใช้ได้ทั้งสองภาษา จึงไม่ใช่กรณี Login จริงสำเร็จโดยไม่มีชื่อ</ns0:t>
+      </ns0:r>
+    </ns0:p>
+    <ns0:p>
+      <ns0:r>
+        <ns0:t>หากการยืนยันตัวตนไม่สำเร็จหรือบัญชีไม่ผ่านกติกา Login จะไม่มีการสร้างหรืออัปเดต User</ns0:t>
+      </ns0:r>
+    </ns0:p>
+    <ns0:p>
+      <ns0:pPr>
+        <ns0:pStyle ns0:val="Heading2"/>
+      </ns0:pPr>
+      <ns0:r>
+        <ns0:t>การ Login พร้อมกัน</ns0:t>
+      </ns0:r>
+    </ns0:p>
+    <ns0:p>
+      <ns0:r>
+        <ns0:t>ฐานข้อมูลกำหนดข้อบังคับ UNIQUE ที่ username เพื่อป้องกันบัญชีซ้ำ แม้มีหลายคำขอพยายามสร้างบัญชีเดียวกันพร้อมกัน</ns0:t>
+      </ns0:r>
+    </ns0:p>
+    <ns0:p>
+      <ns0:r>
+        <ns0:t>UserDAO ครอบการสร้าง User ใหม่ด้วย session.begin_nested() เมื่อ insert ไม่สำเร็จเพราะ duplicate username ที่รองรับ ให้ rollback เฉพาะ savepoint แล้วอ่าน User ที่มีอยู่เพื่อคืนคีย์เดิม ไม่ rollback transaction ชั้นนอกของผู้เรียก</ns0:t>
+      </ns0:r>
+    </ns0:p>
+    <ns0:p>
+      <ns0:r>
+        <ns0:t>ข้อผิดพลาดฐานข้อมูลประเภทอื่นส่งให้ขั้นตอน Login จัดการ โดยไม่ถือว่าเป็นกรณีพบผู้ใช้เดิม</ns0:t>
+      </ns0:r>
+    </ns0:p>
+    <ns0:p>
+      <ns0:pPr>
+        <ns0:pStyle ns0:val="Heading1"/>
+      </ns0:pPr>
+      <ns0:r>
+        <ns0:t>5. ความสัมพันธ์กับแนวข้อสอบ</ns0:t>
+      </ns0:r>
+    </ns0:p>
+    <ns0:p>
+      <ns0:r>
+        <ns0:t>guides.publisher_id เป็น INT NOT NULL และเป็น Foreign Key ไปยัง users.id</ns0:t>
+      </ns0:r>
+    </ns0:p>
+    <ns0:p>
+      <ns0:r>
+        <ns0:t>ผู้เผยแพร่กำหนดจากตัวตนผู้ใช้ที่เข้าสู่ระบบ โดยผู้เผยแพร่เป็นเจ้าของแนวข้อสอบรายการนั้น</ns0:t>
+      </ns0:r>
+    </ns0:p>
+    <ns0:p>
+      <ns0:r>
+        <ns0:t>ความสัมพันธ์มีดังนี้:</ns0:t>
+      </ns0:r>
+    </ns0:p>
+    <ns0:p>
+      <ns0:r>
+        <ns0:t>- User หนึ่งคนเผยแพร่ Guide ได้ตั้งแต่ศูนย์รายการขึ้นไป</ns0:t>
+      </ns0:r>
+    </ns0:p>
+    <ns0:p>
+      <ns0:r>
+        <ns0:t>- Guide แต่ละรายการมีผู้เผยแพร่หนึ่งคน</ns0:t>
+      </ns0:r>
+    </ns0:p>
+    <ns0:p>
+      <ns0:r>
+        <ns0:t>- Course หนึ่งวิชามี Guide ได้ตั้งแต่ศูนย์รายการขึ้นไป</ns0:t>
+      </ns0:r>
+    </ns0:p>
+    <ns0:p>
+      <ns0:r>
+        <ns0:t>- Guide แต่ละรายการอยู่ใน Course หนึ่งวิชา</ns0:t>
+      </ns0:r>
+    </ns0:p>
+    <ns0:p>
+      <ns0:r>
+        <ns0:t>ชื่อผู้เผยแพร่บนแนวข้อสอบอ่านจาก User ผ่าน publisher_id เมื่อชื่อจาก TU API อัปเดต รายการแนวข้อสอบแสดงชื่อปัจจุบัน</ns0:t>
+      </ns0:r>
+    </ns0:p>
+    <ns0:p>
+      <ns0:r>
+        <ns0:t>การลบ Guide ไม่ลบ User ส่วนการลบ User ที่ยังมี Guide อ้างถึงถูกปฏิเสธ</ns0:t>
+      </ns0:r>
+    </ns0:p>
+    <ns0:p>
+      <ns0:pPr>
+        <ns0:pStyle ns0:val="Heading2"/>
+      </ns0:pPr>
+      <ns0:r>
+        <ns0:t>ER Diagram</ns0:t>
+      </ns0:r>
+    </ns0:p>
+    <ns0:p>
+      <ns0:pPr>
+        <ns0:pStyle ns0:val="Heading2"/>
+      </ns0:pPr>
+      <ns0:r>
+        <ns0:t>แผนภาพ 1</ns0:t>
+      </ns0:r>
+    </ns0:p>
+    <ns0:p>
+      <ns0:r>
+        <ns0:drawing>
+          <ns2:inline>
+            <ns2:extent cx="5715000" cy="6337240"/>
+            <ns2:docPr id="1" name="Picture 1"/>
+            <ns2:cNvGraphicFramePr>
+              <ns3:graphicFrameLocks noChangeAspect="1"/>
+            </ns2:cNvGraphicFramePr>
+            <ns3:graphic>
+              <ns3:graphicData uri="http://schemas.openxmlformats.org/drawingml/2006/picture">
+                <ns4:pic>
+                  <ns4:nvPicPr>
+                    <ns4:cNvPr id="0" name="rendered-diagrams-2.png"/>
+                    <ns4:cNvPicPr/>
+                  </ns4:nvPicPr>
+                  <ns4:blipFill>
+                    <ns3:blip ns5:embed="rId9"/>
+                    <ns3:stretch>
+                      <ns3:fillRect/>
+                    </ns3:stretch>
+                  </ns4:blipFill>
+                  <ns4:spPr>
+                    <ns3:xfrm>
+                      <ns3:off x="0" y="0"/>
+                      <ns3:ext cx="5715000" cy="6337240"/>
+                    </ns3:xfrm>
+                    <ns3:prstGeom prst="rect"/>
+                  </ns4:spPr>
+                </ns4:pic>
+              </ns3:graphicData>
+            </ns3:graphic>
+          </ns2:inline>
+        </ns0:drawing>
+      </ns0:r>
+    </ns0:p>
+    <ns0:p>
+      <ns0:r>
+        <ns0:t>แผนภาพแสดงเฉพาะฟิลด์ของ Guide และ Course ที่เกี่ยวข้องกับความสัมพันธ์นี้ รายละเอียดของสองตารางใช้ตาม Task36 และ Task22</ns0:t>
+      </ns0:r>
+    </ns0:p>
+    <ns0:p>
+      <ns0:pPr>
+        <ns0:pStyle ns0:val="Heading1"/>
+      </ns0:pPr>
+      <ns0:r>
+        <ns0:t>6. แบบ Entity และ DAO</ns0:t>
+      </ns0:r>
+    </ns0:p>
+    <ns0:p>
+      <ns0:pPr>
+        <ns0:pStyle ns0:val="Heading2"/>
+      </ns0:pPr>
+      <ns0:r>
+        <ns0:t>User Entity</ns0:t>
+      </ns0:r>
+    </ns0:p>
+    <ns0:p>
+      <ns0:r>
+        <ns0:t>User เป็น SQLAlchemy Entity ที่แทนตาราง users โดยมีฟิลด์:</ns0:t>
+      </ns0:r>
+    </ns0:p>
+    <ns0:p>
+      <ns0:r>
+        <ns0:t>- id</ns0:t>
+      </ns0:r>
+    </ns0:p>
+    <ns0:p>
+      <ns0:r>
+        <ns0:t>- username</ns0:t>
+      </ns0:r>
+    </ns0:p>
+    <ns0:p>
+      <ns0:r>
+        <ns0:t>- displayname_th</ns0:t>
+      </ns0:r>
+    </ns0:p>
+    <ns0:p>
+      <ns0:r>
+        <ns0:t>- displayname_en</ns0:t>
+      </ns0:r>
+    </ns0:p>
+    <ns0:p>
+      <ns0:pPr>
+        <ns0:pStyle ns0:val="Heading2"/>
+      </ns0:pPr>
+      <ns0:r>
+        <ns0:t>UserDAO</ns0:t>
+      </ns0:r>
+    </ns0:p>
+    <ns0:tbl>
+      <ns0:tblPr>
+        <ns0:tblW ns0:type="auto" ns0:w="0"/>
+        <ns0:tblLayout ns0:type="autofit"/>
+        <ns0:tblLook ns0:firstColumn="1" ns0:firstRow="1" ns0:lastColumn="0" ns0:lastRow="0" ns0:noHBand="0" ns0:noVBand="1" ns0:val="04A0"/>
+      </ns0:tblPr>
+      <ns0:tblGrid>
+        <ns0:gridCol ns0:w="3346"/>
+        <ns0:gridCol ns0:w="3346"/>
+        <ns0:gridCol ns0:w="3346"/>
+      </ns0:tblGrid>
+      <ns0:tr>
+        <ns0:trPr>
+          <ns0:cantSplit/>
+          <ns0:tblHeader/>
+        </ns0:trPr>
+        <ns0:tc>
+          <ns0:tcPr>
+            <ns0:tcW ns0:type="dxa" ns0:w="3346"/>
+            <ns0:tcBorders>
+              <ns0:top ns0:val="single" ns0:sz="4" ns0:color="D9D9D9"/>
+              <ns0:left ns0:val="single" ns0:sz="4" ns0:color="D9D9D9"/>
+              <ns0:bottom ns0:val="single" ns0:sz="4" ns0:color="D9D9D9"/>
+              <ns0:right ns0:val="single" ns0:sz="4" ns0:color="D9D9D9"/>
+            </ns0:tcBorders>
+            <ns0:tcMar>
+              <ns0:top ns0:w="85" ns0:type="dxa"/>
+              <ns0:left ns0:w="85" ns0:type="dxa"/>
+              <ns0:bottom ns0:w="85" ns0:type="dxa"/>
+              <ns0:right ns0:w="85" ns0:type="dxa"/>
+            </ns0:tcMar>
+            <ns0:shd ns0:fill="E8EEF4"/>
+          </ns0:tcPr>
+          <ns0:p>
+            <ns0:pPr>
+              <ns0:spacing ns0:after="60"/>
+            </ns0:pPr>
+            <ns0:r>
+              <ns0:rPr>
+                <ns0:b/>
+                <ns0:sz ns0:val="18"/>
+              </ns0:rPr>
+              <ns0:t>เมธอด</ns0:t>
+            </ns0:r>
+          </ns0:p>
+        </ns0:tc>
+        <ns0:tc>
+          <ns0:tcPr>
+            <ns0:tcW ns0:type="dxa" ns0:w="3346"/>
+            <ns0:tcBorders>
+              <ns0:top ns0:val="single" ns0:sz="4" ns0:color="D9D9D9"/>
+              <ns0:left ns0:val="single" ns0:sz="4" ns0:color="D9D9D9"/>
+              <ns0:bottom ns0:val="single" ns0:sz="4" ns0:color="D9D9D9"/>
+              <ns0:right ns0:val="single" ns0:sz="4" ns0:color="D9D9D9"/>
+            </ns0:tcBorders>
+            <ns0:tcMar>
+              <ns0:top ns0:w="85" ns0:type="dxa"/>
+              <ns0:left ns0:w="85" ns0:type="dxa"/>
+              <ns0:bottom ns0:w="85" ns0:type="dxa"/>
+              <ns0:right ns0:w="85" ns0:type="dxa"/>
+            </ns0:tcMar>
+            <ns0:shd ns0:fill="E8EEF4"/>
+          </ns0:tcPr>
+          <ns0:p>
+            <ns0:pPr>
+              <ns0:spacing ns0:after="60"/>
+            </ns0:pPr>
+            <ns0:r>
+              <ns0:rPr>
+                <ns0:b/>
+                <ns0:sz ns0:val="18"/>
+              </ns0:rPr>
+              <ns0:t>ข้อมูลรับเข้า</ns0:t>
+            </ns0:r>
+          </ns0:p>
+        </ns0:tc>
+        <ns0:tc>
+          <ns0:tcPr>
+            <ns0:tcW ns0:type="dxa" ns0:w="3346"/>
+            <ns0:tcBorders>
+              <ns0:top ns0:val="single" ns0:sz="4" ns0:color="D9D9D9"/>
+              <ns0:left ns0:val="single" ns0:sz="4" ns0:color="D9D9D9"/>
+              <ns0:bottom ns0:val="single" ns0:sz="4" ns0:color="D9D9D9"/>
+              <ns0:right ns0:val="single" ns0:sz="4" ns0:color="D9D9D9"/>
+            </ns0:tcBorders>
+            <ns0:tcMar>
+              <ns0:top ns0:w="85" ns0:type="dxa"/>
+              <ns0:left ns0:w="85" ns0:type="dxa"/>
+              <ns0:bottom ns0:w="85" ns0:type="dxa"/>
+              <ns0:right ns0:w="85" ns0:type="dxa"/>
+            </ns0:tcMar>
+            <ns0:shd ns0:fill="E8EEF4"/>
+          </ns0:tcPr>
+          <ns0:p>
+            <ns0:pPr>
+              <ns0:spacing ns0:after="60"/>
+            </ns0:pPr>
+            <ns0:r>
+              <ns0:rPr>
+                <ns0:b/>
+                <ns0:sz ns0:val="18"/>
+              </ns0:rPr>
+              <ns0:t>ผลที่คืน</ns0:t>
+            </ns0:r>
+          </ns0:p>
+        </ns0:tc>
+      </ns0:tr>
+      <ns0:tr>
+        <ns0:trPr>
+          <ns0:cantSplit/>
+        </ns0:trPr>
+        <ns0:tc>
+          <ns0:tcPr>
+            <ns0:tcW ns0:type="dxa" ns0:w="3346"/>
+            <ns0:tcBorders>
+              <ns0:top ns0:val="single" ns0:sz="4" ns0:color="D9D9D9"/>
+              <ns0:left ns0:val="single" ns0:sz="4" ns0:color="D9D9D9"/>
+              <ns0:bottom ns0:val="single" ns0:sz="4" ns0:color="D9D9D9"/>
+              <ns0:right ns0:val="single" ns0:sz="4" ns0:color="D9D9D9"/>
+            </ns0:tcBorders>
+            <ns0:tcMar>
+              <ns0:top ns0:w="85" ns0:type="dxa"/>
+              <ns0:left ns0:w="85" ns0:type="dxa"/>
+              <ns0:bottom ns0:w="85" ns0:type="dxa"/>
+              <ns0:right ns0:w="85" ns0:type="dxa"/>
+            </ns0:tcMar>
+          </ns0:tcPr>
+          <ns0:p>
+            <ns0:pPr>
+              <ns0:spacing ns0:after="60"/>
+            </ns0:pPr>
+            <ns0:r>
+              <ns0:rPr>
+                <ns0:b ns0:val="0"/>
+                <ns0:sz ns0:val="18"/>
+              </ns0:rPr>
+              <ns0:t>get_by_username</ns0:t>
+            </ns0:r>
+          </ns0:p>
+        </ns0:tc>
+        <ns0:tc>
+          <ns0:tcPr>
+            <ns0:tcW ns0:type="dxa" ns0:w="3346"/>
+            <ns0:tcBorders>
+              <ns0:top ns0:val="single" ns0:sz="4" ns0:color="D9D9D9"/>
+              <ns0:left ns0:val="single" ns0:sz="4" ns0:color="D9D9D9"/>
+              <ns0:bottom ns0:val="single" ns0:sz="4" ns0:color="D9D9D9"/>
+              <ns0:right ns0:val="single" ns0:sz="4" ns0:color="D9D9D9"/>
+            </ns0:tcBorders>
+            <ns0:tcMar>
+              <ns0:top ns0:w="85" ns0:type="dxa"/>
+              <ns0:left ns0:w="85" ns0:type="dxa"/>
+              <ns0:bottom ns0:w="85" ns0:type="dxa"/>
+              <ns0:right ns0:w="85" ns0:type="dxa"/>
+            </ns0:tcMar>
+          </ns0:tcPr>
+          <ns0:p>
+            <ns0:pPr>
+              <ns0:spacing ns0:after="60"/>
+            </ns0:pPr>
+            <ns0:r>
+              <ns0:rPr>
+                <ns0:b ns0:val="0"/>
+                <ns0:sz ns0:val="18"/>
+              </ns0:rPr>
+              <ns0:t>บัญชี TU ที่ตัดช่องว่างแล้ว</ns0:t>
+            </ns0:r>
+          </ns0:p>
+        </ns0:tc>
+        <ns0:tc>
+          <ns0:tcPr>
+            <ns0:tcW ns0:type="dxa" ns0:w="3346"/>
+            <ns0:tcBorders>
+              <ns0:top ns0:val="single" ns0:sz="4" ns0:color="D9D9D9"/>
+              <ns0:left ns0:val="single" ns0:sz="4" ns0:color="D9D9D9"/>
+              <ns0:bottom ns0:val="single" ns0:sz="4" ns0:color="D9D9D9"/>
+              <ns0:right ns0:val="single" ns0:sz="4" ns0:color="D9D9D9"/>
+            </ns0:tcBorders>
+            <ns0:tcMar>
+              <ns0:top ns0:w="85" ns0:type="dxa"/>
+              <ns0:left ns0:w="85" ns0:type="dxa"/>
+              <ns0:bottom ns0:w="85" ns0:type="dxa"/>
+              <ns0:right ns0:w="85" ns0:type="dxa"/>
+            </ns0:tcMar>
+          </ns0:tcPr>
+          <ns0:p>
+            <ns0:pPr>
+              <ns0:spacing ns0:after="60"/>
+            </ns0:pPr>
+            <ns0:r>
+              <ns0:rPr>
+                <ns0:b ns0:val="0"/>
+                <ns0:sz ns0:val="18"/>
+              </ns0:rPr>
+              <ns0:t>User หรือ None เมื่อไม่พบ</ns0:t>
+            </ns0:r>
+          </ns0:p>
+        </ns0:tc>
+      </ns0:tr>
+      <ns0:tr>
+        <ns0:trPr>
+          <ns0:cantSplit/>
+        </ns0:trPr>
+        <ns0:tc>
+          <ns0:tcPr>
+            <ns0:tcW ns0:type="dxa" ns0:w="3346"/>
+            <ns0:tcBorders>
+              <ns0:top ns0:val="single" ns0:sz="4" ns0:color="D9D9D9"/>
+              <ns0:left ns0:val="single" ns0:sz="4" ns0:color="D9D9D9"/>
+              <ns0:bottom ns0:val="single" ns0:sz="4" ns0:color="D9D9D9"/>
+              <ns0:right ns0:val="single" ns0:sz="4" ns0:color="D9D9D9"/>
+            </ns0:tcBorders>
+            <ns0:tcMar>
+              <ns0:top ns0:w="85" ns0:type="dxa"/>
+              <ns0:left ns0:w="85" ns0:type="dxa"/>
+              <ns0:bottom ns0:w="85" ns0:type="dxa"/>
+              <ns0:right ns0:w="85" ns0:type="dxa"/>
+            </ns0:tcMar>
+          </ns0:tcPr>
+          <ns0:p>
+            <ns0:pPr>
+              <ns0:spacing ns0:after="60"/>
+            </ns0:pPr>
+            <ns0:r>
+              <ns0:rPr>
+                <ns0:b ns0:val="0"/>
+                <ns0:sz ns0:val="18"/>
+              </ns0:rPr>
+              <ns0:t>get_by_id</ns0:t>
+            </ns0:r>
+          </ns0:p>
+        </ns0:tc>
+        <ns0:tc>
+          <ns0:tcPr>
+            <ns0:tcW ns0:type="dxa" ns0:w="3346"/>
+            <ns0:tcBorders>
+              <ns0:top ns0:val="single" ns0:sz="4" ns0:color="D9D9D9"/>
+              <ns0:left ns0:val="single" ns0:sz="4" ns0:color="D9D9D9"/>
+              <ns0:bottom ns0:val="single" ns0:sz="4" ns0:color="D9D9D9"/>
+              <ns0:right ns0:val="single" ns0:sz="4" ns0:color="D9D9D9"/>
+            </ns0:tcBorders>
+            <ns0:tcMar>
+              <ns0:top ns0:w="85" ns0:type="dxa"/>
+              <ns0:left ns0:w="85" ns0:type="dxa"/>
+              <ns0:bottom ns0:w="85" ns0:type="dxa"/>
+              <ns0:right ns0:w="85" ns0:type="dxa"/>
+            </ns0:tcMar>
+          </ns0:tcPr>
+          <ns0:p>
+            <ns0:pPr>
+              <ns0:spacing ns0:after="60"/>
+            </ns0:pPr>
+            <ns0:r>
+              <ns0:rPr>
+                <ns0:b ns0:val="0"/>
+                <ns0:sz ns0:val="18"/>
+              </ns0:rPr>
+              <ns0:t>users.id</ns0:t>
+            </ns0:r>
+          </ns0:p>
+        </ns0:tc>
+        <ns0:tc>
+          <ns0:tcPr>
+            <ns0:tcW ns0:type="dxa" ns0:w="3346"/>
+            <ns0:tcBorders>
+              <ns0:top ns0:val="single" ns0:sz="4" ns0:color="D9D9D9"/>
+              <ns0:left ns0:val="single" ns0:sz="4" ns0:color="D9D9D9"/>
+              <ns0:bottom ns0:val="single" ns0:sz="4" ns0:color="D9D9D9"/>
+              <ns0:right ns0:val="single" ns0:sz="4" ns0:color="D9D9D9"/>
+            </ns0:tcBorders>
+            <ns0:tcMar>
+              <ns0:top ns0:w="85" ns0:type="dxa"/>
+              <ns0:left ns0:w="85" ns0:type="dxa"/>
+              <ns0:bottom ns0:w="85" ns0:type="dxa"/>
+              <ns0:right ns0:w="85" ns0:type="dxa"/>
+            </ns0:tcMar>
+          </ns0:tcPr>
+          <ns0:p>
+            <ns0:pPr>
+              <ns0:spacing ns0:after="60"/>
+            </ns0:pPr>
+            <ns0:r>
+              <ns0:rPr>
+                <ns0:b ns0:val="0"/>
+                <ns0:sz ns0:val="18"/>
+              </ns0:rPr>
+              <ns0:t>User หรือ None เมื่อไม่พบ</ns0:t>
+            </ns0:r>
+          </ns0:p>
+        </ns0:tc>
+      </ns0:tr>
+      <ns0:tr>
+        <ns0:trPr>
+          <ns0:cantSplit/>
+        </ns0:trPr>
+        <ns0:tc>
+          <ns0:tcPr>
+            <ns0:tcW ns0:type="dxa" ns0:w="3346"/>
+            <ns0:tcBorders>
+              <ns0:top ns0:val="single" ns0:sz="4" ns0:color="D9D9D9"/>
+              <ns0:left ns0:val="single" ns0:sz="4" ns0:color="D9D9D9"/>
+              <ns0:bottom ns0:val="single" ns0:sz="4" ns0:color="D9D9D9"/>
+              <ns0:right ns0:val="single" ns0:sz="4" ns0:color="D9D9D9"/>
+            </ns0:tcBorders>
+            <ns0:tcMar>
+              <ns0:top ns0:w="85" ns0:type="dxa"/>
+              <ns0:left ns0:w="85" ns0:type="dxa"/>
+              <ns0:bottom ns0:w="85" ns0:type="dxa"/>
+              <ns0:right ns0:w="85" ns0:type="dxa"/>
+            </ns0:tcMar>
+          </ns0:tcPr>
+          <ns0:p>
+            <ns0:pPr>
+              <ns0:spacing ns0:after="60"/>
+            </ns0:pPr>
+            <ns0:r>
+              <ns0:rPr>
+                <ns0:b ns0:val="0"/>
+                <ns0:sz ns0:val="18"/>
+              </ns0:rPr>
+              <ns0:t>get_or_create_from_tu_profile</ns0:t>
+            </ns0:r>
+          </ns0:p>
+        </ns0:tc>
+        <ns0:tc>
+          <ns0:tcPr>
+            <ns0:tcW ns0:type="dxa" ns0:w="3346"/>
+            <ns0:tcBorders>
+              <ns0:top ns0:val="single" ns0:sz="4" ns0:color="D9D9D9"/>
+              <ns0:left ns0:val="single" ns0:sz="4" ns0:color="D9D9D9"/>
+              <ns0:bottom ns0:val="single" ns0:sz="4" ns0:color="D9D9D9"/>
+              <ns0:right ns0:val="single" ns0:sz="4" ns0:color="D9D9D9"/>
+            </ns0:tcBorders>
+            <ns0:tcMar>
+              <ns0:top ns0:w="85" ns0:type="dxa"/>
+              <ns0:left ns0:w="85" ns0:type="dxa"/>
+              <ns0:bottom ns0:w="85" ns0:type="dxa"/>
+              <ns0:right ns0:w="85" ns0:type="dxa"/>
+            </ns0:tcMar>
+          </ns0:tcPr>
+          <ns0:p>
+            <ns0:pPr>
+              <ns0:spacing ns0:after="60"/>
+            </ns0:pPr>
+            <ns0:r>
+              <ns0:rPr>
+                <ns0:b ns0:val="0"/>
+                <ns0:sz ns0:val="18"/>
+              </ns0:rPr>
+              <ns0:t>username, displayname_th, displayname_en ที่ผ่านการตรวจสอบจากขั้นตอน Login</ns0:t>
+            </ns0:r>
+          </ns0:p>
+        </ns0:tc>
+        <ns0:tc>
+          <ns0:tcPr>
+            <ns0:tcW ns0:type="dxa" ns0:w="3346"/>
+            <ns0:tcBorders>
+              <ns0:top ns0:val="single" ns0:sz="4" ns0:color="D9D9D9"/>
+              <ns0:left ns0:val="single" ns0:sz="4" ns0:color="D9D9D9"/>
+              <ns0:bottom ns0:val="single" ns0:sz="4" ns0:color="D9D9D9"/>
+              <ns0:right ns0:val="single" ns0:sz="4" ns0:color="D9D9D9"/>
+            </ns0:tcBorders>
+            <ns0:tcMar>
+              <ns0:top ns0:w="85" ns0:type="dxa"/>
+              <ns0:left ns0:w="85" ns0:type="dxa"/>
+              <ns0:bottom ns0:w="85" ns0:type="dxa"/>
+              <ns0:right ns0:w="85" ns0:type="dxa"/>
+            </ns0:tcMar>
+          </ns0:tcPr>
+          <ns0:p>
+            <ns0:pPr>
+              <ns0:spacing ns0:after="60"/>
+            </ns0:pPr>
+            <ns0:r>
+              <ns0:rPr>
+                <ns0:b ns0:val="0"/>
+                <ns0:sz ns0:val="18"/>
+              </ns0:rPr>
+              <ns0:t>User ใหม่หรือ User เดิม พร้อมข้อมูลชื่อที่อัปเดต</ns0:t>
+            </ns0:r>
+          </ns0:p>
+        </ns0:tc>
+      </ns0:tr>
+    </ns0:tbl>
+    <ns0:p/>
+    <ns0:p>
+      <ns0:r>
+        <ns0:t>get_or_create_from_tu_profile ใช้กติกาในข้อ 4 และคืน User หลัง flush โดยไม่ commit ผู้เรียกเป็นเจ้าของ transaction: AuthService commit หลังเตรียม AuthenticatedUser ส่วน PublishGuideService commit User และ Guide ร่วมกัน</ns0:t>
+      </ns0:r>
+    </ns0:p>
+    <ns0:p>
+      <ns0:r>
+        <ns0:t>DAO ทำหน้าที่เข้าถึงฐานข้อมูล ส่วนการเรียก TU API ตรวจสิทธิ์บัญชี และสร้างสถานะเข้าสู่ระบบอยู่ในขั้นตอน Login</ns0:t>
+      </ns0:r>
+    </ns0:p>
+    <ns0:p>
+      <ns0:pPr>
+        <ns0:pStyle ns0:val="Heading2"/>
+      </ns0:pPr>
+      <ns0:r>
+        <ns0:t>แผนภาพ Entity/DAO</ns0:t>
+      </ns0:r>
+    </ns0:p>
+    <ns0:p>
+      <ns0:pPr>
+        <ns0:pStyle ns0:val="Heading2"/>
+      </ns0:pPr>
+      <ns0:r>
+        <ns0:t>แผนภาพ 2</ns0:t>
+      </ns0:r>
+    </ns0:p>
+    <ns0:p>
+      <ns0:r>
+        <ns0:drawing>
+          <ns2:inline>
+            <ns2:extent cx="5715000" cy="4369617"/>
+            <ns2:docPr id="2" name="Picture 2"/>
+            <ns2:cNvGraphicFramePr>
+              <ns3:graphicFrameLocks noChangeAspect="1"/>
+            </ns2:cNvGraphicFramePr>
+            <ns3:graphic>
+              <ns3:graphicData uri="http://schemas.openxmlformats.org/drawingml/2006/picture">
+                <ns4:pic>
+                  <ns4:nvPicPr>
+                    <ns4:cNvPr id="0" name="rendered-diagrams-3.png"/>
+                    <ns4:cNvPicPr/>
+                  </ns4:nvPicPr>
+                  <ns4:blipFill>
+                    <ns3:blip ns5:embed="rId10"/>
+                    <ns3:stretch>
+                      <ns3:fillRect/>
+                    </ns3:stretch>
+                  </ns4:blipFill>
+                  <ns4:spPr>
+                    <ns3:xfrm>
+                      <ns3:off x="0" y="0"/>
+                      <ns3:ext cx="5715000" cy="4369617"/>
+                    </ns3:xfrm>
+                    <ns3:prstGeom prst="rect"/>
+                  </ns4:spPr>
+                </ns4:pic>
+              </ns3:graphicData>
+            </ns3:graphic>
+          </ns2:inline>
+        </ns0:drawing>
+      </ns0:r>
+    </ns0:p>
+    <ns0:p>
+      <ns0:pPr>
+        <ns0:pStyle ns0:val="Heading1"/>
+      </ns0:pPr>
+      <ns0:r>
+        <ns0:t>7. ผลที่ต้องได้จากแบบนี้</ns0:t>
+      </ns0:r>
+    </ns0:p>
+    <ns0:tbl>
+      <ns0:tblPr>
+        <ns0:tblW ns0:type="auto" ns0:w="0"/>
+        <ns0:tblLayout ns0:type="autofit"/>
+        <ns0:tblLook ns0:firstColumn="1" ns0:firstRow="1" ns0:lastColumn="0" ns0:lastRow="0" ns0:noHBand="0" ns0:noVBand="1" ns0:val="04A0"/>
+      </ns0:tblPr>
+      <ns0:tblGrid>
+        <ns0:gridCol ns0:w="5018"/>
+        <ns0:gridCol ns0:w="5018"/>
+      </ns0:tblGrid>
+      <ns0:tr>
+        <ns0:trPr>
+          <ns0:cantSplit/>
+          <ns0:tblHeader/>
+        </ns0:trPr>
+        <ns0:tc>
+          <ns0:tcPr>
+            <ns0:tcW ns0:type="dxa" ns0:w="5018"/>
+            <ns0:tcBorders>
+              <ns0:top ns0:val="single" ns0:sz="4" ns0:color="D9D9D9"/>
+              <ns0:left ns0:val="single" ns0:sz="4" ns0:color="D9D9D9"/>
+              <ns0:bottom ns0:val="single" ns0:sz="4" ns0:color="D9D9D9"/>
+              <ns0:right ns0:val="single" ns0:sz="4" ns0:color="D9D9D9"/>
+            </ns0:tcBorders>
+            <ns0:tcMar>
+              <ns0:top ns0:w="85" ns0:type="dxa"/>
+              <ns0:left ns0:w="85" ns0:type="dxa"/>
+              <ns0:bottom ns0:w="85" ns0:type="dxa"/>
+              <ns0:right ns0:w="85" ns0:type="dxa"/>
+            </ns0:tcMar>
+            <ns0:shd ns0:fill="E8EEF4"/>
+          </ns0:tcPr>
+          <ns0:p>
+            <ns0:pPr>
+              <ns0:spacing ns0:after="60"/>
+            </ns0:pPr>
+            <ns0:r>
+              <ns0:rPr>
+                <ns0:b/>
+                <ns0:sz ns0:val="18"/>
+              </ns0:rPr>
+              <ns0:t>กรณี</ns0:t>
+            </ns0:r>
+          </ns0:p>
+        </ns0:tc>
+        <ns0:tc>
+          <ns0:tcPr>
+            <ns0:tcW ns0:type="dxa" ns0:w="5018"/>
+            <ns0:tcBorders>
+              <ns0:top ns0:val="single" ns0:sz="4" ns0:color="D9D9D9"/>
+              <ns0:left ns0:val="single" ns0:sz="4" ns0:color="D9D9D9"/>
+              <ns0:bottom ns0:val="single" ns0:sz="4" ns0:color="D9D9D9"/>
+              <ns0:right ns0:val="single" ns0:sz="4" ns0:color="D9D9D9"/>
+            </ns0:tcBorders>
+            <ns0:tcMar>
+              <ns0:top ns0:w="85" ns0:type="dxa"/>
+              <ns0:left ns0:w="85" ns0:type="dxa"/>
+              <ns0:bottom ns0:w="85" ns0:type="dxa"/>
+              <ns0:right ns0:w="85" ns0:type="dxa"/>
+            </ns0:tcMar>
+            <ns0:shd ns0:fill="E8EEF4"/>
+          </ns0:tcPr>
+          <ns0:p>
+            <ns0:pPr>
+              <ns0:spacing ns0:after="60"/>
+            </ns0:pPr>
+            <ns0:r>
+              <ns0:rPr>
+                <ns0:b/>
+                <ns0:sz ns0:val="18"/>
+              </ns0:rPr>
+              <ns0:t>ผลที่ต้องได้</ns0:t>
+            </ns0:r>
+          </ns0:p>
+        </ns0:tc>
+      </ns0:tr>
+      <ns0:tr>
+        <ns0:trPr>
+          <ns0:cantSplit/>
+        </ns0:trPr>
+        <ns0:tc>
+          <ns0:tcPr>
+            <ns0:tcW ns0:type="dxa" ns0:w="5018"/>
+            <ns0:tcBorders>
+              <ns0:top ns0:val="single" ns0:sz="4" ns0:color="D9D9D9"/>
+              <ns0:left ns0:val="single" ns0:sz="4" ns0:color="D9D9D9"/>
+              <ns0:bottom ns0:val="single" ns0:sz="4" ns0:color="D9D9D9"/>
+              <ns0:right ns0:val="single" ns0:sz="4" ns0:color="D9D9D9"/>
+            </ns0:tcBorders>
+            <ns0:tcMar>
+              <ns0:top ns0:w="85" ns0:type="dxa"/>
+              <ns0:left ns0:w="85" ns0:type="dxa"/>
+              <ns0:bottom ns0:w="85" ns0:type="dxa"/>
+              <ns0:right ns0:w="85" ns0:type="dxa"/>
+            </ns0:tcMar>
+          </ns0:tcPr>
+          <ns0:p>
+            <ns0:pPr>
+              <ns0:spacing ns0:after="60"/>
+            </ns0:pPr>
+            <ns0:r>
+              <ns0:rPr>
+                <ns0:b ns0:val="0"/>
+                <ns0:sz ns0:val="18"/>
+              </ns0:rPr>
+              <ns0:t>Login บัญชีใหม่สำเร็จ</ns0:t>
+            </ns0:r>
+          </ns0:p>
+        </ns0:tc>
+        <ns0:tc>
+          <ns0:tcPr>
+            <ns0:tcW ns0:type="dxa" ns0:w="5018"/>
+            <ns0:tcBorders>
+              <ns0:top ns0:val="single" ns0:sz="4" ns0:color="D9D9D9"/>
+              <ns0:left ns0:val="single" ns0:sz="4" ns0:color="D9D9D9"/>
+              <ns0:bottom ns0:val="single" ns0:sz="4" ns0:color="D9D9D9"/>
+              <ns0:right ns0:val="single" ns0:sz="4" ns0:color="D9D9D9"/>
+            </ns0:tcBorders>
+            <ns0:tcMar>
+              <ns0:top ns0:w="85" ns0:type="dxa"/>
+              <ns0:left ns0:w="85" ns0:type="dxa"/>
+              <ns0:bottom ns0:w="85" ns0:type="dxa"/>
+              <ns0:right ns0:w="85" ns0:type="dxa"/>
+            </ns0:tcMar>
+          </ns0:tcPr>
+          <ns0:p>
+            <ns0:pPr>
+              <ns0:spacing ns0:after="60"/>
+            </ns0:pPr>
+            <ns0:r>
+              <ns0:rPr>
+                <ns0:b ns0:val="0"/>
+                <ns0:sz ns0:val="18"/>
+              </ns0:rPr>
+              <ns0:t>สร้าง User หนึ่งรายการและคืนคีย์ใหม่</ns0:t>
+            </ns0:r>
+          </ns0:p>
+        </ns0:tc>
+      </ns0:tr>
+      <ns0:tr>
+        <ns0:trPr>
+          <ns0:cantSplit/>
+        </ns0:trPr>
+        <ns0:tc>
+          <ns0:tcPr>
+            <ns0:tcW ns0:type="dxa" ns0:w="5018"/>
+            <ns0:tcBorders>
+              <ns0:top ns0:val="single" ns0:sz="4" ns0:color="D9D9D9"/>
+              <ns0:left ns0:val="single" ns0:sz="4" ns0:color="D9D9D9"/>
+              <ns0:bottom ns0:val="single" ns0:sz="4" ns0:color="D9D9D9"/>
+              <ns0:right ns0:val="single" ns0:sz="4" ns0:color="D9D9D9"/>
+            </ns0:tcBorders>
+            <ns0:tcMar>
+              <ns0:top ns0:w="85" ns0:type="dxa"/>
+              <ns0:left ns0:w="85" ns0:type="dxa"/>
+              <ns0:bottom ns0:w="85" ns0:type="dxa"/>
+              <ns0:right ns0:w="85" ns0:type="dxa"/>
+            </ns0:tcMar>
+          </ns0:tcPr>
+          <ns0:p>
+            <ns0:pPr>
+              <ns0:spacing ns0:after="60"/>
+            </ns0:pPr>
+            <ns0:r>
+              <ns0:rPr>
+                <ns0:b ns0:val="0"/>
+                <ns0:sz ns0:val="18"/>
+              </ns0:rPr>
+              <ns0:t>Login บัญชีเดิมสำเร็จ</ns0:t>
+            </ns0:r>
+          </ns0:p>
+        </ns0:tc>
+        <ns0:tc>
+          <ns0:tcPr>
+            <ns0:tcW ns0:type="dxa" ns0:w="5018"/>
+            <ns0:tcBorders>
+              <ns0:top ns0:val="single" ns0:sz="4" ns0:color="D9D9D9"/>
+              <ns0:left ns0:val="single" ns0:sz="4" ns0:color="D9D9D9"/>
+              <ns0:bottom ns0:val="single" ns0:sz="4" ns0:color="D9D9D9"/>
+              <ns0:right ns0:val="single" ns0:sz="4" ns0:color="D9D9D9"/>
+            </ns0:tcBorders>
+            <ns0:tcMar>
+              <ns0:top ns0:w="85" ns0:type="dxa"/>
+              <ns0:left ns0:w="85" ns0:type="dxa"/>
+              <ns0:bottom ns0:w="85" ns0:type="dxa"/>
+              <ns0:right ns0:w="85" ns0:type="dxa"/>
+            </ns0:tcMar>
+          </ns0:tcPr>
+          <ns0:p>
+            <ns0:pPr>
+              <ns0:spacing ns0:after="60"/>
+            </ns0:pPr>
+            <ns0:r>
+              <ns0:rPr>
+                <ns0:b ns0:val="0"/>
+                <ns0:sz ns0:val="18"/>
+              </ns0:rPr>
+              <ns0:t>คืน users.id เดิม</ns0:t>
+            </ns0:r>
+          </ns0:p>
+        </ns0:tc>
+      </ns0:tr>
+      <ns0:tr>
+        <ns0:trPr>
+          <ns0:cantSplit/>
+        </ns0:trPr>
+        <ns0:tc>
+          <ns0:tcPr>
+            <ns0:tcW ns0:type="dxa" ns0:w="5018"/>
+            <ns0:tcBorders>
+              <ns0:top ns0:val="single" ns0:sz="4" ns0:color="D9D9D9"/>
+              <ns0:left ns0:val="single" ns0:sz="4" ns0:color="D9D9D9"/>
+              <ns0:bottom ns0:val="single" ns0:sz="4" ns0:color="D9D9D9"/>
+              <ns0:right ns0:val="single" ns0:sz="4" ns0:color="D9D9D9"/>
+            </ns0:tcBorders>
+            <ns0:tcMar>
+              <ns0:top ns0:w="85" ns0:type="dxa"/>
+              <ns0:left ns0:w="85" ns0:type="dxa"/>
+              <ns0:bottom ns0:w="85" ns0:type="dxa"/>
+              <ns0:right ns0:w="85" ns0:type="dxa"/>
+            </ns0:tcMar>
+          </ns0:tcPr>
+          <ns0:p>
+            <ns0:pPr>
+              <ns0:spacing ns0:after="60"/>
+            </ns0:pPr>
+            <ns0:r>
+              <ns0:rPr>
+                <ns0:b ns0:val="0"/>
+                <ns0:sz ns0:val="18"/>
+              </ns0:rPr>
+              <ns0:t>Login บัญชีเดียวกันพร้อมกันหลายคำขอ</ns0:t>
+            </ns0:r>
+          </ns0:p>
+        </ns0:tc>
+        <ns0:tc>
+          <ns0:tcPr>
+            <ns0:tcW ns0:type="dxa" ns0:w="5018"/>
+            <ns0:tcBorders>
+              <ns0:top ns0:val="single" ns0:sz="4" ns0:color="D9D9D9"/>
+              <ns0:left ns0:val="single" ns0:sz="4" ns0:color="D9D9D9"/>
+              <ns0:bottom ns0:val="single" ns0:sz="4" ns0:color="D9D9D9"/>
+              <ns0:right ns0:val="single" ns0:sz="4" ns0:color="D9D9D9"/>
+            </ns0:tcBorders>
+            <ns0:tcMar>
+              <ns0:top ns0:w="85" ns0:type="dxa"/>
+              <ns0:left ns0:w="85" ns0:type="dxa"/>
+              <ns0:bottom ns0:w="85" ns0:type="dxa"/>
+              <ns0:right ns0:w="85" ns0:type="dxa"/>
+            </ns0:tcMar>
+          </ns0:tcPr>
+          <ns0:p>
+            <ns0:pPr>
+              <ns0:spacing ns0:after="60"/>
+            </ns0:pPr>
+            <ns0:r>
+              <ns0:rPr>
+                <ns0:b ns0:val="0"/>
+                <ns0:sz ns0:val="18"/>
+              </ns0:rPr>
+              <ns0:t>มี User ของบัญชีนั้นเพียงหนึ่งรายการ</ns0:t>
+            </ns0:r>
+          </ns0:p>
+        </ns0:tc>
+      </ns0:tr>
+      <ns0:tr>
+        <ns0:trPr>
+          <ns0:cantSplit/>
+        </ns0:trPr>
+        <ns0:tc>
+          <ns0:tcPr>
+            <ns0:tcW ns0:type="dxa" ns0:w="5018"/>
+            <ns0:tcBorders>
+              <ns0:top ns0:val="single" ns0:sz="4" ns0:color="D9D9D9"/>
+              <ns0:left ns0:val="single" ns0:sz="4" ns0:color="D9D9D9"/>
+              <ns0:bottom ns0:val="single" ns0:sz="4" ns0:color="D9D9D9"/>
+              <ns0:right ns0:val="single" ns0:sz="4" ns0:color="D9D9D9"/>
+            </ns0:tcBorders>
+            <ns0:tcMar>
+              <ns0:top ns0:w="85" ns0:type="dxa"/>
+              <ns0:left ns0:w="85" ns0:type="dxa"/>
+              <ns0:bottom ns0:w="85" ns0:type="dxa"/>
+              <ns0:right ns0:w="85" ns0:type="dxa"/>
+            </ns0:tcMar>
+          </ns0:tcPr>
+          <ns0:p>
+            <ns0:pPr>
+              <ns0:spacing ns0:after="60"/>
+            </ns0:pPr>
+            <ns0:r>
+              <ns0:rPr>
+                <ns0:b ns0:val="0"/>
+                <ns0:sz ns0:val="18"/>
+              </ns0:rPr>
+              <ns0:t>ชื่อจาก TU API เปลี่ยน</ns0:t>
+            </ns0:r>
+          </ns0:p>
+        </ns0:tc>
+        <ns0:tc>
+          <ns0:tcPr>
+            <ns0:tcW ns0:type="dxa" ns0:w="5018"/>
+            <ns0:tcBorders>
+              <ns0:top ns0:val="single" ns0:sz="4" ns0:color="D9D9D9"/>
+              <ns0:left ns0:val="single" ns0:sz="4" ns0:color="D9D9D9"/>
+              <ns0:bottom ns0:val="single" ns0:sz="4" ns0:color="D9D9D9"/>
+              <ns0:right ns0:val="single" ns0:sz="4" ns0:color="D9D9D9"/>
+            </ns0:tcBorders>
+            <ns0:tcMar>
+              <ns0:top ns0:w="85" ns0:type="dxa"/>
+              <ns0:left ns0:w="85" ns0:type="dxa"/>
+              <ns0:bottom ns0:w="85" ns0:type="dxa"/>
+              <ns0:right ns0:w="85" ns0:type="dxa"/>
+            </ns0:tcMar>
+          </ns0:tcPr>
+          <ns0:p>
+            <ns0:pPr>
+              <ns0:spacing ns0:after="60"/>
+            </ns0:pPr>
+            <ns0:r>
+              <ns0:rPr>
+                <ns0:b ns0:val="0"/>
+                <ns0:sz ns0:val="18"/>
+              </ns0:rPr>
+              <ns0:t>อัปเดตชื่อโดยไม่เปลี่ยน users.id</ns0:t>
+            </ns0:r>
+          </ns0:p>
+        </ns0:tc>
+      </ns0:tr>
+      <ns0:tr>
+        <ns0:trPr>
+          <ns0:cantSplit/>
+        </ns0:trPr>
+        <ns0:tc>
+          <ns0:tcPr>
+            <ns0:tcW ns0:type="dxa" ns0:w="5018"/>
+            <ns0:tcBorders>
+              <ns0:top ns0:val="single" ns0:sz="4" ns0:color="D9D9D9"/>
+              <ns0:left ns0:val="single" ns0:sz="4" ns0:color="D9D9D9"/>
+              <ns0:bottom ns0:val="single" ns0:sz="4" ns0:color="D9D9D9"/>
+              <ns0:right ns0:val="single" ns0:sz="4" ns0:color="D9D9D9"/>
+            </ns0:tcBorders>
+            <ns0:tcMar>
+              <ns0:top ns0:w="85" ns0:type="dxa"/>
+              <ns0:left ns0:w="85" ns0:type="dxa"/>
+              <ns0:bottom ns0:w="85" ns0:type="dxa"/>
+              <ns0:right ns0:w="85" ns0:type="dxa"/>
+            </ns0:tcMar>
+          </ns0:tcPr>
+          <ns0:p>
+            <ns0:pPr>
+              <ns0:spacing ns0:after="60"/>
+            </ns0:pPr>
+            <ns0:r>
+              <ns0:rPr>
+                <ns0:b ns0:val="0"/>
+                <ns0:sz ns0:val="18"/>
+              </ns0:rPr>
+              <ns0:t>UserDAO รับชื่อว่าง</ns0:t>
+            </ns0:r>
+          </ns0:p>
+        </ns0:tc>
+        <ns0:tc>
+          <ns0:tcPr>
+            <ns0:tcW ns0:type="dxa" ns0:w="5018"/>
+            <ns0:tcBorders>
+              <ns0:top ns0:val="single" ns0:sz="4" ns0:color="D9D9D9"/>
+              <ns0:left ns0:val="single" ns0:sz="4" ns0:color="D9D9D9"/>
+              <ns0:bottom ns0:val="single" ns0:sz="4" ns0:color="D9D9D9"/>
+              <ns0:right ns0:val="single" ns0:sz="4" ns0:color="D9D9D9"/>
+            </ns0:tcBorders>
+            <ns0:tcMar>
+              <ns0:top ns0:w="85" ns0:type="dxa"/>
+              <ns0:left ns0:w="85" ns0:type="dxa"/>
+              <ns0:bottom ns0:w="85" ns0:type="dxa"/>
+              <ns0:right ns0:w="85" ns0:type="dxa"/>
+            </ns0:tcMar>
+          </ns0:tcPr>
+          <ns0:p>
+            <ns0:pPr>
+              <ns0:spacing ns0:after="60"/>
+            </ns0:pPr>
+            <ns0:r>
+              <ns0:rPr>
+                <ns0:b ns0:val="0"/>
+                <ns0:sz ns0:val="18"/>
+              </ns0:rPr>
+              <ns0:t>เก็บชื่อเดิมไว้ ส่วน real Login ที่ไม่มีชื่อทั้งสองภาษาถูกปฏิเสธก่อนถึง DAO</ns0:t>
+            </ns0:r>
+          </ns0:p>
+        </ns0:tc>
+      </ns0:tr>
+      <ns0:tr>
+        <ns0:trPr>
+          <ns0:cantSplit/>
+        </ns0:trPr>
+        <ns0:tc>
+          <ns0:tcPr>
+            <ns0:tcW ns0:type="dxa" ns0:w="5018"/>
+            <ns0:tcBorders>
+              <ns0:top ns0:val="single" ns0:sz="4" ns0:color="D9D9D9"/>
+              <ns0:left ns0:val="single" ns0:sz="4" ns0:color="D9D9D9"/>
+              <ns0:bottom ns0:val="single" ns0:sz="4" ns0:color="D9D9D9"/>
+              <ns0:right ns0:val="single" ns0:sz="4" ns0:color="D9D9D9"/>
+            </ns0:tcBorders>
+            <ns0:tcMar>
+              <ns0:top ns0:w="85" ns0:type="dxa"/>
+              <ns0:left ns0:w="85" ns0:type="dxa"/>
+              <ns0:bottom ns0:w="85" ns0:type="dxa"/>
+              <ns0:right ns0:w="85" ns0:type="dxa"/>
+            </ns0:tcMar>
+          </ns0:tcPr>
+          <ns0:p>
+            <ns0:pPr>
+              <ns0:spacing ns0:after="60"/>
+            </ns0:pPr>
+            <ns0:r>
+              <ns0:rPr>
+                <ns0:b ns0:val="0"/>
+                <ns0:sz ns0:val="18"/>
+              </ns0:rPr>
+              <ns0:t>Login ไม่สำเร็จหรือไม่ผ่านกติกา</ns0:t>
+            </ns0:r>
+          </ns0:p>
+        </ns0:tc>
+        <ns0:tc>
+          <ns0:tcPr>
+            <ns0:tcW ns0:type="dxa" ns0:w="5018"/>
+            <ns0:tcBorders>
+              <ns0:top ns0:val="single" ns0:sz="4" ns0:color="D9D9D9"/>
+              <ns0:left ns0:val="single" ns0:sz="4" ns0:color="D9D9D9"/>
+              <ns0:bottom ns0:val="single" ns0:sz="4" ns0:color="D9D9D9"/>
+              <ns0:right ns0:val="single" ns0:sz="4" ns0:color="D9D9D9"/>
+            </ns0:tcBorders>
+            <ns0:tcMar>
+              <ns0:top ns0:w="85" ns0:type="dxa"/>
+              <ns0:left ns0:w="85" ns0:type="dxa"/>
+              <ns0:bottom ns0:w="85" ns0:type="dxa"/>
+              <ns0:right ns0:w="85" ns0:type="dxa"/>
+            </ns0:tcMar>
+          </ns0:tcPr>
+          <ns0:p>
+            <ns0:pPr>
+              <ns0:spacing ns0:after="60"/>
+            </ns0:pPr>
+            <ns0:r>
+              <ns0:rPr>
+                <ns0:b ns0:val="0"/>
+                <ns0:sz ns0:val="18"/>
+              </ns0:rPr>
+              <ns0:t>ไม่สร้างหรืออัปเดต User</ns0:t>
+            </ns0:r>
+          </ns0:p>
+        </ns0:tc>
+      </ns0:tr>
+      <ns0:tr>
+        <ns0:trPr>
+          <ns0:cantSplit/>
+        </ns0:trPr>
+        <ns0:tc>
+          <ns0:tcPr>
+            <ns0:tcW ns0:type="dxa" ns0:w="5018"/>
+            <ns0:tcBorders>
+              <ns0:top ns0:val="single" ns0:sz="4" ns0:color="D9D9D9"/>
+              <ns0:left ns0:val="single" ns0:sz="4" ns0:color="D9D9D9"/>
+              <ns0:bottom ns0:val="single" ns0:sz="4" ns0:color="D9D9D9"/>
+              <ns0:right ns0:val="single" ns0:sz="4" ns0:color="D9D9D9"/>
+            </ns0:tcBorders>
+            <ns0:tcMar>
+              <ns0:top ns0:w="85" ns0:type="dxa"/>
+              <ns0:left ns0:w="85" ns0:type="dxa"/>
+              <ns0:bottom ns0:w="85" ns0:type="dxa"/>
+              <ns0:right ns0:w="85" ns0:type="dxa"/>
+            </ns0:tcMar>
+          </ns0:tcPr>
+          <ns0:p>
+            <ns0:pPr>
+              <ns0:spacing ns0:after="60"/>
+            </ns0:pPr>
+            <ns0:r>
+              <ns0:rPr>
+                <ns0:b ns0:val="0"/>
+                <ns0:sz ns0:val="18"/>
+              </ns0:rPr>
+              <ns0:t>เผยแพร่แนวข้อสอบ</ns0:t>
+            </ns0:r>
+          </ns0:p>
+        </ns0:tc>
+        <ns0:tc>
+          <ns0:tcPr>
+            <ns0:tcW ns0:type="dxa" ns0:w="5018"/>
+            <ns0:tcBorders>
+              <ns0:top ns0:val="single" ns0:sz="4" ns0:color="D9D9D9"/>
+              <ns0:left ns0:val="single" ns0:sz="4" ns0:color="D9D9D9"/>
+              <ns0:bottom ns0:val="single" ns0:sz="4" ns0:color="D9D9D9"/>
+              <ns0:right ns0:val="single" ns0:sz="4" ns0:color="D9D9D9"/>
+            </ns0:tcBorders>
+            <ns0:tcMar>
+              <ns0:top ns0:w="85" ns0:type="dxa"/>
+              <ns0:left ns0:w="85" ns0:type="dxa"/>
+              <ns0:bottom ns0:w="85" ns0:type="dxa"/>
+              <ns0:right ns0:w="85" ns0:type="dxa"/>
+            </ns0:tcMar>
+          </ns0:tcPr>
+          <ns0:p>
+            <ns0:pPr>
+              <ns0:spacing ns0:after="60"/>
+            </ns0:pPr>
+            <ns0:r>
+              <ns0:rPr>
+                <ns0:b ns0:val="0"/>
+                <ns0:sz ns0:val="18"/>
+              </ns0:rPr>
+              <ns0:t>ใช้ users.id ของผู้เข้าสู่ระบบเป็น publisher_id</ns0:t>
+            </ns0:r>
+          </ns0:p>
+        </ns0:tc>
+      </ns0:tr>
+    </ns0:tbl>
+    <ns0:p/>
+    <ns0:p>
+      <ns0:pPr>
+        <ns0:pStyle ns0:val="Heading1"/>
+      </ns0:pPr>
+      <ns0:r>
+        <ns0:t>8. ความสัมพันธ์ที่เพิ่มและเส้นทาง Login</ns0:t>
+      </ns0:r>
+    </ns0:p>
+    <ns0:p>
+      <ns0:r>
+        <ns0:t>ER ข้างต้นแสดงเฉพาะความสัมพันธ์ของผู้เผยแพร่ หากอธิบายฐานข้อมูลทั้งระบบปัจจุบันต้องรวม saved_guides ซึ่งมี user_id อ้าง User และ guide_id อ้าง Guide ด้วย ดู ER ภาพรวม และ Sequence Login</ns0:t>
+      </ns0:r>
+    </ns0:p>
+    <ns0:p>
+      <ns0:r>
+        <ns0:t>แหล่งโค้ด: User Entity, UserDAO, AuthService และ ชื่อผู้เผยแพร่</ns0:t>
+      </ns0:r>
+    </ns0:p>
+    <ns0:sectPr ns0:rsidR="00FC693F" ns0:rsidRPr="0006063C" ns0:rsidSect="00034616">
+      <ns0:pgSz ns0:w="11909" ns0:h="16834"/>
+      <ns0:pgMar ns0:top="936" ns0:right="936" ns0:bottom="936" ns0:left="936" ns0:header="720" ns0:footer="720" ns0:gutter="0"/>
+      <ns0:cols ns0:space="720"/>
+      <ns0:docGrid ns0:linePitch="360"/>
+    </ns0:sectPr>
+  </ns0:body>
+</ns0:document>
 </file>
 
 <file path=word/numbering.xml><?xml version="1.0" encoding="utf-8"?>

</xml_diff>